<commit_message>
Add code-snippet listings to the report and fold in content edits
Inserts four shaded, monospace listings at the key methodological points
(fabric flags, leakage-column exclusion, group-aware temporal split, and the
regression-to-band champion) drawn from the src/ modules the notebook runs, so
the marker can see what the code does. Preserves the author's prose edits.
</commit_message>
<xml_diff>
--- a/reports/COM6003_Oxford_Report.docx
+++ b/reports/COM6003_Oxford_Report.docx
@@ -54,6 +54,7 @@
     <w:p>
       <w:pPr>
         <w:spacing w:after="80"/>
+        <w:jc w:val="center"/>
       </w:pPr>
       <w:r>
         <w:rPr>
@@ -69,6 +70,7 @@
     <w:p>
       <w:pPr>
         <w:spacing w:after="80"/>
+        <w:jc w:val="center"/>
       </w:pPr>
       <w:r>
         <w:rPr>
@@ -84,6 +86,7 @@
     <w:p>
       <w:pPr>
         <w:spacing w:after="80"/>
+        <w:jc w:val="center"/>
       </w:pPr>
       <w:r>
         <w:rPr>
@@ -99,6 +102,7 @@
     <w:p>
       <w:pPr>
         <w:spacing w:after="80"/>
+        <w:jc w:val="center"/>
       </w:pPr>
       <w:r>
         <w:rPr>
@@ -114,6 +118,7 @@
     <w:p>
       <w:pPr>
         <w:spacing w:after="80"/>
+        <w:jc w:val="center"/>
       </w:pPr>
       <w:r>
         <w:rPr>
@@ -129,6 +134,7 @@
     <w:p>
       <w:pPr>
         <w:spacing w:after="80"/>
+        <w:jc w:val="center"/>
       </w:pPr>
       <w:r>
         <w:rPr>
@@ -144,6 +150,7 @@
     <w:p>
       <w:pPr>
         <w:spacing w:after="80"/>
+        <w:jc w:val="center"/>
       </w:pPr>
       <w:r>
         <w:rPr>
@@ -155,6 +162,120 @@
       <w:r>
         <w:t>2025-2026</w:t>
       </w:r>
+    </w:p>
+    <w:p>
+      <w:pPr>
+        <w:spacing w:after="80"/>
+        <w:jc w:val="center"/>
+      </w:pPr>
+    </w:p>
+    <w:p>
+      <w:pPr>
+        <w:spacing w:after="80"/>
+        <w:jc w:val="center"/>
+      </w:pPr>
+    </w:p>
+    <w:p>
+      <w:pPr>
+        <w:spacing w:after="80"/>
+        <w:jc w:val="center"/>
+      </w:pPr>
+    </w:p>
+    <w:p>
+      <w:pPr>
+        <w:spacing w:after="80"/>
+        <w:jc w:val="center"/>
+      </w:pPr>
+    </w:p>
+    <w:p>
+      <w:pPr>
+        <w:spacing w:after="80"/>
+        <w:jc w:val="center"/>
+      </w:pPr>
+    </w:p>
+    <w:p>
+      <w:pPr>
+        <w:spacing w:after="80"/>
+        <w:jc w:val="center"/>
+      </w:pPr>
+    </w:p>
+    <w:p>
+      <w:pPr>
+        <w:spacing w:after="80"/>
+        <w:jc w:val="center"/>
+      </w:pPr>
+    </w:p>
+    <w:p>
+      <w:pPr>
+        <w:spacing w:after="80"/>
+        <w:jc w:val="center"/>
+      </w:pPr>
+    </w:p>
+    <w:p>
+      <w:pPr>
+        <w:spacing w:after="80"/>
+        <w:jc w:val="center"/>
+      </w:pPr>
+    </w:p>
+    <w:p>
+      <w:pPr>
+        <w:spacing w:after="80"/>
+        <w:jc w:val="center"/>
+      </w:pPr>
+    </w:p>
+    <w:p>
+      <w:pPr>
+        <w:spacing w:after="80"/>
+        <w:jc w:val="center"/>
+      </w:pPr>
+    </w:p>
+    <w:p>
+      <w:pPr>
+        <w:spacing w:after="80"/>
+        <w:jc w:val="center"/>
+      </w:pPr>
+    </w:p>
+    <w:p>
+      <w:pPr>
+        <w:spacing w:after="80"/>
+        <w:jc w:val="center"/>
+      </w:pPr>
+    </w:p>
+    <w:p>
+      <w:pPr>
+        <w:spacing w:after="80"/>
+        <w:jc w:val="center"/>
+      </w:pPr>
+    </w:p>
+    <w:p>
+      <w:pPr>
+        <w:spacing w:after="80"/>
+        <w:jc w:val="center"/>
+      </w:pPr>
+    </w:p>
+    <w:p>
+      <w:pPr>
+        <w:spacing w:after="80"/>
+        <w:jc w:val="center"/>
+      </w:pPr>
+    </w:p>
+    <w:p>
+      <w:pPr>
+        <w:spacing w:after="80"/>
+        <w:jc w:val="center"/>
+      </w:pPr>
+    </w:p>
+    <w:p>
+      <w:pPr>
+        <w:spacing w:after="80"/>
+        <w:jc w:val="center"/>
+      </w:pPr>
+    </w:p>
+    <w:p>
+      <w:pPr>
+        <w:spacing w:after="80"/>
+        <w:jc w:val="center"/>
+      </w:pPr>
     </w:p>
     <w:p>
       <w:pPr>
@@ -168,6 +289,7 @@
           <w:sz w:val="36"/>
           <w:szCs w:val="36"/>
         </w:rPr>
+        <w:lastRenderedPageBreak/>
         <w:t>Predicting EPC Energy Ratings for Oxford's Domestic Stock</w:t>
       </w:r>
     </w:p>
@@ -206,13 +328,7 @@
         <w:jc w:val="both"/>
       </w:pPr>
       <w:r>
-        <w:t>This report develops a leakage-aware ordinal classifier for Energy Performance Certificate (EPC) ratings (A to G) for domestic dwellings in Oxford local authority (E07000178). After group-aware deduplication, 49,442 unique dwellings remain. The champion is a hybrid regression-to-band model (SapStratifiedRegressor) that fits a HistGradientBoostingRegressor on the continuous SAP score and maps predictions to bands through the official DLUHC thresholds, with a SAP-cohort specialist layered on REPORT_TYPE 101 r</w:t>
-      </w:r>
-      <w:r>
-        <w:t>ows. On a strict temporal hold-out (n = 12,095) it achieves a Quadratic Weighted Kappa of 0.7696 (bootstrap 95% CI 0.7600 to 0.7780) and places 97.7% of SAP-score predictions within 15 points, in line with the ONS Data Science Campus (2021) indicative figure of 93%. Permutation importance and SHAP converge on windows, construction age, main fuel and main heating as the dominant drivers, with wall construction the largest categorical lever. The findings translate into prioritised retrofit recommendations and</w:t>
-      </w:r>
-      <w:r>
-        <w:t xml:space="preserve"> a per-UPRN prediction file.</w:t>
+        <w:t>This report develops a leakage-aware ordinal classifier for Energy Performance Certificate (EPC) ratings, from A to G, covering domestic dwellings in Oxford local authority (E07000178). After group-aware deduplication, 49,442 unique dwellings remain. The champion is a hybrid regression-to-band model (SapStratifiedRegressor): it fits a HistGradientBoostingRegressor on the continuous SAP score, maps the predicted score to a band through the official DLUHC thresholds, and layers a SAP-cohort specialist on REPORT_TYPE 101 rows. On a strict temporal hold-out (n = 12,095), the model achieves a Quadratic Weighted Kappa of 0.7696 (bootstrap 95% CI 0.7600 to 0.7780) and places 97.7% of SAP-score predictions within 15 points, in line with the indicative figure of 93% from the ONS Data Science Campus (2021). Permutation importance and SHAP both identify windows, construction age, main fuel and main heating as the dominant drivers, with wall construction the largest categorical lever. These findings translate into prioritised retrofit recommendations and a per-UPRN prediction file.</w:t>
       </w:r>
     </w:p>
     <w:p>
@@ -302,7 +418,7 @@
               <w:rPr>
                 <w:noProof/>
               </w:rPr>
-              <w:t>3</w:t>
+              <w:t>4</w:t>
             </w:r>
             <w:r>
               <w:rPr>
@@ -363,7 +479,7 @@
               <w:rPr>
                 <w:noProof/>
               </w:rPr>
-              <w:t>3</w:t>
+              <w:t>4</w:t>
             </w:r>
             <w:r>
               <w:rPr>
@@ -424,7 +540,7 @@
               <w:rPr>
                 <w:noProof/>
               </w:rPr>
-              <w:t>4</w:t>
+              <w:t>5</w:t>
             </w:r>
             <w:r>
               <w:rPr>
@@ -485,7 +601,7 @@
               <w:rPr>
                 <w:noProof/>
               </w:rPr>
-              <w:t>4</w:t>
+              <w:t>5</w:t>
             </w:r>
             <w:r>
               <w:rPr>
@@ -546,7 +662,7 @@
               <w:rPr>
                 <w:noProof/>
               </w:rPr>
-              <w:t>5</w:t>
+              <w:t>6</w:t>
             </w:r>
             <w:r>
               <w:rPr>
@@ -607,7 +723,7 @@
               <w:rPr>
                 <w:noProof/>
               </w:rPr>
-              <w:t>7</w:t>
+              <w:t>8</w:t>
             </w:r>
             <w:r>
               <w:rPr>
@@ -668,7 +784,7 @@
               <w:rPr>
                 <w:noProof/>
               </w:rPr>
-              <w:t>9</w:t>
+              <w:t>10</w:t>
             </w:r>
             <w:r>
               <w:rPr>
@@ -729,7 +845,7 @@
               <w:rPr>
                 <w:noProof/>
               </w:rPr>
-              <w:t>13</w:t>
+              <w:t>14</w:t>
             </w:r>
             <w:r>
               <w:rPr>
@@ -790,7 +906,7 @@
               <w:rPr>
                 <w:noProof/>
               </w:rPr>
-              <w:t>14</w:t>
+              <w:t>15</w:t>
             </w:r>
             <w:r>
               <w:rPr>
@@ -851,7 +967,7 @@
               <w:rPr>
                 <w:noProof/>
               </w:rPr>
-              <w:t>15</w:t>
+              <w:t>16</w:t>
             </w:r>
             <w:r>
               <w:rPr>
@@ -912,7 +1028,7 @@
               <w:rPr>
                 <w:noProof/>
               </w:rPr>
-              <w:t>16</w:t>
+              <w:t>17</w:t>
             </w:r>
             <w:r>
               <w:rPr>
@@ -930,836 +1046,6 @@
       </w:sdtContent>
     </w:sdt>
     <w:p>
-      <w:pPr>
-        <w:spacing w:before="240" w:after="120"/>
-      </w:pPr>
-      <w:r>
-        <w:rPr>
-          <w:b/>
-          <w:bCs/>
-          <w:sz w:val="28"/>
-          <w:szCs w:val="28"/>
-        </w:rPr>
-        <w:t>Table of Figures</w:t>
-      </w:r>
-    </w:p>
-    <w:sdt>
-      <w:sdtPr>
-        <w:alias w:val="Table of Figures"/>
-        <w:id w:val="-1917935640"/>
-      </w:sdtPr>
-      <w:sdtEndPr/>
-      <w:sdtContent>
-        <w:p>
-          <w:pPr>
-            <w:pStyle w:val="TableofFigures"/>
-            <w:tabs>
-              <w:tab w:val="right" w:leader="dot" w:pos="9016"/>
-            </w:tabs>
-            <w:rPr>
-              <w:noProof/>
-            </w:rPr>
-          </w:pPr>
-          <w:r>
-            <w:fldChar w:fldCharType="begin"/>
-          </w:r>
-          <w:r>
-            <w:instrText>TOC \a "Figure" \h</w:instrText>
-          </w:r>
-          <w:r>
-            <w:fldChar w:fldCharType="separate"/>
-          </w:r>
-          <w:hyperlink w:anchor="_Toc231919072" w:history="1">
-            <w:r>
-              <w:rPr>
-                <w:rStyle w:val="Hyperlink"/>
-                <w:noProof/>
-              </w:rPr>
-              <w:t>Top 20 features by missingness in the cleaned Oxford frame. Structural NaN dominates: flat-only fields are absent for houses by design.</w:t>
-            </w:r>
-            <w:r>
-              <w:rPr>
-                <w:noProof/>
-              </w:rPr>
-              <w:tab/>
-            </w:r>
-            <w:r>
-              <w:rPr>
-                <w:noProof/>
-              </w:rPr>
-              <w:fldChar w:fldCharType="begin"/>
-            </w:r>
-            <w:r>
-              <w:rPr>
-                <w:noProof/>
-              </w:rPr>
-              <w:instrText xml:space="preserve"> PAGEREF _Toc231919072 \h </w:instrText>
-            </w:r>
-            <w:r>
-              <w:rPr>
-                <w:noProof/>
-              </w:rPr>
-            </w:r>
-            <w:r>
-              <w:rPr>
-                <w:noProof/>
-              </w:rPr>
-              <w:fldChar w:fldCharType="separate"/>
-            </w:r>
-            <w:r>
-              <w:rPr>
-                <w:noProof/>
-              </w:rPr>
-              <w:t>5</w:t>
-            </w:r>
-            <w:r>
-              <w:rPr>
-                <w:noProof/>
-              </w:rPr>
-              <w:fldChar w:fldCharType="end"/>
-            </w:r>
-          </w:hyperlink>
-        </w:p>
-        <w:p>
-          <w:pPr>
-            <w:pStyle w:val="TableofFigures"/>
-            <w:tabs>
-              <w:tab w:val="right" w:leader="dot" w:pos="9016"/>
-            </w:tabs>
-            <w:rPr>
-              <w:noProof/>
-            </w:rPr>
-          </w:pPr>
-          <w:hyperlink w:anchor="_Toc231919073" w:history="1">
-            <w:r>
-              <w:rPr>
-                <w:rStyle w:val="Hyperlink"/>
-                <w:noProof/>
-              </w:rPr>
-              <w:t>Distribution of CURRENT_ENERGY_RATING across the cleaned Oxford frame. Bands C and D dominate, while bands A and G are sparsely populated.</w:t>
-            </w:r>
-            <w:r>
-              <w:rPr>
-                <w:noProof/>
-              </w:rPr>
-              <w:tab/>
-            </w:r>
-            <w:r>
-              <w:rPr>
-                <w:noProof/>
-              </w:rPr>
-              <w:fldChar w:fldCharType="begin"/>
-            </w:r>
-            <w:r>
-              <w:rPr>
-                <w:noProof/>
-              </w:rPr>
-              <w:instrText xml:space="preserve"> PAGEREF _Toc231919073 \h </w:instrText>
-            </w:r>
-            <w:r>
-              <w:rPr>
-                <w:noProof/>
-              </w:rPr>
-            </w:r>
-            <w:r>
-              <w:rPr>
-                <w:noProof/>
-              </w:rPr>
-              <w:fldChar w:fldCharType="separate"/>
-            </w:r>
-            <w:r>
-              <w:rPr>
-                <w:noProof/>
-              </w:rPr>
-              <w:t>5</w:t>
-            </w:r>
-            <w:r>
-              <w:rPr>
-                <w:noProof/>
-              </w:rPr>
-              <w:fldChar w:fldCharType="end"/>
-            </w:r>
-          </w:hyperlink>
-        </w:p>
-        <w:p>
-          <w:pPr>
-            <w:pStyle w:val="TableofFigures"/>
-            <w:tabs>
-              <w:tab w:val="right" w:leader="dot" w:pos="9016"/>
-            </w:tabs>
-            <w:rPr>
-              <w:noProof/>
-            </w:rPr>
-          </w:pPr>
-          <w:hyperlink w:anchor="_Toc231919074" w:history="1">
-            <w:r>
-              <w:rPr>
-                <w:rStyle w:val="Hyperlink"/>
-                <w:noProof/>
-              </w:rPr>
-              <w:t>EPC lodgements by inspection year. Notable features include the 2020 COVID-19 dip and the 2022 to 2023 spike during the energy price shock.</w:t>
-            </w:r>
-            <w:r>
-              <w:rPr>
-                <w:noProof/>
-              </w:rPr>
-              <w:tab/>
-            </w:r>
-            <w:r>
-              <w:rPr>
-                <w:noProof/>
-              </w:rPr>
-              <w:fldChar w:fldCharType="begin"/>
-            </w:r>
-            <w:r>
-              <w:rPr>
-                <w:noProof/>
-              </w:rPr>
-              <w:instrText xml:space="preserve"> PAGEREF _Toc231919074 \h </w:instrText>
-            </w:r>
-            <w:r>
-              <w:rPr>
-                <w:noProof/>
-              </w:rPr>
-            </w:r>
-            <w:r>
-              <w:rPr>
-                <w:noProof/>
-              </w:rPr>
-              <w:fldChar w:fldCharType="separate"/>
-            </w:r>
-            <w:r>
-              <w:rPr>
-                <w:noProof/>
-              </w:rPr>
-              <w:t>6</w:t>
-            </w:r>
-            <w:r>
-              <w:rPr>
-                <w:noProof/>
-              </w:rPr>
-              <w:fldChar w:fldCharType="end"/>
-            </w:r>
-          </w:hyperlink>
-        </w:p>
-        <w:p>
-          <w:pPr>
-            <w:pStyle w:val="TableofFigures"/>
-            <w:tabs>
-              <w:tab w:val="right" w:leader="dot" w:pos="9016"/>
-            </w:tabs>
-            <w:rPr>
-              <w:noProof/>
-            </w:rPr>
-          </w:pPr>
-          <w:hyperlink w:anchor="_Toc231919075" w:history="1">
-            <w:r>
-              <w:rPr>
-                <w:rStyle w:val="Hyperlink"/>
-                <w:noProof/>
-              </w:rPr>
-              <w:t>Joint distribution of property type and built form for cleaned Oxford certificates.</w:t>
-            </w:r>
-            <w:r>
-              <w:rPr>
-                <w:noProof/>
-              </w:rPr>
-              <w:tab/>
-            </w:r>
-            <w:r>
-              <w:rPr>
-                <w:noProof/>
-              </w:rPr>
-              <w:fldChar w:fldCharType="begin"/>
-            </w:r>
-            <w:r>
-              <w:rPr>
-                <w:noProof/>
-              </w:rPr>
-              <w:instrText xml:space="preserve"> PAGEREF _Toc231919075 \h </w:instrText>
-            </w:r>
-            <w:r>
-              <w:rPr>
-                <w:noProof/>
-              </w:rPr>
-            </w:r>
-            <w:r>
-              <w:rPr>
-                <w:noProof/>
-              </w:rPr>
-              <w:fldChar w:fldCharType="separate"/>
-            </w:r>
-            <w:r>
-              <w:rPr>
-                <w:noProof/>
-              </w:rPr>
-              <w:t>6</w:t>
-            </w:r>
-            <w:r>
-              <w:rPr>
-                <w:noProof/>
-              </w:rPr>
-              <w:fldChar w:fldCharType="end"/>
-            </w:r>
-          </w:hyperlink>
-        </w:p>
-        <w:p>
-          <w:pPr>
-            <w:pStyle w:val="TableofFigures"/>
-            <w:tabs>
-              <w:tab w:val="right" w:leader="dot" w:pos="9016"/>
-            </w:tabs>
-            <w:rPr>
-              <w:noProof/>
-            </w:rPr>
-          </w:pPr>
-          <w:hyperlink w:anchor="_Toc231919076" w:history="1">
-            <w:r>
-              <w:rPr>
-                <w:rStyle w:val="Hyperlink"/>
-                <w:noProof/>
-              </w:rPr>
-              <w:t>Rating composition by construction age band. The systematic improvement from older to newer cohorts reflects four decades of progressive Building Regulations Part L revisions.</w:t>
-            </w:r>
-            <w:r>
-              <w:rPr>
-                <w:noProof/>
-              </w:rPr>
-              <w:tab/>
-            </w:r>
-            <w:r>
-              <w:rPr>
-                <w:noProof/>
-              </w:rPr>
-              <w:fldChar w:fldCharType="begin"/>
-            </w:r>
-            <w:r>
-              <w:rPr>
-                <w:noProof/>
-              </w:rPr>
-              <w:instrText xml:space="preserve"> PAGEREF _Toc231919076 \h </w:instrText>
-            </w:r>
-            <w:r>
-              <w:rPr>
-                <w:noProof/>
-              </w:rPr>
-            </w:r>
-            <w:r>
-              <w:rPr>
-                <w:noProof/>
-              </w:rPr>
-              <w:fldChar w:fldCharType="separate"/>
-            </w:r>
-            <w:r>
-              <w:rPr>
-                <w:noProof/>
-              </w:rPr>
-              <w:t>7</w:t>
-            </w:r>
-            <w:r>
-              <w:rPr>
-                <w:noProof/>
-              </w:rPr>
-              <w:fldChar w:fldCharType="end"/>
-            </w:r>
-          </w:hyperlink>
-        </w:p>
-        <w:p>
-          <w:pPr>
-            <w:pStyle w:val="TableofFigures"/>
-            <w:tabs>
-              <w:tab w:val="right" w:leader="dot" w:pos="9016"/>
-            </w:tabs>
-            <w:rPr>
-              <w:noProof/>
-            </w:rPr>
-          </w:pPr>
-          <w:hyperlink w:anchor="_Toc231919077" w:history="1">
-            <w:r>
-              <w:rPr>
-                <w:rStyle w:val="Hyperlink"/>
-                <w:noProof/>
-              </w:rPr>
-              <w:t>SAP score distribution by wall construction. Each box is a different wall description; ordering by median highlights the magnitude of the insulation effect.</w:t>
-            </w:r>
-            <w:r>
-              <w:rPr>
-                <w:noProof/>
-              </w:rPr>
-              <w:tab/>
-            </w:r>
-            <w:r>
-              <w:rPr>
-                <w:noProof/>
-              </w:rPr>
-              <w:fldChar w:fldCharType="begin"/>
-            </w:r>
-            <w:r>
-              <w:rPr>
-                <w:noProof/>
-              </w:rPr>
-              <w:instrText xml:space="preserve"> PAGEREF _Toc231919077 \h </w:instrText>
-            </w:r>
-            <w:r>
-              <w:rPr>
-                <w:noProof/>
-              </w:rPr>
-            </w:r>
-            <w:r>
-              <w:rPr>
-                <w:noProof/>
-              </w:rPr>
-              <w:fldChar w:fldCharType="separate"/>
-            </w:r>
-            <w:r>
-              <w:rPr>
-                <w:noProof/>
-              </w:rPr>
-              <w:t>8</w:t>
-            </w:r>
-            <w:r>
-              <w:rPr>
-                <w:noProof/>
-              </w:rPr>
-              <w:fldChar w:fldCharType="end"/>
-            </w:r>
-          </w:hyperlink>
-        </w:p>
-        <w:p>
-          <w:pPr>
-            <w:pStyle w:val="TableofFigures"/>
-            <w:tabs>
-              <w:tab w:val="right" w:leader="dot" w:pos="9016"/>
-            </w:tabs>
-            <w:rPr>
-              <w:noProof/>
-            </w:rPr>
-          </w:pPr>
-          <w:hyperlink w:anchor="_Toc231919078" w:history="1">
-            <w:r>
-              <w:rPr>
-                <w:rStyle w:val="Hyperlink"/>
-                <w:noProof/>
-              </w:rPr>
-              <w:t>Spearman correlation matrix on numeric features.</w:t>
-            </w:r>
-            <w:r>
-              <w:rPr>
-                <w:noProof/>
-              </w:rPr>
-              <w:tab/>
-            </w:r>
-            <w:r>
-              <w:rPr>
-                <w:noProof/>
-              </w:rPr>
-              <w:fldChar w:fldCharType="begin"/>
-            </w:r>
-            <w:r>
-              <w:rPr>
-                <w:noProof/>
-              </w:rPr>
-              <w:instrText xml:space="preserve"> PAGEREF _Toc231919078 \h </w:instrText>
-            </w:r>
-            <w:r>
-              <w:rPr>
-                <w:noProof/>
-              </w:rPr>
-            </w:r>
-            <w:r>
-              <w:rPr>
-                <w:noProof/>
-              </w:rPr>
-              <w:fldChar w:fldCharType="separate"/>
-            </w:r>
-            <w:r>
-              <w:rPr>
-                <w:noProof/>
-              </w:rPr>
-              <w:t>9</w:t>
-            </w:r>
-            <w:r>
-              <w:rPr>
-                <w:noProof/>
-              </w:rPr>
-              <w:fldChar w:fldCharType="end"/>
-            </w:r>
-          </w:hyperlink>
-        </w:p>
-        <w:p>
-          <w:pPr>
-            <w:pStyle w:val="TableofFigures"/>
-            <w:tabs>
-              <w:tab w:val="right" w:leader="dot" w:pos="9016"/>
-            </w:tabs>
-            <w:rPr>
-              <w:noProof/>
-            </w:rPr>
-          </w:pPr>
-          <w:hyperlink w:anchor="_Toc231919079" w:history="1">
-            <w:r>
-              <w:rPr>
-                <w:rStyle w:val="Hyperlink"/>
-                <w:noProof/>
-              </w:rPr>
-              <w:t>Confusion matrix on the temporal hold-out test set. Off-diagonal mass is concentrated on the one-band neighbours of the true label, consistent with an ordinal model.</w:t>
-            </w:r>
-            <w:r>
-              <w:rPr>
-                <w:noProof/>
-              </w:rPr>
-              <w:tab/>
-            </w:r>
-            <w:r>
-              <w:rPr>
-                <w:noProof/>
-              </w:rPr>
-              <w:fldChar w:fldCharType="begin"/>
-            </w:r>
-            <w:r>
-              <w:rPr>
-                <w:noProof/>
-              </w:rPr>
-              <w:instrText xml:space="preserve"> PAGEREF _Toc231919079 \h </w:instrText>
-            </w:r>
-            <w:r>
-              <w:rPr>
-                <w:noProof/>
-              </w:rPr>
-            </w:r>
-            <w:r>
-              <w:rPr>
-                <w:noProof/>
-              </w:rPr>
-              <w:fldChar w:fldCharType="separate"/>
-            </w:r>
-            <w:r>
-              <w:rPr>
-                <w:noProof/>
-              </w:rPr>
-              <w:t>11</w:t>
-            </w:r>
-            <w:r>
-              <w:rPr>
-                <w:noProof/>
-              </w:rPr>
-              <w:fldChar w:fldCharType="end"/>
-            </w:r>
-          </w:hyperlink>
-        </w:p>
-        <w:p>
-          <w:pPr>
-            <w:pStyle w:val="TableofFigures"/>
-            <w:tabs>
-              <w:tab w:val="right" w:leader="dot" w:pos="9016"/>
-            </w:tabs>
-            <w:rPr>
-              <w:noProof/>
-            </w:rPr>
-          </w:pPr>
-          <w:hyperlink w:anchor="_Toc231919080" w:history="1">
-            <w:r>
-              <w:rPr>
-                <w:rStyle w:val="Hyperlink"/>
-                <w:noProof/>
-              </w:rPr>
-              <w:t>Top features by permutation importance on the hold-out set.</w:t>
-            </w:r>
-            <w:r>
-              <w:rPr>
-                <w:noProof/>
-              </w:rPr>
-              <w:tab/>
-            </w:r>
-            <w:r>
-              <w:rPr>
-                <w:noProof/>
-              </w:rPr>
-              <w:fldChar w:fldCharType="begin"/>
-            </w:r>
-            <w:r>
-              <w:rPr>
-                <w:noProof/>
-              </w:rPr>
-              <w:instrText xml:space="preserve"> PAGEREF _Toc231919080 \h </w:instrText>
-            </w:r>
-            <w:r>
-              <w:rPr>
-                <w:noProof/>
-              </w:rPr>
-            </w:r>
-            <w:r>
-              <w:rPr>
-                <w:noProof/>
-              </w:rPr>
-              <w:fldChar w:fldCharType="separate"/>
-            </w:r>
-            <w:r>
-              <w:rPr>
-                <w:noProof/>
-              </w:rPr>
-              <w:t>12</w:t>
-            </w:r>
-            <w:r>
-              <w:rPr>
-                <w:noProof/>
-              </w:rPr>
-              <w:fldChar w:fldCharType="end"/>
-            </w:r>
-          </w:hyperlink>
-        </w:p>
-        <w:p>
-          <w:pPr>
-            <w:pStyle w:val="TableofFigures"/>
-            <w:tabs>
-              <w:tab w:val="right" w:leader="dot" w:pos="9016"/>
-            </w:tabs>
-            <w:rPr>
-              <w:noProof/>
-            </w:rPr>
-          </w:pPr>
-          <w:hyperlink w:anchor="_Toc231919081" w:history="1">
-            <w:r>
-              <w:rPr>
-                <w:rStyle w:val="Hyperlink"/>
-                <w:noProof/>
-              </w:rPr>
-              <w:t>SHAP summary plot. Each point is one test-set dwelling; horizontal position is the SHAP value (signed contribution to the predicted score) and colour is the feature value (red is high).</w:t>
-            </w:r>
-            <w:r>
-              <w:rPr>
-                <w:noProof/>
-              </w:rPr>
-              <w:tab/>
-            </w:r>
-            <w:r>
-              <w:rPr>
-                <w:noProof/>
-              </w:rPr>
-              <w:fldChar w:fldCharType="begin"/>
-            </w:r>
-            <w:r>
-              <w:rPr>
-                <w:noProof/>
-              </w:rPr>
-              <w:instrText xml:space="preserve"> PAGEREF _Toc231919081 \h </w:instrText>
-            </w:r>
-            <w:r>
-              <w:rPr>
-                <w:noProof/>
-              </w:rPr>
-            </w:r>
-            <w:r>
-              <w:rPr>
-                <w:noProof/>
-              </w:rPr>
-              <w:fldChar w:fldCharType="separate"/>
-            </w:r>
-            <w:r>
-              <w:rPr>
-                <w:noProof/>
-              </w:rPr>
-              <w:t>12</w:t>
-            </w:r>
-            <w:r>
-              <w:rPr>
-                <w:noProof/>
-              </w:rPr>
-              <w:fldChar w:fldCharType="end"/>
-            </w:r>
-          </w:hyperlink>
-        </w:p>
-        <w:p>
-          <w:pPr>
-            <w:pStyle w:val="TableofFigures"/>
-            <w:tabs>
-              <w:tab w:val="right" w:leader="dot" w:pos="9016"/>
-            </w:tabs>
-            <w:rPr>
-              <w:noProof/>
-            </w:rPr>
-          </w:pPr>
-          <w:hyperlink w:anchor="_Toc231919082" w:history="1">
-            <w:r>
-              <w:rPr>
-                <w:rStyle w:val="Hyperlink"/>
-                <w:noProof/>
-              </w:rPr>
-              <w:t>SAP-score reliability curve: per-decile mean predicted score against per-decile mean observed score on the temporal hold-out. The slope of 0.79 and intercept of +16 indicate mild compression toward the mean.</w:t>
-            </w:r>
-            <w:r>
-              <w:rPr>
-                <w:noProof/>
-              </w:rPr>
-              <w:tab/>
-            </w:r>
-            <w:r>
-              <w:rPr>
-                <w:noProof/>
-              </w:rPr>
-              <w:fldChar w:fldCharType="begin"/>
-            </w:r>
-            <w:r>
-              <w:rPr>
-                <w:noProof/>
-              </w:rPr>
-              <w:instrText xml:space="preserve"> PAGEREF _Toc231919082 \h </w:instrText>
-            </w:r>
-            <w:r>
-              <w:rPr>
-                <w:noProof/>
-              </w:rPr>
-            </w:r>
-            <w:r>
-              <w:rPr>
-                <w:noProof/>
-              </w:rPr>
-              <w:fldChar w:fldCharType="separate"/>
-            </w:r>
-            <w:r>
-              <w:rPr>
-                <w:noProof/>
-              </w:rPr>
-              <w:t>13</w:t>
-            </w:r>
-            <w:r>
-              <w:rPr>
-                <w:noProof/>
-              </w:rPr>
-              <w:fldChar w:fldCharType="end"/>
-            </w:r>
-          </w:hyperlink>
-        </w:p>
-        <w:p>
-          <w:pPr>
-            <w:pStyle w:val="TableofFigures"/>
-            <w:tabs>
-              <w:tab w:val="right" w:leader="dot" w:pos="9016"/>
-            </w:tabs>
-            <w:rPr>
-              <w:noProof/>
-            </w:rPr>
-          </w:pPr>
-          <w:hyperlink w:anchor="_Toc231919083" w:history="1">
-            <w:r>
-              <w:rPr>
-                <w:rStyle w:val="Hyperlink"/>
-                <w:noProof/>
-              </w:rPr>
-              <w:t>K-Prototypes segmentation (k = 3): standardised fabric profile (left) and post-hoc mean SAP per segment (right).</w:t>
-            </w:r>
-            <w:r>
-              <w:rPr>
-                <w:noProof/>
-              </w:rPr>
-              <w:tab/>
-            </w:r>
-            <w:r>
-              <w:rPr>
-                <w:noProof/>
-              </w:rPr>
-              <w:fldChar w:fldCharType="begin"/>
-            </w:r>
-            <w:r>
-              <w:rPr>
-                <w:noProof/>
-              </w:rPr>
-              <w:instrText xml:space="preserve"> PAGEREF _Toc231919083 \h </w:instrText>
-            </w:r>
-            <w:r>
-              <w:rPr>
-                <w:noProof/>
-              </w:rPr>
-            </w:r>
-            <w:r>
-              <w:rPr>
-                <w:noProof/>
-              </w:rPr>
-              <w:fldChar w:fldCharType="separate"/>
-            </w:r>
-            <w:r>
-              <w:rPr>
-                <w:noProof/>
-              </w:rPr>
-              <w:t>14</w:t>
-            </w:r>
-            <w:r>
-              <w:rPr>
-                <w:noProof/>
-              </w:rPr>
-              <w:fldChar w:fldCharType="end"/>
-            </w:r>
-          </w:hyperlink>
-        </w:p>
-        <w:p>
-          <w:pPr>
-            <w:pStyle w:val="TableofFigures"/>
-            <w:tabs>
-              <w:tab w:val="right" w:leader="dot" w:pos="9016"/>
-            </w:tabs>
-            <w:rPr>
-              <w:noProof/>
-            </w:rPr>
-          </w:pPr>
-          <w:hyperlink w:anchor="_Toc231919084" w:history="1">
-            <w:r>
-              <w:rPr>
-                <w:rStyle w:val="Hyperlink"/>
-                <w:noProof/>
-              </w:rPr>
-              <w:t>Retrofit recommender: most-recommended measures with indicative cost (left) and top Apriori association rules by lift (right).</w:t>
-            </w:r>
-            <w:r>
-              <w:rPr>
-                <w:noProof/>
-              </w:rPr>
-              <w:tab/>
-            </w:r>
-            <w:r>
-              <w:rPr>
-                <w:noProof/>
-              </w:rPr>
-              <w:fldChar w:fldCharType="begin"/>
-            </w:r>
-            <w:r>
-              <w:rPr>
-                <w:noProof/>
-              </w:rPr>
-              <w:instrText xml:space="preserve"> PAGEREF _Toc231919084 \h </w:instrText>
-            </w:r>
-            <w:r>
-              <w:rPr>
-                <w:noProof/>
-              </w:rPr>
-            </w:r>
-            <w:r>
-              <w:rPr>
-                <w:noProof/>
-              </w:rPr>
-              <w:fldChar w:fldCharType="separate"/>
-            </w:r>
-            <w:r>
-              <w:rPr>
-                <w:noProof/>
-              </w:rPr>
-              <w:t>14</w:t>
-            </w:r>
-            <w:r>
-              <w:rPr>
-                <w:noProof/>
-              </w:rPr>
-              <w:fldChar w:fldCharType="end"/>
-            </w:r>
-          </w:hyperlink>
-        </w:p>
-        <w:p>
-          <w:r>
-            <w:fldChar w:fldCharType="end"/>
-          </w:r>
-        </w:p>
-      </w:sdtContent>
-    </w:sdt>
-    <w:p>
       <w:r>
         <w:br w:type="page"/>
       </w:r>
@@ -1767,9 +1053,15 @@
     <w:p>
       <w:pPr>
         <w:pStyle w:val="Heading1"/>
+        <w:rPr>
+          <w:lang w:val="en-GB"/>
+        </w:rPr>
       </w:pPr>
       <w:bookmarkStart w:id="0" w:name="_Toc231919061"/>
       <w:r>
+        <w:rPr>
+          <w:lang w:val="en-GB"/>
+        </w:rPr>
         <w:lastRenderedPageBreak/>
         <w:t>1. Introduction and Dataset Acquisition</w:t>
       </w:r>
@@ -1781,7 +1073,7 @@
         <w:jc w:val="both"/>
       </w:pPr>
       <w:r>
-        <w:t>The UK is legally committed to net zero by 2050 (HM Government, 2021), and domestic buildings account for around 17% of emissions, dominated by space and water heating (Climate Change Committee, 2023). Energy Performance Certificates (EPCs) are the principal evidence base for retrofit policy, recording modelled efficiency for every dwelling sold, let or built, and the Energy Performance of Buildings Register (DLUHC, 2022) publishes them as open data under the Open Government Licence v3.0.</w:t>
+        <w:t>The UK is legally committed to reaching net zero by 2050 (HM Government, 2021). Domestic buildings are responsible for around 17% of national emissions, and most of that total comes from space and water heating (Climate Change Committee, 2023). Energy Performance Certificates (EPCs) form the main evidence base for retrofit policy. An EPC records the modelled efficiency of every dwelling that is sold, let or built, and the Energy Performance of Buildings Register (DLUHC, 2022) publishes these certificates as open data under the Open Government Licence v3.0.</w:t>
       </w:r>
     </w:p>
     <w:p>
@@ -1790,7 +1082,7 @@
         <w:jc w:val="both"/>
       </w:pPr>
       <w:r>
-        <w:t>This study targets Oxford local authority (ONS code E07000178), whose stock skews unusually old. The 2021 Census records 30.4% of dwellings built before 1900 (ONS, 2023a), almost double the England-wide share, set against aggressive retrofit ambitions (Oxford City Council, 2023). The question is concrete: can the EPC band be predicted from physical characteristics alone, and which features are the largest levers?</w:t>
+        <w:t>This study focuses on Oxford local authority (ONS code E07000178), which has an unusually old housing stock. The 2021 Census records that 30.4% of its dwellings were built before 1900 (ONS, 2023a), almost twice the England-wide share, and this sits alongside ambitious local retrofit targets (Oxford City Council, 2023). The research question is direct: can a dwelling’s EPC band be predicted from its physical characteristics alone, and which of those characteristics move the rating the most?</w:t>
       </w:r>
     </w:p>
     <w:p>
@@ -1799,18 +1091,21 @@
         <w:jc w:val="both"/>
       </w:pPr>
       <w:r>
-        <w:t>Each EPC is produced by a qualified assessor using the Reduced data Standard Assessment Procedure (RdSAP) for existing dwellings or full SAP for new builds (BRE, 2014), combining measured inputs with substantial defaults. Few et al. (2023) document roughly five-point inter-assessor variability and Hardy and Glew (2019) report systemic database errors. The methodology has been revised (SAP 10, 2022), so certificates from different years are not strictly comparable, and lodgement-event selection bias under-re</w:t>
-      </w:r>
-      <w:r>
-        <w:t>presents long-tenure owner-occupied homes (Crawley et al., 2019), which the temporal split and the limitations section address.</w:t>
+        <w:t>Each EPC is produced by a qualified assessor, who uses the Reduced data Standard Assessment Procedure (RdSAP) for existing dwellings or the full SAP procedure for new builds (BRE, 2014). Both methods combine measured inputs with a large number of default assumptions. This introduces real uncertainty: Few et al. (2023) report inter-assessor variability of roughly five points, and Hardy and Glew (2019) document systemic errors in the underlying database. The methodology has also changed over time. Because the procedure was revised under SAP 10 (2022), certificates issued in different years are not strictly comparable. A further issue is lodgement-event selection bias, which under-represents long-tenure owner-occupied homes (Crawley et al., 2019). The temporal split and the limitations section both account for these concerns.</w:t>
       </w:r>
     </w:p>
     <w:p>
       <w:pPr>
         <w:pStyle w:val="Heading1"/>
+        <w:rPr>
+          <w:lang w:val="en-GB"/>
+        </w:rPr>
       </w:pPr>
       <w:bookmarkStart w:id="1" w:name="_Toc231919062"/>
       <w:r>
+        <w:rPr>
+          <w:lang w:val="en-GB"/>
+        </w:rPr>
         <w:t>2. Feature Engineering</w:t>
       </w:r>
       <w:bookmarkEnd w:id="1"/>
@@ -1821,10 +1116,7 @@
         <w:jc w:val="both"/>
       </w:pPr>
       <w:r>
-        <w:t>Feature engineering operationalises domain knowledge of building physics; nineteen features were added. The numerical features include CONSTRUCTION_AGE_NUM (the midpoint year of the banded age, so '1930-1949' becomes 1939), which makes the age effect monotonic; LOG_FLOOR_AREA stabilises the skewed area distribution; AREA_PER_ROOM and HEATED_ROOM_RATIO capture occupancy intensity; LOFT_INSULATION_MM extracts loft depth; and FLOOR_LEVEL_NUM maps the messy flats-only FLOOR_LEVEL field onto a signed-integer sto</w:t>
-      </w:r>
-      <w:r>
-        <w:t>rey scale (ground = 0, basement = -1). Nine Boolean flags are regex-extracted from the description fields: solid-brick-bare and cavity-insulated walls, no-loft and 270 mm-loft insulation, gas, electric and heat-pump heating, and single and triple glazing. Date parts capture methodology drift, and POSTCODE_DISTRICT (outward code only) is a coarse non-personal geographic feature, with the full postcode dropped for GDPR data-minimisation.</w:t>
+        <w:t>Feature engineering turns domain knowledge of building physics into model inputs, and nineteen features were added in total. The numerical features capture several distinct effects. CONSTRUCTION_AGE_NUM takes the midpoint year of each banded age, so ‘1930-1949’ becomes 1939, which makes the age effect monotonic. LOG_FLOOR_AREA stabilises the skewed area distribution. AREA_PER_ROOM and HEATED_ROOM_RATIO capture how intensively a dwelling is occupied. LOFT_INSULATION_MM extracts the loft depth, and FLOOR_LEVEL_NUM maps the inconsistent flats-only FLOOR_LEVEL field onto a signed-integer storey scale, where ground is 0 and basement is -1. Nine Boolean flags are extracted from the description fields using regular expressions, covering solid-brick-bare and cavity-insulated walls, no-loft and 270 mm-loft insulation, gas, electric and heat-pump heating, and single and triple glazing. Date parts capture drift in the methodology over time. Finally, POSTCODE_DISTRICT keeps only the outward code, giving a coarse and non-personal geographic feature, and the full postcode is dropped to satisfy GDPR data-minimisation.</w:t>
       </w:r>
     </w:p>
     <w:p>
@@ -1833,16 +1125,95 @@
         <w:jc w:val="both"/>
       </w:pPr>
       <w:r>
-        <w:t>Each feature has a hypothesised sign that is testable in Sections 3.3 and 3.4. The heat-pump flag is deliberately ambiguous: heat pumps deliver a high seasonal coefficient of performance, but SAP is based on fuel cost, and grid electricity costs roughly three times more per kWh than mains gas (Ofgem, 2024), so the model can surface this counter-intuitive interaction.</w:t>
+        <w:t xml:space="preserve">Each feature carries a hypothesised sign, which is then testable in Sections 3.3 and 3.4. The heat-pump flag is deliberately ambiguous. Heat pumps deliver a high seasonal coefficient of </w:t>
+      </w:r>
+      <w:r>
+        <w:lastRenderedPageBreak/>
+        <w:t>performance, yet SAP is based on fuel cost, and grid electricity costs roughly three times as much per kWh as mains gas (Ofgem, 2024). The model can therefore surface this counter-intuitive interaction.</w:t>
+      </w:r>
+    </w:p>
+    <w:p>
+      <w:pPr>
+        <w:spacing w:before="80" w:after="20"/>
+      </w:pPr>
+      <w:r>
+        <w:rPr>
+          <w:i/>
+          <w:sz w:val="19"/>
+        </w:rPr>
+        <w:t>Listing 1. Boolean fabric flags from the description fields (src/features.py).</w:t>
+      </w:r>
+    </w:p>
+    <w:p>
+      <w:pPr>
+        <w:keepLines/>
+        <w:pBdr>
+          <w:top w:val="single" w:sz="4" w:space="4" w:color="C9C9C9"/>
+          <w:left w:val="single" w:sz="4" w:space="4" w:color="C9C9C9"/>
+          <w:bottom w:val="single" w:sz="4" w:space="4" w:color="C9C9C9"/>
+          <w:right w:val="single" w:sz="4" w:space="4" w:color="C9C9C9"/>
+        </w:pBdr>
+        <w:shd w:val="clear" w:color="auto" w:fill="F4F4F4"/>
+        <w:spacing w:before="120" w:after="120"/>
+        <w:ind w:left="120" w:right="120"/>
+      </w:pPr>
+      <w:r>
+        <w:rPr>
+          <w:rFonts w:ascii="Consolas" w:hAnsi="Consolas"/>
+          <w:color w:val="1A1A1A"/>
+          <w:sz w:val="17"/>
+        </w:rPr>
+        <w:t># src/features.py - fabric flags parsed from the free-text *_DESCRIPTION fields</w:t>
+      </w:r>
+      <w:r>
+        <w:rPr>
+          <w:rFonts w:ascii="Consolas" w:hAnsi="Consolas"/>
+          <w:color w:val="1A1A1A"/>
+          <w:sz w:val="17"/>
+        </w:rPr>
+        <w:br/>
+        <w:t>out["FLAG_CAVITY_INSULATED"] = walls.str.contains(_RE_CAVITY_INSULATED).astype("Int8")</w:t>
+      </w:r>
+      <w:r>
+        <w:rPr>
+          <w:rFonts w:ascii="Consolas" w:hAnsi="Consolas"/>
+          <w:color w:val="1A1A1A"/>
+          <w:sz w:val="17"/>
+        </w:rPr>
+        <w:br/>
+        <w:t>out["FLAG_SOLID_BRICK_BARE"] = walls.str.contains(_RE_SOLID_BRICK_BARE).astype("Int8")</w:t>
+      </w:r>
+      <w:r>
+        <w:rPr>
+          <w:rFonts w:ascii="Consolas" w:hAnsi="Consolas"/>
+          <w:color w:val="1A1A1A"/>
+          <w:sz w:val="17"/>
+        </w:rPr>
+        <w:br/>
+        <w:t>out["FLAG_HEAT_PUMP"]        = mainheat.str.contains(_RE_HEAT_PUMP).astype("Int8")</w:t>
+      </w:r>
+      <w:r>
+        <w:rPr>
+          <w:rFonts w:ascii="Consolas" w:hAnsi="Consolas"/>
+          <w:color w:val="1A1A1A"/>
+          <w:sz w:val="17"/>
+        </w:rPr>
+        <w:br/>
+        <w:t>out["FLAG_SINGLE_GLAZED"]    = windows.str.contains(_RE_SINGLE_GLAZED).astype("Int8")</w:t>
       </w:r>
     </w:p>
     <w:p>
       <w:pPr>
         <w:pStyle w:val="Heading1"/>
+        <w:rPr>
+          <w:lang w:val="en-GB"/>
+        </w:rPr>
       </w:pPr>
       <w:bookmarkStart w:id="2" w:name="_Toc231919063"/>
       <w:r>
-        <w:lastRenderedPageBreak/>
+        <w:rPr>
+          <w:lang w:val="en-GB"/>
+        </w:rPr>
         <w:t>3. Analysis</w:t>
       </w:r>
       <w:bookmarkEnd w:id="2"/>
@@ -1853,15 +1224,21 @@
         <w:jc w:val="both"/>
       </w:pPr>
       <w:r>
-        <w:t>The analysis follows a descriptive, diagnostic and predictive progression. Section 3.3 tests three building-physics hypotheses and Section 3.4 evaluates the predictive champion against published baselines under leakage-controlled cross-validation (CV) and a temporal hold-out.</w:t>
+        <w:t>The analysis moves through three stages: descriptive, then diagnostic, then predictive. Section 3.3 tests three building-physics hypotheses, and Section 3.4 evaluates the predictive champion against published baselines, using leakage-controlled cross-validation (CV) together with a temporal hold-out.</w:t>
       </w:r>
     </w:p>
     <w:p>
       <w:pPr>
         <w:pStyle w:val="Heading2"/>
+        <w:rPr>
+          <w:lang w:val="en-GB"/>
+        </w:rPr>
       </w:pPr>
       <w:bookmarkStart w:id="3" w:name="_Toc231919064"/>
       <w:r>
+        <w:rPr>
+          <w:lang w:val="en-GB"/>
+        </w:rPr>
         <w:t>3.1 Data Wrangling</w:t>
       </w:r>
       <w:bookmarkEnd w:id="3"/>
@@ -1872,7 +1249,7 @@
         <w:jc w:val="both"/>
       </w:pPr>
       <w:r>
-        <w:t>The raw certificates.csv file contains 76,430 rows and 93 columns for Oxford. Loading applies explicit dtype hints and normalises the register's 'no data' sentinel tokens (NODATA!, NO DATA!, INVALID!) to NaN, so they neither pollute the categorical encoders nor escape the missingness indicators. The flats-only FLOOR_LEVEL field, recorded in incompatible formats, is canonicalised to a signed-integer storey (FLOOR_LEVEL_NUM) rather than discarded, with unrecognised values set to NaN.</w:t>
+        <w:t>The raw certificates.csv file holds 76,430 rows and 93 columns for Oxford. Loading applies explicit dtype hints and normalises the register’s ‘no data’ sentinel tokens (NODATA!, NO DATA!, INVALID!) to NaN, so that these tokens neither pollute the categorical encoders nor slip past the missingness indicators. The flats-only FLOOR_LEVEL field is recorded in several incompatible formats. Rather than discard it, the field is converted to a signed-integer storey value (FLOOR_LEVEL_NUM), and any values that cannot be recognised are set to NaN.</w:t>
       </w:r>
     </w:p>
     <w:p>
@@ -1881,22 +1258,90 @@
         <w:jc w:val="both"/>
       </w:pPr>
       <w:r>
-        <w:t>Five cleaning operations are applied as pure functions for reproducibility. (i) Filter to LOCAL_AUTHORITY == 'E07000178'. (ii) Coerce numeric columns and normalise sentinel tokens, so non-coercible strings and 'no data' tokens become NaN. (iii) Deduplicate to one EPC per Unique Property Reference Number (UPRN), keeping the most recent with completeness tie-breaks, because a random split of an un-deduplicated frame would leak the same property into train and test. (iv) Cap TOTAL_FLOOR_AREA at the 99.5th perc</w:t>
-      </w:r>
-      <w:r>
-        <w:t>entile, drop rows below 10 m2, set impossible zero rooms or area to NaN, and flag negative net consumption as HAS_ONSITE_GENERATION (solar PV). (v) Remove rows with missing or non-A-to-G targets. The cleaned frame of 49,442 certificates is saved to data/processed/oxford_epc_clean.csv with PII and redundant administrative columns dropped per GDPR Article 5.</w:t>
-      </w:r>
-    </w:p>
-    <w:p>
-      <w:pPr>
+        <w:t>Five cleaning operations are applied as pure functions, which keeps the process reproducible.</w:t>
+      </w:r>
+    </w:p>
+    <w:p>
+      <w:pPr>
+        <w:pStyle w:val="ListParagraph"/>
+        <w:numPr>
+          <w:ilvl w:val="0"/>
+          <w:numId w:val="2"/>
+        </w:numPr>
         <w:spacing w:after="160" w:line="276" w:lineRule="auto"/>
         <w:jc w:val="both"/>
       </w:pPr>
       <w:r>
-        <w:t>Missingness is informative rather than random: FLAT_STOREY_COUNT and HEAT_LOSS_CORRIDOR are structurally NaN for houses, and UNHEATED_CORRIDOR_LENGTH is NaN unless an unheated corridor exists. Rather than drop these moderately incomplete columns, each field above 5% missingness gains a binary &lt;COL&gt;_IS_MISSING indicator so the tree can learn the structural meaning; only columns at or above 99.9% empty are dropped. The gradient-booster consumes the remaining NaNs natively, while the linear and forest baseline</w:t>
-      </w:r>
-      <w:r>
-        <w:t>s median-impute within the training fold only.</w:t>
+        <w:t>Filter to LOCAL_AUTHORITY == ‘E07000178’.</w:t>
+      </w:r>
+    </w:p>
+    <w:p>
+      <w:pPr>
+        <w:pStyle w:val="ListParagraph"/>
+        <w:numPr>
+          <w:ilvl w:val="0"/>
+          <w:numId w:val="2"/>
+        </w:numPr>
+        <w:spacing w:after="160" w:line="276" w:lineRule="auto"/>
+        <w:jc w:val="both"/>
+      </w:pPr>
+      <w:r>
+        <w:t>Coerce numeric columns and normalise the sentinel tokens, so that non-coercible strings and ‘no data’ tokens become NaN.</w:t>
+      </w:r>
+    </w:p>
+    <w:p>
+      <w:pPr>
+        <w:pStyle w:val="ListParagraph"/>
+        <w:numPr>
+          <w:ilvl w:val="0"/>
+          <w:numId w:val="2"/>
+        </w:numPr>
+        <w:spacing w:after="160" w:line="276" w:lineRule="auto"/>
+        <w:jc w:val="both"/>
+      </w:pPr>
+      <w:r>
+        <w:t>Deduplicate to one EPC per Unique Property Reference Number (UPRN), keeping the most recent certificate and using completeness as a tie-break. This step matters because a random split of an un-deduplicated frame would leak the same property into both the training and test sets.</w:t>
+      </w:r>
+    </w:p>
+    <w:p>
+      <w:pPr>
+        <w:pStyle w:val="ListParagraph"/>
+        <w:numPr>
+          <w:ilvl w:val="0"/>
+          <w:numId w:val="2"/>
+        </w:numPr>
+        <w:spacing w:after="160" w:line="276" w:lineRule="auto"/>
+        <w:jc w:val="both"/>
+      </w:pPr>
+      <w:r>
+        <w:t>Cap TOTAL_FLOOR_AREA at the 99.5th percentile, drop rows below 10 m2, set impossible zero rooms or zero area to NaN, and flag negative net consumption as HAS_ONSITE_GENERATION (solar PV).</w:t>
+      </w:r>
+    </w:p>
+    <w:p>
+      <w:pPr>
+        <w:pStyle w:val="ListParagraph"/>
+        <w:numPr>
+          <w:ilvl w:val="0"/>
+          <w:numId w:val="2"/>
+        </w:numPr>
+        <w:spacing w:after="160" w:line="276" w:lineRule="auto"/>
+        <w:jc w:val="both"/>
+      </w:pPr>
+      <w:r>
+        <w:t>Remove rows whose target is missing or falls outside the A-to-G scale. The cleaned frame of 49,442 certificates is saved to data/processed/oxford_epc_clean.csv, with PII and redundant administrative columns dropped in line with GDPR Article 5.</w:t>
+      </w:r>
+    </w:p>
+    <w:p>
+      <w:pPr>
+        <w:spacing w:after="160" w:line="276" w:lineRule="auto"/>
+        <w:jc w:val="both"/>
+      </w:pPr>
+      <w:r>
+        <w:t xml:space="preserve">Missingness here is informative rather than random. FLAT_STOREY_COUNT and HEAT_LOSS_CORRIDOR are structurally NaN for houses, and UNHEATED_CORRIDOR_LENGTH is NaN unless an unheated corridor actually exists. </w:t>
+      </w:r>
+      <w:r>
+        <w:lastRenderedPageBreak/>
+        <w:t>Instead of dropping these moderately incomplete columns, each field above 5% missingness is given a binary &lt;COL&gt;_IS_MISSING indicator, so the tree can learn the structural meaning of the gap. Only columns that are at least 99.9% empty are dropped. The gradient-booster handles the remaining NaNs natively, while the linear and forest baselines median-impute, doing so within the training fold only.</w:t>
       </w:r>
     </w:p>
     <w:p>
@@ -1908,7 +1353,6 @@
         <w:rPr>
           <w:noProof/>
         </w:rPr>
-        <w:lastRenderedPageBreak/>
         <w:drawing>
           <wp:inline distT="0" distB="0" distL="0" distR="0" wp14:anchorId="4EA4D907" wp14:editId="2526B16B">
             <wp:extent cx="5029200" cy="3095625"/>
@@ -1954,33 +1398,58 @@
         <w:pStyle w:val="Caption"/>
         <w:spacing w:after="200"/>
         <w:jc w:val="center"/>
-      </w:pPr>
-      <w:r>
+        <w:rPr>
+          <w:lang w:val="en-GB"/>
+        </w:rPr>
+      </w:pPr>
+      <w:r>
+        <w:rPr>
+          <w:lang w:val="en-GB"/>
+        </w:rPr>
         <w:t xml:space="preserve">Figure </w:t>
       </w:r>
       <w:r>
+        <w:rPr>
+          <w:lang w:val="en-GB"/>
+        </w:rPr>
         <w:fldChar w:fldCharType="begin"/>
       </w:r>
       <w:r>
+        <w:rPr>
+          <w:lang w:val="en-GB"/>
+        </w:rPr>
         <w:instrText>SEQ Figure</w:instrText>
       </w:r>
       <w:r>
+        <w:rPr>
+          <w:lang w:val="en-GB"/>
+        </w:rPr>
         <w:fldChar w:fldCharType="separate"/>
       </w:r>
       <w:r>
         <w:rPr>
           <w:noProof/>
+          <w:lang w:val="en-GB"/>
         </w:rPr>
         <w:t>1</w:t>
       </w:r>
       <w:r>
+        <w:rPr>
+          <w:lang w:val="en-GB"/>
+        </w:rPr>
         <w:fldChar w:fldCharType="end"/>
       </w:r>
       <w:r>
+        <w:rPr>
+          <w:lang w:val="en-GB"/>
+        </w:rPr>
         <w:t xml:space="preserve">. </w:t>
       </w:r>
       <w:bookmarkStart w:id="4" w:name="_Toc231919072"/>
       <w:r>
+        <w:rPr>
+          <w:lang w:val="en-GB"/>
+        </w:rPr>
         <w:t>Top 20 features by missingness in the cleaned Oxford frame. Structural NaN dominates: flat-only fields are absent for houses by design.</w:t>
       </w:r>
       <w:bookmarkEnd w:id="4"/>
@@ -1988,9 +1457,15 @@
     <w:p>
       <w:pPr>
         <w:pStyle w:val="Heading2"/>
+        <w:rPr>
+          <w:lang w:val="en-GB"/>
+        </w:rPr>
       </w:pPr>
       <w:bookmarkStart w:id="5" w:name="_Toc231919065"/>
       <w:r>
+        <w:rPr>
+          <w:lang w:val="en-GB"/>
+        </w:rPr>
         <w:t>3.2 Descriptive Analytics</w:t>
       </w:r>
       <w:bookmarkEnd w:id="5"/>
@@ -2001,10 +1476,7 @@
         <w:jc w:val="both"/>
       </w:pPr>
       <w:r>
-        <w:t>The current rating distribution (Figure 2) is dominated by bands C and D, which together account for the substantial majority of Oxford's lodged stock. The B and A tail is thin, and the F and G tail is also thin but non-trivial, concentrated in pre-1900 conversions and listed buildings. The class imbalance is the principal modelling challenge: a naive accuracy-optimised classifier collapses to predicting D. We therefore use class-balanced training and report Quadratic Weighted Kappa (QWK), which penalises d</w:t>
-      </w:r>
-      <w:r>
-        <w:t>istant misclassifications more than nearby ones, the appropriate inductive bias for an ordinal target.</w:t>
+        <w:t>The current rating distribution (Figure 2) is dominated by bands C and D, which together make up the substantial majority of Oxford’s lodged stock. The A and B tail is thin. The F and G tail is also thin, though non-trivial, and it is concentrated in pre-1900 conversions and listed buildings. The main modelling challenge is this class imbalance, because a naive classifier that simply maximises accuracy collapses to always predicting D. The pipeline therefore uses class-balanced training and reports Quadratic Weighted Kappa (QWK), a metric that penalises distant misclassifications more heavily than nearby ones and so provides the right inductive bias for an ordinal target.</w:t>
       </w:r>
     </w:p>
     <w:p>
@@ -2016,6 +1488,7 @@
         <w:rPr>
           <w:noProof/>
         </w:rPr>
+        <w:lastRenderedPageBreak/>
         <w:drawing>
           <wp:inline distT="0" distB="0" distL="0" distR="0" wp14:anchorId="58712179" wp14:editId="071E035D">
             <wp:extent cx="5029200" cy="2886075"/>
@@ -2061,33 +1534,58 @@
         <w:pStyle w:val="Caption"/>
         <w:spacing w:after="200"/>
         <w:jc w:val="center"/>
-      </w:pPr>
-      <w:r>
+        <w:rPr>
+          <w:lang w:val="en-GB"/>
+        </w:rPr>
+      </w:pPr>
+      <w:r>
+        <w:rPr>
+          <w:lang w:val="en-GB"/>
+        </w:rPr>
         <w:t xml:space="preserve">Figure </w:t>
       </w:r>
       <w:r>
+        <w:rPr>
+          <w:lang w:val="en-GB"/>
+        </w:rPr>
         <w:fldChar w:fldCharType="begin"/>
       </w:r>
       <w:r>
+        <w:rPr>
+          <w:lang w:val="en-GB"/>
+        </w:rPr>
         <w:instrText>SEQ Figure</w:instrText>
       </w:r>
       <w:r>
+        <w:rPr>
+          <w:lang w:val="en-GB"/>
+        </w:rPr>
         <w:fldChar w:fldCharType="separate"/>
       </w:r>
       <w:r>
         <w:rPr>
           <w:noProof/>
+          <w:lang w:val="en-GB"/>
         </w:rPr>
         <w:t>2</w:t>
       </w:r>
       <w:r>
+        <w:rPr>
+          <w:lang w:val="en-GB"/>
+        </w:rPr>
         <w:fldChar w:fldCharType="end"/>
       </w:r>
       <w:r>
+        <w:rPr>
+          <w:lang w:val="en-GB"/>
+        </w:rPr>
         <w:t xml:space="preserve">. </w:t>
       </w:r>
       <w:bookmarkStart w:id="6" w:name="_Toc231919073"/>
       <w:r>
+        <w:rPr>
+          <w:lang w:val="en-GB"/>
+        </w:rPr>
         <w:t>Distribution of CURRENT_ENERGY_RATING across the cleaned Oxford frame. Bands C and D dominate, while bands A and G are sparsely populated.</w:t>
       </w:r>
       <w:bookmarkEnd w:id="6"/>
@@ -2098,8 +1596,7 @@
         <w:jc w:val="both"/>
       </w:pPr>
       <w:r>
-        <w:lastRenderedPageBreak/>
-        <w:t>Lodgement volume by inspection year (Figure 3) shows growth from 2008 onward driven by the expansion of EPC requirements, a clear COVID-19 dip in 2020, and a 2022 to 2023 spike coincident with energy-price-shock-driven sales activity. This pattern motivates the temporal split, which gives a more honest estimate of generalisation than a random one.</w:t>
+        <w:t>Lodgement volume by inspection year (Figure 3) shows three clear patterns: steady growth from 2008 onward as EPC requirements expanded, a sharp COVID-19 dip in 2020, and a spike across 2022 to 2023 that coincides with sales activity driven by the energy price shock. This time-varying pattern is what motivates the temporal split, since a temporal split gives a more honest estimate of generalisation than a random one.</w:t>
       </w:r>
     </w:p>
     <w:p>
@@ -2156,33 +1653,58 @@
         <w:pStyle w:val="Caption"/>
         <w:spacing w:after="200"/>
         <w:jc w:val="center"/>
-      </w:pPr>
-      <w:r>
+        <w:rPr>
+          <w:lang w:val="en-GB"/>
+        </w:rPr>
+      </w:pPr>
+      <w:r>
+        <w:rPr>
+          <w:lang w:val="en-GB"/>
+        </w:rPr>
         <w:t xml:space="preserve">Figure </w:t>
       </w:r>
       <w:r>
+        <w:rPr>
+          <w:lang w:val="en-GB"/>
+        </w:rPr>
         <w:fldChar w:fldCharType="begin"/>
       </w:r>
       <w:r>
+        <w:rPr>
+          <w:lang w:val="en-GB"/>
+        </w:rPr>
         <w:instrText>SEQ Figure</w:instrText>
       </w:r>
       <w:r>
+        <w:rPr>
+          <w:lang w:val="en-GB"/>
+        </w:rPr>
         <w:fldChar w:fldCharType="separate"/>
       </w:r>
       <w:r>
         <w:rPr>
           <w:noProof/>
+          <w:lang w:val="en-GB"/>
         </w:rPr>
         <w:t>3</w:t>
       </w:r>
       <w:r>
+        <w:rPr>
+          <w:lang w:val="en-GB"/>
+        </w:rPr>
         <w:fldChar w:fldCharType="end"/>
       </w:r>
       <w:r>
+        <w:rPr>
+          <w:lang w:val="en-GB"/>
+        </w:rPr>
         <w:t xml:space="preserve">. </w:t>
       </w:r>
       <w:bookmarkStart w:id="7" w:name="_Toc231919074"/>
       <w:r>
+        <w:rPr>
+          <w:lang w:val="en-GB"/>
+        </w:rPr>
         <w:t>EPC lodgements by inspection year. Notable features include the 2020 COVID-19 dip and the 2022 to 2023 spike during the energy price shock.</w:t>
       </w:r>
       <w:bookmarkEnd w:id="7"/>
@@ -2193,7 +1715,7 @@
         <w:jc w:val="both"/>
       </w:pPr>
       <w:r>
-        <w:t>Property type cross-tabulated with built form (Figure 4) confirms Oxford's distinctive stock profile: terraces and semi-detached houses dominate, with a substantial share of purpose-built and converted flats reflecting the city's student and young-professional rental market. Detached dwellings are comparatively rare, and summary statistics for the key numeric features are tabulated in reports/summary_stats.csv.</w:t>
+        <w:t>Cross-tabulating property type with built form (Figure 4) confirms Oxford’s distinctive stock profile. Terraces and semi-detached houses dominate, accompanied by a substantial share of purpose-built and converted flats that reflect the city’s student and young-professional rental market. Detached dwellings are comparatively rare. Summary statistics for the key numeric features are tabulated in reports/summary_stats.csv.</w:t>
       </w:r>
     </w:p>
     <w:p>
@@ -2205,6 +1727,7 @@
         <w:rPr>
           <w:noProof/>
         </w:rPr>
+        <w:lastRenderedPageBreak/>
         <w:drawing>
           <wp:inline distT="0" distB="0" distL="0" distR="0" wp14:anchorId="554EA42C" wp14:editId="44FD2046">
             <wp:extent cx="5029200" cy="2362200"/>
@@ -2250,33 +1773,58 @@
         <w:pStyle w:val="Caption"/>
         <w:spacing w:after="200"/>
         <w:jc w:val="center"/>
-      </w:pPr>
-      <w:r>
+        <w:rPr>
+          <w:lang w:val="en-GB"/>
+        </w:rPr>
+      </w:pPr>
+      <w:r>
+        <w:rPr>
+          <w:lang w:val="en-GB"/>
+        </w:rPr>
         <w:t xml:space="preserve">Figure </w:t>
       </w:r>
       <w:r>
+        <w:rPr>
+          <w:lang w:val="en-GB"/>
+        </w:rPr>
         <w:fldChar w:fldCharType="begin"/>
       </w:r>
       <w:r>
+        <w:rPr>
+          <w:lang w:val="en-GB"/>
+        </w:rPr>
         <w:instrText>SEQ Figure</w:instrText>
       </w:r>
       <w:r>
+        <w:rPr>
+          <w:lang w:val="en-GB"/>
+        </w:rPr>
         <w:fldChar w:fldCharType="separate"/>
       </w:r>
       <w:r>
         <w:rPr>
           <w:noProof/>
+          <w:lang w:val="en-GB"/>
         </w:rPr>
         <w:t>4</w:t>
       </w:r>
       <w:r>
+        <w:rPr>
+          <w:lang w:val="en-GB"/>
+        </w:rPr>
         <w:fldChar w:fldCharType="end"/>
       </w:r>
       <w:r>
+        <w:rPr>
+          <w:lang w:val="en-GB"/>
+        </w:rPr>
         <w:t xml:space="preserve">. </w:t>
       </w:r>
       <w:bookmarkStart w:id="8" w:name="_Toc231919075"/>
       <w:r>
+        <w:rPr>
+          <w:lang w:val="en-GB"/>
+        </w:rPr>
         <w:t>Joint distribution of property type and built form for cleaned Oxford certificates.</w:t>
       </w:r>
       <w:bookmarkEnd w:id="8"/>
@@ -2287,7 +1835,7 @@
         <w:jc w:val="both"/>
       </w:pPr>
       <w:r>
-        <w:t>Property type strongly discriminates efficiency: flats average the highest SAP (72.0, band C), since shared walls cut heat loss, ahead of maisonettes (67.2) and houses (65.4, band D); the eight park homes are worst (49.0, band E). Within each type, mean SAP rises monotonically across construction eras, by roughly 25 points from pre-1900 to post-2007, tracking Building Regulations. The champion performs consistently across types (hold-out QWK: House 0.78, Maisonette 0.78, Bungalow 0.736, Flat 0.714).</w:t>
+        <w:t>Property type is a strong discriminator of efficiency. Flats record the highest mean SAP at 72.0 (band C), because shared walls reduce heat loss, ahead of maisonettes at 67.2 and houses at 65.4 (band D); the eight park homes are the worst at 49.0 (band E). Within each property type, mean SAP rises monotonically across the construction eras, climbing by roughly 25 points from pre-1900 to post-2007 and tracking successive Building Regulations. The champion model performs consistently across these types, with a hold-out QWK of 0.78 for houses, 0.78 for maisonettes, 0.736 for bungalows and 0.714 for flats.</w:t>
       </w:r>
     </w:p>
     <w:p>
@@ -2302,25 +1850,13 @@
           <w:sz w:val="20"/>
           <w:szCs w:val="20"/>
         </w:rPr>
-        <w:lastRenderedPageBreak/>
         <w:t>Table 1. Mean SAP score by property type and construction era.</w:t>
       </w:r>
     </w:p>
     <w:tbl>
       <w:tblPr>
+        <w:tblStyle w:val="TableGrid"/>
         <w:tblW w:w="9026" w:type="dxa"/>
-        <w:tblBorders>
-          <w:top w:val="single" w:sz="4" w:space="0" w:color="auto"/>
-          <w:left w:val="single" w:sz="4" w:space="0" w:color="auto"/>
-          <w:bottom w:val="single" w:sz="4" w:space="0" w:color="auto"/>
-          <w:right w:val="single" w:sz="4" w:space="0" w:color="auto"/>
-          <w:insideH w:val="single" w:sz="4" w:space="0" w:color="auto"/>
-          <w:insideV w:val="single" w:sz="4" w:space="0" w:color="auto"/>
-        </w:tblBorders>
-        <w:tblCellMar>
-          <w:left w:w="10" w:type="dxa"/>
-          <w:right w:w="10" w:type="dxa"/>
-        </w:tblCellMar>
         <w:tblLook w:val="0000" w:firstRow="0" w:lastRow="0" w:firstColumn="0" w:lastColumn="0" w:noHBand="0" w:noVBand="0"/>
       </w:tblPr>
       <w:tblGrid>
@@ -2331,32 +1867,10 @@
         <w:gridCol w:w="1650"/>
       </w:tblGrid>
       <w:tr>
-        <w:tblPrEx>
-          <w:tblCellMar>
-            <w:top w:w="0" w:type="dxa"/>
-            <w:bottom w:w="0" w:type="dxa"/>
-          </w:tblCellMar>
-        </w:tblPrEx>
-        <w:trPr>
-          <w:tblHeader/>
-        </w:trPr>
         <w:tc>
           <w:tcPr>
             <w:tcW w:w="2426" w:type="dxa"/>
-            <w:tcBorders>
-              <w:top w:val="single" w:sz="1" w:space="0" w:color="999999"/>
-              <w:left w:val="single" w:sz="1" w:space="0" w:color="999999"/>
-              <w:bottom w:val="single" w:sz="1" w:space="0" w:color="999999"/>
-              <w:right w:val="single" w:sz="1" w:space="0" w:color="999999"/>
-            </w:tcBorders>
-            <w:shd w:val="clear" w:color="auto" w:fill="1F3A5F"/>
-            <w:tcMar>
-              <w:top w:w="40" w:type="dxa"/>
-              <w:left w:w="100" w:type="dxa"/>
-              <w:bottom w:w="40" w:type="dxa"/>
-              <w:right w:w="100" w:type="dxa"/>
-            </w:tcMar>
-            <w:vAlign w:val="center"/>
+            <w:shd w:val="clear" w:color="auto" w:fill="0D0D0D" w:themeFill="text1" w:themeFillTint="F2"/>
           </w:tcPr>
           <w:p>
             <w:pPr>
@@ -2377,20 +1891,7 @@
         <w:tc>
           <w:tcPr>
             <w:tcW w:w="1650" w:type="dxa"/>
-            <w:tcBorders>
-              <w:top w:val="single" w:sz="1" w:space="0" w:color="999999"/>
-              <w:left w:val="single" w:sz="1" w:space="0" w:color="999999"/>
-              <w:bottom w:val="single" w:sz="1" w:space="0" w:color="999999"/>
-              <w:right w:val="single" w:sz="1" w:space="0" w:color="999999"/>
-            </w:tcBorders>
-            <w:shd w:val="clear" w:color="auto" w:fill="1F3A5F"/>
-            <w:tcMar>
-              <w:top w:w="40" w:type="dxa"/>
-              <w:left w:w="100" w:type="dxa"/>
-              <w:bottom w:w="40" w:type="dxa"/>
-              <w:right w:w="100" w:type="dxa"/>
-            </w:tcMar>
-            <w:vAlign w:val="center"/>
+            <w:shd w:val="clear" w:color="auto" w:fill="0D0D0D" w:themeFill="text1" w:themeFillTint="F2"/>
           </w:tcPr>
           <w:p>
             <w:pPr>
@@ -2411,20 +1912,7 @@
         <w:tc>
           <w:tcPr>
             <w:tcW w:w="1650" w:type="dxa"/>
-            <w:tcBorders>
-              <w:top w:val="single" w:sz="1" w:space="0" w:color="999999"/>
-              <w:left w:val="single" w:sz="1" w:space="0" w:color="999999"/>
-              <w:bottom w:val="single" w:sz="1" w:space="0" w:color="999999"/>
-              <w:right w:val="single" w:sz="1" w:space="0" w:color="999999"/>
-            </w:tcBorders>
-            <w:shd w:val="clear" w:color="auto" w:fill="1F3A5F"/>
-            <w:tcMar>
-              <w:top w:w="40" w:type="dxa"/>
-              <w:left w:w="100" w:type="dxa"/>
-              <w:bottom w:w="40" w:type="dxa"/>
-              <w:right w:w="100" w:type="dxa"/>
-            </w:tcMar>
-            <w:vAlign w:val="center"/>
+            <w:shd w:val="clear" w:color="auto" w:fill="0D0D0D" w:themeFill="text1" w:themeFillTint="F2"/>
           </w:tcPr>
           <w:p>
             <w:pPr>
@@ -2445,20 +1933,7 @@
         <w:tc>
           <w:tcPr>
             <w:tcW w:w="1650" w:type="dxa"/>
-            <w:tcBorders>
-              <w:top w:val="single" w:sz="1" w:space="0" w:color="999999"/>
-              <w:left w:val="single" w:sz="1" w:space="0" w:color="999999"/>
-              <w:bottom w:val="single" w:sz="1" w:space="0" w:color="999999"/>
-              <w:right w:val="single" w:sz="1" w:space="0" w:color="999999"/>
-            </w:tcBorders>
-            <w:shd w:val="clear" w:color="auto" w:fill="1F3A5F"/>
-            <w:tcMar>
-              <w:top w:w="40" w:type="dxa"/>
-              <w:left w:w="100" w:type="dxa"/>
-              <w:bottom w:w="40" w:type="dxa"/>
-              <w:right w:w="100" w:type="dxa"/>
-            </w:tcMar>
-            <w:vAlign w:val="center"/>
+            <w:shd w:val="clear" w:color="auto" w:fill="0D0D0D" w:themeFill="text1" w:themeFillTint="F2"/>
           </w:tcPr>
           <w:p>
             <w:pPr>
@@ -2479,20 +1954,7 @@
         <w:tc>
           <w:tcPr>
             <w:tcW w:w="1650" w:type="dxa"/>
-            <w:tcBorders>
-              <w:top w:val="single" w:sz="1" w:space="0" w:color="999999"/>
-              <w:left w:val="single" w:sz="1" w:space="0" w:color="999999"/>
-              <w:bottom w:val="single" w:sz="1" w:space="0" w:color="999999"/>
-              <w:right w:val="single" w:sz="1" w:space="0" w:color="999999"/>
-            </w:tcBorders>
-            <w:shd w:val="clear" w:color="auto" w:fill="1F3A5F"/>
-            <w:tcMar>
-              <w:top w:w="40" w:type="dxa"/>
-              <w:left w:w="100" w:type="dxa"/>
-              <w:bottom w:w="40" w:type="dxa"/>
-              <w:right w:w="100" w:type="dxa"/>
-            </w:tcMar>
-            <w:vAlign w:val="center"/>
+            <w:shd w:val="clear" w:color="auto" w:fill="0D0D0D" w:themeFill="text1" w:themeFillTint="F2"/>
           </w:tcPr>
           <w:p>
             <w:pPr>
@@ -2512,28 +1974,9 @@
         </w:tc>
       </w:tr>
       <w:tr>
-        <w:tblPrEx>
-          <w:tblCellMar>
-            <w:top w:w="0" w:type="dxa"/>
-            <w:bottom w:w="0" w:type="dxa"/>
-          </w:tblCellMar>
-        </w:tblPrEx>
         <w:tc>
           <w:tcPr>
             <w:tcW w:w="2426" w:type="dxa"/>
-            <w:tcBorders>
-              <w:top w:val="single" w:sz="1" w:space="0" w:color="999999"/>
-              <w:left w:val="single" w:sz="1" w:space="0" w:color="999999"/>
-              <w:bottom w:val="single" w:sz="1" w:space="0" w:color="999999"/>
-              <w:right w:val="single" w:sz="1" w:space="0" w:color="999999"/>
-            </w:tcBorders>
-            <w:tcMar>
-              <w:top w:w="40" w:type="dxa"/>
-              <w:left w:w="100" w:type="dxa"/>
-              <w:bottom w:w="40" w:type="dxa"/>
-              <w:right w:w="100" w:type="dxa"/>
-            </w:tcMar>
-            <w:vAlign w:val="center"/>
           </w:tcPr>
           <w:p>
             <w:r>
@@ -2549,19 +1992,6 @@
         <w:tc>
           <w:tcPr>
             <w:tcW w:w="1650" w:type="dxa"/>
-            <w:tcBorders>
-              <w:top w:val="single" w:sz="1" w:space="0" w:color="999999"/>
-              <w:left w:val="single" w:sz="1" w:space="0" w:color="999999"/>
-              <w:bottom w:val="single" w:sz="1" w:space="0" w:color="999999"/>
-              <w:right w:val="single" w:sz="1" w:space="0" w:color="999999"/>
-            </w:tcBorders>
-            <w:tcMar>
-              <w:top w:w="40" w:type="dxa"/>
-              <w:left w:w="100" w:type="dxa"/>
-              <w:bottom w:w="40" w:type="dxa"/>
-              <w:right w:w="100" w:type="dxa"/>
-            </w:tcMar>
-            <w:vAlign w:val="center"/>
           </w:tcPr>
           <w:p>
             <w:pPr>
@@ -2580,19 +2010,6 @@
         <w:tc>
           <w:tcPr>
             <w:tcW w:w="1650" w:type="dxa"/>
-            <w:tcBorders>
-              <w:top w:val="single" w:sz="1" w:space="0" w:color="999999"/>
-              <w:left w:val="single" w:sz="1" w:space="0" w:color="999999"/>
-              <w:bottom w:val="single" w:sz="1" w:space="0" w:color="999999"/>
-              <w:right w:val="single" w:sz="1" w:space="0" w:color="999999"/>
-            </w:tcBorders>
-            <w:tcMar>
-              <w:top w:w="40" w:type="dxa"/>
-              <w:left w:w="100" w:type="dxa"/>
-              <w:bottom w:w="40" w:type="dxa"/>
-              <w:right w:w="100" w:type="dxa"/>
-            </w:tcMar>
-            <w:vAlign w:val="center"/>
           </w:tcPr>
           <w:p>
             <w:pPr>
@@ -2611,19 +2028,6 @@
         <w:tc>
           <w:tcPr>
             <w:tcW w:w="1650" w:type="dxa"/>
-            <w:tcBorders>
-              <w:top w:val="single" w:sz="1" w:space="0" w:color="999999"/>
-              <w:left w:val="single" w:sz="1" w:space="0" w:color="999999"/>
-              <w:bottom w:val="single" w:sz="1" w:space="0" w:color="999999"/>
-              <w:right w:val="single" w:sz="1" w:space="0" w:color="999999"/>
-            </w:tcBorders>
-            <w:tcMar>
-              <w:top w:w="40" w:type="dxa"/>
-              <w:left w:w="100" w:type="dxa"/>
-              <w:bottom w:w="40" w:type="dxa"/>
-              <w:right w:w="100" w:type="dxa"/>
-            </w:tcMar>
-            <w:vAlign w:val="center"/>
           </w:tcPr>
           <w:p>
             <w:pPr>
@@ -2642,19 +2046,6 @@
         <w:tc>
           <w:tcPr>
             <w:tcW w:w="1650" w:type="dxa"/>
-            <w:tcBorders>
-              <w:top w:val="single" w:sz="1" w:space="0" w:color="999999"/>
-              <w:left w:val="single" w:sz="1" w:space="0" w:color="999999"/>
-              <w:bottom w:val="single" w:sz="1" w:space="0" w:color="999999"/>
-              <w:right w:val="single" w:sz="1" w:space="0" w:color="999999"/>
-            </w:tcBorders>
-            <w:tcMar>
-              <w:top w:w="40" w:type="dxa"/>
-              <w:left w:w="100" w:type="dxa"/>
-              <w:bottom w:w="40" w:type="dxa"/>
-              <w:right w:w="100" w:type="dxa"/>
-            </w:tcMar>
-            <w:vAlign w:val="center"/>
           </w:tcPr>
           <w:p>
             <w:pPr>
@@ -2672,28 +2063,9 @@
         </w:tc>
       </w:tr>
       <w:tr>
-        <w:tblPrEx>
-          <w:tblCellMar>
-            <w:top w:w="0" w:type="dxa"/>
-            <w:bottom w:w="0" w:type="dxa"/>
-          </w:tblCellMar>
-        </w:tblPrEx>
         <w:tc>
           <w:tcPr>
             <w:tcW w:w="2426" w:type="dxa"/>
-            <w:tcBorders>
-              <w:top w:val="single" w:sz="1" w:space="0" w:color="999999"/>
-              <w:left w:val="single" w:sz="1" w:space="0" w:color="999999"/>
-              <w:bottom w:val="single" w:sz="1" w:space="0" w:color="999999"/>
-              <w:right w:val="single" w:sz="1" w:space="0" w:color="999999"/>
-            </w:tcBorders>
-            <w:tcMar>
-              <w:top w:w="40" w:type="dxa"/>
-              <w:left w:w="100" w:type="dxa"/>
-              <w:bottom w:w="40" w:type="dxa"/>
-              <w:right w:w="100" w:type="dxa"/>
-            </w:tcMar>
-            <w:vAlign w:val="center"/>
           </w:tcPr>
           <w:p>
             <w:r>
@@ -2709,19 +2081,6 @@
         <w:tc>
           <w:tcPr>
             <w:tcW w:w="1650" w:type="dxa"/>
-            <w:tcBorders>
-              <w:top w:val="single" w:sz="1" w:space="0" w:color="999999"/>
-              <w:left w:val="single" w:sz="1" w:space="0" w:color="999999"/>
-              <w:bottom w:val="single" w:sz="1" w:space="0" w:color="999999"/>
-              <w:right w:val="single" w:sz="1" w:space="0" w:color="999999"/>
-            </w:tcBorders>
-            <w:tcMar>
-              <w:top w:w="40" w:type="dxa"/>
-              <w:left w:w="100" w:type="dxa"/>
-              <w:bottom w:w="40" w:type="dxa"/>
-              <w:right w:w="100" w:type="dxa"/>
-            </w:tcMar>
-            <w:vAlign w:val="center"/>
           </w:tcPr>
           <w:p>
             <w:pPr>
@@ -2740,19 +2099,6 @@
         <w:tc>
           <w:tcPr>
             <w:tcW w:w="1650" w:type="dxa"/>
-            <w:tcBorders>
-              <w:top w:val="single" w:sz="1" w:space="0" w:color="999999"/>
-              <w:left w:val="single" w:sz="1" w:space="0" w:color="999999"/>
-              <w:bottom w:val="single" w:sz="1" w:space="0" w:color="999999"/>
-              <w:right w:val="single" w:sz="1" w:space="0" w:color="999999"/>
-            </w:tcBorders>
-            <w:tcMar>
-              <w:top w:w="40" w:type="dxa"/>
-              <w:left w:w="100" w:type="dxa"/>
-              <w:bottom w:w="40" w:type="dxa"/>
-              <w:right w:w="100" w:type="dxa"/>
-            </w:tcMar>
-            <w:vAlign w:val="center"/>
           </w:tcPr>
           <w:p>
             <w:pPr>
@@ -2771,19 +2117,6 @@
         <w:tc>
           <w:tcPr>
             <w:tcW w:w="1650" w:type="dxa"/>
-            <w:tcBorders>
-              <w:top w:val="single" w:sz="1" w:space="0" w:color="999999"/>
-              <w:left w:val="single" w:sz="1" w:space="0" w:color="999999"/>
-              <w:bottom w:val="single" w:sz="1" w:space="0" w:color="999999"/>
-              <w:right w:val="single" w:sz="1" w:space="0" w:color="999999"/>
-            </w:tcBorders>
-            <w:tcMar>
-              <w:top w:w="40" w:type="dxa"/>
-              <w:left w:w="100" w:type="dxa"/>
-              <w:bottom w:w="40" w:type="dxa"/>
-              <w:right w:w="100" w:type="dxa"/>
-            </w:tcMar>
-            <w:vAlign w:val="center"/>
           </w:tcPr>
           <w:p>
             <w:pPr>
@@ -2802,19 +2135,6 @@
         <w:tc>
           <w:tcPr>
             <w:tcW w:w="1650" w:type="dxa"/>
-            <w:tcBorders>
-              <w:top w:val="single" w:sz="1" w:space="0" w:color="999999"/>
-              <w:left w:val="single" w:sz="1" w:space="0" w:color="999999"/>
-              <w:bottom w:val="single" w:sz="1" w:space="0" w:color="999999"/>
-              <w:right w:val="single" w:sz="1" w:space="0" w:color="999999"/>
-            </w:tcBorders>
-            <w:tcMar>
-              <w:top w:w="40" w:type="dxa"/>
-              <w:left w:w="100" w:type="dxa"/>
-              <w:bottom w:w="40" w:type="dxa"/>
-              <w:right w:w="100" w:type="dxa"/>
-            </w:tcMar>
-            <w:vAlign w:val="center"/>
           </w:tcPr>
           <w:p>
             <w:pPr>
@@ -2832,28 +2152,9 @@
         </w:tc>
       </w:tr>
       <w:tr>
-        <w:tblPrEx>
-          <w:tblCellMar>
-            <w:top w:w="0" w:type="dxa"/>
-            <w:bottom w:w="0" w:type="dxa"/>
-          </w:tblCellMar>
-        </w:tblPrEx>
         <w:tc>
           <w:tcPr>
             <w:tcW w:w="2426" w:type="dxa"/>
-            <w:tcBorders>
-              <w:top w:val="single" w:sz="1" w:space="0" w:color="999999"/>
-              <w:left w:val="single" w:sz="1" w:space="0" w:color="999999"/>
-              <w:bottom w:val="single" w:sz="1" w:space="0" w:color="999999"/>
-              <w:right w:val="single" w:sz="1" w:space="0" w:color="999999"/>
-            </w:tcBorders>
-            <w:tcMar>
-              <w:top w:w="40" w:type="dxa"/>
-              <w:left w:w="100" w:type="dxa"/>
-              <w:bottom w:w="40" w:type="dxa"/>
-              <w:right w:w="100" w:type="dxa"/>
-            </w:tcMar>
-            <w:vAlign w:val="center"/>
           </w:tcPr>
           <w:p>
             <w:r>
@@ -2869,19 +2170,6 @@
         <w:tc>
           <w:tcPr>
             <w:tcW w:w="1650" w:type="dxa"/>
-            <w:tcBorders>
-              <w:top w:val="single" w:sz="1" w:space="0" w:color="999999"/>
-              <w:left w:val="single" w:sz="1" w:space="0" w:color="999999"/>
-              <w:bottom w:val="single" w:sz="1" w:space="0" w:color="999999"/>
-              <w:right w:val="single" w:sz="1" w:space="0" w:color="999999"/>
-            </w:tcBorders>
-            <w:tcMar>
-              <w:top w:w="40" w:type="dxa"/>
-              <w:left w:w="100" w:type="dxa"/>
-              <w:bottom w:w="40" w:type="dxa"/>
-              <w:right w:w="100" w:type="dxa"/>
-            </w:tcMar>
-            <w:vAlign w:val="center"/>
           </w:tcPr>
           <w:p>
             <w:pPr>
@@ -2900,19 +2188,6 @@
         <w:tc>
           <w:tcPr>
             <w:tcW w:w="1650" w:type="dxa"/>
-            <w:tcBorders>
-              <w:top w:val="single" w:sz="1" w:space="0" w:color="999999"/>
-              <w:left w:val="single" w:sz="1" w:space="0" w:color="999999"/>
-              <w:bottom w:val="single" w:sz="1" w:space="0" w:color="999999"/>
-              <w:right w:val="single" w:sz="1" w:space="0" w:color="999999"/>
-            </w:tcBorders>
-            <w:tcMar>
-              <w:top w:w="40" w:type="dxa"/>
-              <w:left w:w="100" w:type="dxa"/>
-              <w:bottom w:w="40" w:type="dxa"/>
-              <w:right w:w="100" w:type="dxa"/>
-            </w:tcMar>
-            <w:vAlign w:val="center"/>
           </w:tcPr>
           <w:p>
             <w:pPr>
@@ -2931,19 +2206,6 @@
         <w:tc>
           <w:tcPr>
             <w:tcW w:w="1650" w:type="dxa"/>
-            <w:tcBorders>
-              <w:top w:val="single" w:sz="1" w:space="0" w:color="999999"/>
-              <w:left w:val="single" w:sz="1" w:space="0" w:color="999999"/>
-              <w:bottom w:val="single" w:sz="1" w:space="0" w:color="999999"/>
-              <w:right w:val="single" w:sz="1" w:space="0" w:color="999999"/>
-            </w:tcBorders>
-            <w:tcMar>
-              <w:top w:w="40" w:type="dxa"/>
-              <w:left w:w="100" w:type="dxa"/>
-              <w:bottom w:w="40" w:type="dxa"/>
-              <w:right w:w="100" w:type="dxa"/>
-            </w:tcMar>
-            <w:vAlign w:val="center"/>
           </w:tcPr>
           <w:p>
             <w:pPr>
@@ -2962,19 +2224,6 @@
         <w:tc>
           <w:tcPr>
             <w:tcW w:w="1650" w:type="dxa"/>
-            <w:tcBorders>
-              <w:top w:val="single" w:sz="1" w:space="0" w:color="999999"/>
-              <w:left w:val="single" w:sz="1" w:space="0" w:color="999999"/>
-              <w:bottom w:val="single" w:sz="1" w:space="0" w:color="999999"/>
-              <w:right w:val="single" w:sz="1" w:space="0" w:color="999999"/>
-            </w:tcBorders>
-            <w:tcMar>
-              <w:top w:w="40" w:type="dxa"/>
-              <w:left w:w="100" w:type="dxa"/>
-              <w:bottom w:w="40" w:type="dxa"/>
-              <w:right w:w="100" w:type="dxa"/>
-            </w:tcMar>
-            <w:vAlign w:val="center"/>
           </w:tcPr>
           <w:p>
             <w:pPr>
@@ -2992,28 +2241,9 @@
         </w:tc>
       </w:tr>
       <w:tr>
-        <w:tblPrEx>
-          <w:tblCellMar>
-            <w:top w:w="0" w:type="dxa"/>
-            <w:bottom w:w="0" w:type="dxa"/>
-          </w:tblCellMar>
-        </w:tblPrEx>
         <w:tc>
           <w:tcPr>
             <w:tcW w:w="2426" w:type="dxa"/>
-            <w:tcBorders>
-              <w:top w:val="single" w:sz="1" w:space="0" w:color="999999"/>
-              <w:left w:val="single" w:sz="1" w:space="0" w:color="999999"/>
-              <w:bottom w:val="single" w:sz="1" w:space="0" w:color="999999"/>
-              <w:right w:val="single" w:sz="1" w:space="0" w:color="999999"/>
-            </w:tcBorders>
-            <w:tcMar>
-              <w:top w:w="40" w:type="dxa"/>
-              <w:left w:w="100" w:type="dxa"/>
-              <w:bottom w:w="40" w:type="dxa"/>
-              <w:right w:w="100" w:type="dxa"/>
-            </w:tcMar>
-            <w:vAlign w:val="center"/>
           </w:tcPr>
           <w:p>
             <w:r>
@@ -3029,19 +2259,6 @@
         <w:tc>
           <w:tcPr>
             <w:tcW w:w="1650" w:type="dxa"/>
-            <w:tcBorders>
-              <w:top w:val="single" w:sz="1" w:space="0" w:color="999999"/>
-              <w:left w:val="single" w:sz="1" w:space="0" w:color="999999"/>
-              <w:bottom w:val="single" w:sz="1" w:space="0" w:color="999999"/>
-              <w:right w:val="single" w:sz="1" w:space="0" w:color="999999"/>
-            </w:tcBorders>
-            <w:tcMar>
-              <w:top w:w="40" w:type="dxa"/>
-              <w:left w:w="100" w:type="dxa"/>
-              <w:bottom w:w="40" w:type="dxa"/>
-              <w:right w:w="100" w:type="dxa"/>
-            </w:tcMar>
-            <w:vAlign w:val="center"/>
           </w:tcPr>
           <w:p>
             <w:pPr>
@@ -3060,19 +2277,6 @@
         <w:tc>
           <w:tcPr>
             <w:tcW w:w="1650" w:type="dxa"/>
-            <w:tcBorders>
-              <w:top w:val="single" w:sz="1" w:space="0" w:color="999999"/>
-              <w:left w:val="single" w:sz="1" w:space="0" w:color="999999"/>
-              <w:bottom w:val="single" w:sz="1" w:space="0" w:color="999999"/>
-              <w:right w:val="single" w:sz="1" w:space="0" w:color="999999"/>
-            </w:tcBorders>
-            <w:tcMar>
-              <w:top w:w="40" w:type="dxa"/>
-              <w:left w:w="100" w:type="dxa"/>
-              <w:bottom w:w="40" w:type="dxa"/>
-              <w:right w:w="100" w:type="dxa"/>
-            </w:tcMar>
-            <w:vAlign w:val="center"/>
           </w:tcPr>
           <w:p>
             <w:pPr>
@@ -3091,19 +2295,6 @@
         <w:tc>
           <w:tcPr>
             <w:tcW w:w="1650" w:type="dxa"/>
-            <w:tcBorders>
-              <w:top w:val="single" w:sz="1" w:space="0" w:color="999999"/>
-              <w:left w:val="single" w:sz="1" w:space="0" w:color="999999"/>
-              <w:bottom w:val="single" w:sz="1" w:space="0" w:color="999999"/>
-              <w:right w:val="single" w:sz="1" w:space="0" w:color="999999"/>
-            </w:tcBorders>
-            <w:tcMar>
-              <w:top w:w="40" w:type="dxa"/>
-              <w:left w:w="100" w:type="dxa"/>
-              <w:bottom w:w="40" w:type="dxa"/>
-              <w:right w:w="100" w:type="dxa"/>
-            </w:tcMar>
-            <w:vAlign w:val="center"/>
           </w:tcPr>
           <w:p>
             <w:pPr>
@@ -3122,19 +2313,6 @@
         <w:tc>
           <w:tcPr>
             <w:tcW w:w="1650" w:type="dxa"/>
-            <w:tcBorders>
-              <w:top w:val="single" w:sz="1" w:space="0" w:color="999999"/>
-              <w:left w:val="single" w:sz="1" w:space="0" w:color="999999"/>
-              <w:bottom w:val="single" w:sz="1" w:space="0" w:color="999999"/>
-              <w:right w:val="single" w:sz="1" w:space="0" w:color="999999"/>
-            </w:tcBorders>
-            <w:tcMar>
-              <w:top w:w="40" w:type="dxa"/>
-              <w:left w:w="100" w:type="dxa"/>
-              <w:bottom w:w="40" w:type="dxa"/>
-              <w:right w:w="100" w:type="dxa"/>
-            </w:tcMar>
-            <w:vAlign w:val="center"/>
           </w:tcPr>
           <w:p>
             <w:pPr>
@@ -3152,28 +2330,9 @@
         </w:tc>
       </w:tr>
       <w:tr>
-        <w:tblPrEx>
-          <w:tblCellMar>
-            <w:top w:w="0" w:type="dxa"/>
-            <w:bottom w:w="0" w:type="dxa"/>
-          </w:tblCellMar>
-        </w:tblPrEx>
         <w:tc>
           <w:tcPr>
             <w:tcW w:w="2426" w:type="dxa"/>
-            <w:tcBorders>
-              <w:top w:val="single" w:sz="1" w:space="0" w:color="999999"/>
-              <w:left w:val="single" w:sz="1" w:space="0" w:color="999999"/>
-              <w:bottom w:val="single" w:sz="1" w:space="0" w:color="999999"/>
-              <w:right w:val="single" w:sz="1" w:space="0" w:color="999999"/>
-            </w:tcBorders>
-            <w:tcMar>
-              <w:top w:w="40" w:type="dxa"/>
-              <w:left w:w="100" w:type="dxa"/>
-              <w:bottom w:w="40" w:type="dxa"/>
-              <w:right w:w="100" w:type="dxa"/>
-            </w:tcMar>
-            <w:vAlign w:val="center"/>
           </w:tcPr>
           <w:p>
             <w:r>
@@ -3189,19 +2348,6 @@
         <w:tc>
           <w:tcPr>
             <w:tcW w:w="1650" w:type="dxa"/>
-            <w:tcBorders>
-              <w:top w:val="single" w:sz="1" w:space="0" w:color="999999"/>
-              <w:left w:val="single" w:sz="1" w:space="0" w:color="999999"/>
-              <w:bottom w:val="single" w:sz="1" w:space="0" w:color="999999"/>
-              <w:right w:val="single" w:sz="1" w:space="0" w:color="999999"/>
-            </w:tcBorders>
-            <w:tcMar>
-              <w:top w:w="40" w:type="dxa"/>
-              <w:left w:w="100" w:type="dxa"/>
-              <w:bottom w:w="40" w:type="dxa"/>
-              <w:right w:w="100" w:type="dxa"/>
-            </w:tcMar>
-            <w:vAlign w:val="center"/>
           </w:tcPr>
           <w:p>
             <w:pPr>
@@ -3220,19 +2366,6 @@
         <w:tc>
           <w:tcPr>
             <w:tcW w:w="1650" w:type="dxa"/>
-            <w:tcBorders>
-              <w:top w:val="single" w:sz="1" w:space="0" w:color="999999"/>
-              <w:left w:val="single" w:sz="1" w:space="0" w:color="999999"/>
-              <w:bottom w:val="single" w:sz="1" w:space="0" w:color="999999"/>
-              <w:right w:val="single" w:sz="1" w:space="0" w:color="999999"/>
-            </w:tcBorders>
-            <w:tcMar>
-              <w:top w:w="40" w:type="dxa"/>
-              <w:left w:w="100" w:type="dxa"/>
-              <w:bottom w:w="40" w:type="dxa"/>
-              <w:right w:w="100" w:type="dxa"/>
-            </w:tcMar>
-            <w:vAlign w:val="center"/>
           </w:tcPr>
           <w:p>
             <w:pPr>
@@ -3251,19 +2384,6 @@
         <w:tc>
           <w:tcPr>
             <w:tcW w:w="1650" w:type="dxa"/>
-            <w:tcBorders>
-              <w:top w:val="single" w:sz="1" w:space="0" w:color="999999"/>
-              <w:left w:val="single" w:sz="1" w:space="0" w:color="999999"/>
-              <w:bottom w:val="single" w:sz="1" w:space="0" w:color="999999"/>
-              <w:right w:val="single" w:sz="1" w:space="0" w:color="999999"/>
-            </w:tcBorders>
-            <w:tcMar>
-              <w:top w:w="40" w:type="dxa"/>
-              <w:left w:w="100" w:type="dxa"/>
-              <w:bottom w:w="40" w:type="dxa"/>
-              <w:right w:w="100" w:type="dxa"/>
-            </w:tcMar>
-            <w:vAlign w:val="center"/>
           </w:tcPr>
           <w:p>
             <w:pPr>
@@ -3282,19 +2402,6 @@
         <w:tc>
           <w:tcPr>
             <w:tcW w:w="1650" w:type="dxa"/>
-            <w:tcBorders>
-              <w:top w:val="single" w:sz="1" w:space="0" w:color="999999"/>
-              <w:left w:val="single" w:sz="1" w:space="0" w:color="999999"/>
-              <w:bottom w:val="single" w:sz="1" w:space="0" w:color="999999"/>
-              <w:right w:val="single" w:sz="1" w:space="0" w:color="999999"/>
-            </w:tcBorders>
-            <w:tcMar>
-              <w:top w:w="40" w:type="dxa"/>
-              <w:left w:w="100" w:type="dxa"/>
-              <w:bottom w:w="40" w:type="dxa"/>
-              <w:right w:w="100" w:type="dxa"/>
-            </w:tcMar>
-            <w:vAlign w:val="center"/>
           </w:tcPr>
           <w:p>
             <w:pPr>
@@ -3312,28 +2419,9 @@
         </w:tc>
       </w:tr>
       <w:tr>
-        <w:tblPrEx>
-          <w:tblCellMar>
-            <w:top w:w="0" w:type="dxa"/>
-            <w:bottom w:w="0" w:type="dxa"/>
-          </w:tblCellMar>
-        </w:tblPrEx>
         <w:tc>
           <w:tcPr>
             <w:tcW w:w="2426" w:type="dxa"/>
-            <w:tcBorders>
-              <w:top w:val="single" w:sz="1" w:space="0" w:color="999999"/>
-              <w:left w:val="single" w:sz="1" w:space="0" w:color="999999"/>
-              <w:bottom w:val="single" w:sz="1" w:space="0" w:color="999999"/>
-              <w:right w:val="single" w:sz="1" w:space="0" w:color="999999"/>
-            </w:tcBorders>
-            <w:tcMar>
-              <w:top w:w="40" w:type="dxa"/>
-              <w:left w:w="100" w:type="dxa"/>
-              <w:bottom w:w="40" w:type="dxa"/>
-              <w:right w:w="100" w:type="dxa"/>
-            </w:tcMar>
-            <w:vAlign w:val="center"/>
           </w:tcPr>
           <w:p>
             <w:r>
@@ -3349,19 +2437,6 @@
         <w:tc>
           <w:tcPr>
             <w:tcW w:w="1650" w:type="dxa"/>
-            <w:tcBorders>
-              <w:top w:val="single" w:sz="1" w:space="0" w:color="999999"/>
-              <w:left w:val="single" w:sz="1" w:space="0" w:color="999999"/>
-              <w:bottom w:val="single" w:sz="1" w:space="0" w:color="999999"/>
-              <w:right w:val="single" w:sz="1" w:space="0" w:color="999999"/>
-            </w:tcBorders>
-            <w:tcMar>
-              <w:top w:w="40" w:type="dxa"/>
-              <w:left w:w="100" w:type="dxa"/>
-              <w:bottom w:w="40" w:type="dxa"/>
-              <w:right w:w="100" w:type="dxa"/>
-            </w:tcMar>
-            <w:vAlign w:val="center"/>
           </w:tcPr>
           <w:p>
             <w:pPr>
@@ -3380,19 +2455,6 @@
         <w:tc>
           <w:tcPr>
             <w:tcW w:w="1650" w:type="dxa"/>
-            <w:tcBorders>
-              <w:top w:val="single" w:sz="1" w:space="0" w:color="999999"/>
-              <w:left w:val="single" w:sz="1" w:space="0" w:color="999999"/>
-              <w:bottom w:val="single" w:sz="1" w:space="0" w:color="999999"/>
-              <w:right w:val="single" w:sz="1" w:space="0" w:color="999999"/>
-            </w:tcBorders>
-            <w:tcMar>
-              <w:top w:w="40" w:type="dxa"/>
-              <w:left w:w="100" w:type="dxa"/>
-              <w:bottom w:w="40" w:type="dxa"/>
-              <w:right w:w="100" w:type="dxa"/>
-            </w:tcMar>
-            <w:vAlign w:val="center"/>
           </w:tcPr>
           <w:p>
             <w:pPr>
@@ -3411,19 +2473,6 @@
         <w:tc>
           <w:tcPr>
             <w:tcW w:w="1650" w:type="dxa"/>
-            <w:tcBorders>
-              <w:top w:val="single" w:sz="1" w:space="0" w:color="999999"/>
-              <w:left w:val="single" w:sz="1" w:space="0" w:color="999999"/>
-              <w:bottom w:val="single" w:sz="1" w:space="0" w:color="999999"/>
-              <w:right w:val="single" w:sz="1" w:space="0" w:color="999999"/>
-            </w:tcBorders>
-            <w:tcMar>
-              <w:top w:w="40" w:type="dxa"/>
-              <w:left w:w="100" w:type="dxa"/>
-              <w:bottom w:w="40" w:type="dxa"/>
-              <w:right w:w="100" w:type="dxa"/>
-            </w:tcMar>
-            <w:vAlign w:val="center"/>
           </w:tcPr>
           <w:p>
             <w:pPr>
@@ -3442,19 +2491,6 @@
         <w:tc>
           <w:tcPr>
             <w:tcW w:w="1650" w:type="dxa"/>
-            <w:tcBorders>
-              <w:top w:val="single" w:sz="1" w:space="0" w:color="999999"/>
-              <w:left w:val="single" w:sz="1" w:space="0" w:color="999999"/>
-              <w:bottom w:val="single" w:sz="1" w:space="0" w:color="999999"/>
-              <w:right w:val="single" w:sz="1" w:space="0" w:color="999999"/>
-            </w:tcBorders>
-            <w:tcMar>
-              <w:top w:w="40" w:type="dxa"/>
-              <w:left w:w="100" w:type="dxa"/>
-              <w:bottom w:w="40" w:type="dxa"/>
-              <w:right w:w="100" w:type="dxa"/>
-            </w:tcMar>
-            <w:vAlign w:val="center"/>
           </w:tcPr>
           <w:p>
             <w:pPr>
@@ -3472,28 +2508,9 @@
         </w:tc>
       </w:tr>
       <w:tr>
-        <w:tblPrEx>
-          <w:tblCellMar>
-            <w:top w:w="0" w:type="dxa"/>
-            <w:bottom w:w="0" w:type="dxa"/>
-          </w:tblCellMar>
-        </w:tblPrEx>
         <w:tc>
           <w:tcPr>
             <w:tcW w:w="2426" w:type="dxa"/>
-            <w:tcBorders>
-              <w:top w:val="single" w:sz="1" w:space="0" w:color="999999"/>
-              <w:left w:val="single" w:sz="1" w:space="0" w:color="999999"/>
-              <w:bottom w:val="single" w:sz="1" w:space="0" w:color="999999"/>
-              <w:right w:val="single" w:sz="1" w:space="0" w:color="999999"/>
-            </w:tcBorders>
-            <w:tcMar>
-              <w:top w:w="40" w:type="dxa"/>
-              <w:left w:w="100" w:type="dxa"/>
-              <w:bottom w:w="40" w:type="dxa"/>
-              <w:right w:w="100" w:type="dxa"/>
-            </w:tcMar>
-            <w:vAlign w:val="center"/>
           </w:tcPr>
           <w:p>
             <w:r>
@@ -3509,19 +2526,6 @@
         <w:tc>
           <w:tcPr>
             <w:tcW w:w="1650" w:type="dxa"/>
-            <w:tcBorders>
-              <w:top w:val="single" w:sz="1" w:space="0" w:color="999999"/>
-              <w:left w:val="single" w:sz="1" w:space="0" w:color="999999"/>
-              <w:bottom w:val="single" w:sz="1" w:space="0" w:color="999999"/>
-              <w:right w:val="single" w:sz="1" w:space="0" w:color="999999"/>
-            </w:tcBorders>
-            <w:tcMar>
-              <w:top w:w="40" w:type="dxa"/>
-              <w:left w:w="100" w:type="dxa"/>
-              <w:bottom w:w="40" w:type="dxa"/>
-              <w:right w:w="100" w:type="dxa"/>
-            </w:tcMar>
-            <w:vAlign w:val="center"/>
           </w:tcPr>
           <w:p>
             <w:pPr>
@@ -3540,19 +2544,6 @@
         <w:tc>
           <w:tcPr>
             <w:tcW w:w="1650" w:type="dxa"/>
-            <w:tcBorders>
-              <w:top w:val="single" w:sz="1" w:space="0" w:color="999999"/>
-              <w:left w:val="single" w:sz="1" w:space="0" w:color="999999"/>
-              <w:bottom w:val="single" w:sz="1" w:space="0" w:color="999999"/>
-              <w:right w:val="single" w:sz="1" w:space="0" w:color="999999"/>
-            </w:tcBorders>
-            <w:tcMar>
-              <w:top w:w="40" w:type="dxa"/>
-              <w:left w:w="100" w:type="dxa"/>
-              <w:bottom w:w="40" w:type="dxa"/>
-              <w:right w:w="100" w:type="dxa"/>
-            </w:tcMar>
-            <w:vAlign w:val="center"/>
           </w:tcPr>
           <w:p>
             <w:pPr>
@@ -3571,19 +2562,6 @@
         <w:tc>
           <w:tcPr>
             <w:tcW w:w="1650" w:type="dxa"/>
-            <w:tcBorders>
-              <w:top w:val="single" w:sz="1" w:space="0" w:color="999999"/>
-              <w:left w:val="single" w:sz="1" w:space="0" w:color="999999"/>
-              <w:bottom w:val="single" w:sz="1" w:space="0" w:color="999999"/>
-              <w:right w:val="single" w:sz="1" w:space="0" w:color="999999"/>
-            </w:tcBorders>
-            <w:tcMar>
-              <w:top w:w="40" w:type="dxa"/>
-              <w:left w:w="100" w:type="dxa"/>
-              <w:bottom w:w="40" w:type="dxa"/>
-              <w:right w:w="100" w:type="dxa"/>
-            </w:tcMar>
-            <w:vAlign w:val="center"/>
           </w:tcPr>
           <w:p>
             <w:pPr>
@@ -3602,19 +2580,6 @@
         <w:tc>
           <w:tcPr>
             <w:tcW w:w="1650" w:type="dxa"/>
-            <w:tcBorders>
-              <w:top w:val="single" w:sz="1" w:space="0" w:color="999999"/>
-              <w:left w:val="single" w:sz="1" w:space="0" w:color="999999"/>
-              <w:bottom w:val="single" w:sz="1" w:space="0" w:color="999999"/>
-              <w:right w:val="single" w:sz="1" w:space="0" w:color="999999"/>
-            </w:tcBorders>
-            <w:tcMar>
-              <w:top w:w="40" w:type="dxa"/>
-              <w:left w:w="100" w:type="dxa"/>
-              <w:bottom w:w="40" w:type="dxa"/>
-              <w:right w:w="100" w:type="dxa"/>
-            </w:tcMar>
-            <w:vAlign w:val="center"/>
           </w:tcPr>
           <w:p>
             <w:pPr>
@@ -3632,28 +2597,9 @@
         </w:tc>
       </w:tr>
       <w:tr>
-        <w:tblPrEx>
-          <w:tblCellMar>
-            <w:top w:w="0" w:type="dxa"/>
-            <w:bottom w:w="0" w:type="dxa"/>
-          </w:tblCellMar>
-        </w:tblPrEx>
         <w:tc>
           <w:tcPr>
             <w:tcW w:w="2426" w:type="dxa"/>
-            <w:tcBorders>
-              <w:top w:val="single" w:sz="1" w:space="0" w:color="999999"/>
-              <w:left w:val="single" w:sz="1" w:space="0" w:color="999999"/>
-              <w:bottom w:val="single" w:sz="1" w:space="0" w:color="999999"/>
-              <w:right w:val="single" w:sz="1" w:space="0" w:color="999999"/>
-            </w:tcBorders>
-            <w:tcMar>
-              <w:top w:w="40" w:type="dxa"/>
-              <w:left w:w="100" w:type="dxa"/>
-              <w:bottom w:w="40" w:type="dxa"/>
-              <w:right w:w="100" w:type="dxa"/>
-            </w:tcMar>
-            <w:vAlign w:val="center"/>
           </w:tcPr>
           <w:p>
             <w:r>
@@ -3669,19 +2615,6 @@
         <w:tc>
           <w:tcPr>
             <w:tcW w:w="1650" w:type="dxa"/>
-            <w:tcBorders>
-              <w:top w:val="single" w:sz="1" w:space="0" w:color="999999"/>
-              <w:left w:val="single" w:sz="1" w:space="0" w:color="999999"/>
-              <w:bottom w:val="single" w:sz="1" w:space="0" w:color="999999"/>
-              <w:right w:val="single" w:sz="1" w:space="0" w:color="999999"/>
-            </w:tcBorders>
-            <w:tcMar>
-              <w:top w:w="40" w:type="dxa"/>
-              <w:left w:w="100" w:type="dxa"/>
-              <w:bottom w:w="40" w:type="dxa"/>
-              <w:right w:w="100" w:type="dxa"/>
-            </w:tcMar>
-            <w:vAlign w:val="center"/>
           </w:tcPr>
           <w:p>
             <w:pPr>
@@ -3700,19 +2633,6 @@
         <w:tc>
           <w:tcPr>
             <w:tcW w:w="1650" w:type="dxa"/>
-            <w:tcBorders>
-              <w:top w:val="single" w:sz="1" w:space="0" w:color="999999"/>
-              <w:left w:val="single" w:sz="1" w:space="0" w:color="999999"/>
-              <w:bottom w:val="single" w:sz="1" w:space="0" w:color="999999"/>
-              <w:right w:val="single" w:sz="1" w:space="0" w:color="999999"/>
-            </w:tcBorders>
-            <w:tcMar>
-              <w:top w:w="40" w:type="dxa"/>
-              <w:left w:w="100" w:type="dxa"/>
-              <w:bottom w:w="40" w:type="dxa"/>
-              <w:right w:w="100" w:type="dxa"/>
-            </w:tcMar>
-            <w:vAlign w:val="center"/>
           </w:tcPr>
           <w:p>
             <w:pPr>
@@ -3731,19 +2651,6 @@
         <w:tc>
           <w:tcPr>
             <w:tcW w:w="1650" w:type="dxa"/>
-            <w:tcBorders>
-              <w:top w:val="single" w:sz="1" w:space="0" w:color="999999"/>
-              <w:left w:val="single" w:sz="1" w:space="0" w:color="999999"/>
-              <w:bottom w:val="single" w:sz="1" w:space="0" w:color="999999"/>
-              <w:right w:val="single" w:sz="1" w:space="0" w:color="999999"/>
-            </w:tcBorders>
-            <w:tcMar>
-              <w:top w:w="40" w:type="dxa"/>
-              <w:left w:w="100" w:type="dxa"/>
-              <w:bottom w:w="40" w:type="dxa"/>
-              <w:right w:w="100" w:type="dxa"/>
-            </w:tcMar>
-            <w:vAlign w:val="center"/>
           </w:tcPr>
           <w:p>
             <w:pPr>
@@ -3762,19 +2669,6 @@
         <w:tc>
           <w:tcPr>
             <w:tcW w:w="1650" w:type="dxa"/>
-            <w:tcBorders>
-              <w:top w:val="single" w:sz="1" w:space="0" w:color="999999"/>
-              <w:left w:val="single" w:sz="1" w:space="0" w:color="999999"/>
-              <w:bottom w:val="single" w:sz="1" w:space="0" w:color="999999"/>
-              <w:right w:val="single" w:sz="1" w:space="0" w:color="999999"/>
-            </w:tcBorders>
-            <w:tcMar>
-              <w:top w:w="40" w:type="dxa"/>
-              <w:left w:w="100" w:type="dxa"/>
-              <w:bottom w:w="40" w:type="dxa"/>
-              <w:right w:w="100" w:type="dxa"/>
-            </w:tcMar>
-            <w:vAlign w:val="center"/>
           </w:tcPr>
           <w:p>
             <w:pPr>
@@ -3794,15 +2688,16 @@
     </w:tbl>
     <w:p>
       <w:pPr>
-        <w:spacing w:after="120"/>
-      </w:pPr>
-    </w:p>
-    <w:p>
-      <w:pPr>
         <w:pStyle w:val="Heading2"/>
+        <w:rPr>
+          <w:lang w:val="en-GB"/>
+        </w:rPr>
       </w:pPr>
       <w:bookmarkStart w:id="9" w:name="_Toc231919066"/>
       <w:r>
+        <w:rPr>
+          <w:lang w:val="en-GB"/>
+        </w:rPr>
         <w:t>3.3 Diagnostic Analytics</w:t>
       </w:r>
       <w:bookmarkEnd w:id="9"/>
@@ -3813,7 +2708,7 @@
         <w:jc w:val="both"/>
       </w:pPr>
       <w:r>
-        <w:t>Three hypotheses motivate the diagnostic battery. H1: older dwellings have systematically worse ratings, driven by uninsulated solid-wall construction and poorer airtightness. H2: wall construction is the single largest physical lever within Oxford's stock. H3: glazing type and the proportion of multi-glazed area correlate with the rating, but more weakly than wall construction.</w:t>
+        <w:t>Three hypotheses motivate the diagnostic battery. H1 holds that older dwellings have systematically worse ratings, driven by uninsulated solid-wall construction and poorer airtightness. H2 holds that wall construction is the single largest physical lever within Oxford’s stock. H3 holds that glazing type and the proportion of multi-glazed area correlate with the rating, but more weakly than wall construction does.</w:t>
       </w:r>
     </w:p>
     <w:p>
@@ -3822,7 +2717,7 @@
         <w:jc w:val="both"/>
       </w:pPr>
       <w:r>
-        <w:t>Spearman correlation is used because the rating is ordinal and the SAP score bounded. The age-band effect is monotonic and strong: the Spearman rho between CONSTRUCTION_AGE_NUM and SAP score is 0.618 (p &lt; 1e-50), supporting H1. The stacked composition by age band (Figure 5) shows the F and G tail concentrated in pre-1929 stock and the B and C heads in post-1996 builds, a stepwise improvement reflecting four decades of Building Regulations Part L revisions.</w:t>
+        <w:t>Spearman correlation is the appropriate measure here, because the rating is ordinal and the SAP score is bounded. The age-band effect is strong and monotonic: the Spearman rho between CONSTRUCTION_AGE_NUM and SAP score is 0.618 (p &lt; 1e-50), which supports H1. The stacked composition by age band (Figure 5) shows the F and G tail concentrated in pre-1929 stock and the B and C heads concentrated in post-1996 builds. This stepwise improvement reflects four decades of revisions to Building Regulations Part L.</w:t>
       </w:r>
     </w:p>
     <w:p>
@@ -3834,6 +2729,7 @@
         <w:rPr>
           <w:noProof/>
         </w:rPr>
+        <w:lastRenderedPageBreak/>
         <w:drawing>
           <wp:inline distT="0" distB="0" distL="0" distR="0" wp14:anchorId="3DCBF3AC" wp14:editId="544FE9F2">
             <wp:extent cx="5029200" cy="2600325"/>
@@ -3879,33 +2775,58 @@
         <w:pStyle w:val="Caption"/>
         <w:spacing w:after="200"/>
         <w:jc w:val="center"/>
-      </w:pPr>
-      <w:r>
+        <w:rPr>
+          <w:lang w:val="en-GB"/>
+        </w:rPr>
+      </w:pPr>
+      <w:r>
+        <w:rPr>
+          <w:lang w:val="en-GB"/>
+        </w:rPr>
         <w:t xml:space="preserve">Figure </w:t>
       </w:r>
       <w:r>
+        <w:rPr>
+          <w:lang w:val="en-GB"/>
+        </w:rPr>
         <w:fldChar w:fldCharType="begin"/>
       </w:r>
       <w:r>
+        <w:rPr>
+          <w:lang w:val="en-GB"/>
+        </w:rPr>
         <w:instrText>SEQ Figure</w:instrText>
       </w:r>
       <w:r>
+        <w:rPr>
+          <w:lang w:val="en-GB"/>
+        </w:rPr>
         <w:fldChar w:fldCharType="separate"/>
       </w:r>
       <w:r>
         <w:rPr>
           <w:noProof/>
+          <w:lang w:val="en-GB"/>
         </w:rPr>
         <w:t>5</w:t>
       </w:r>
       <w:r>
+        <w:rPr>
+          <w:lang w:val="en-GB"/>
+        </w:rPr>
         <w:fldChar w:fldCharType="end"/>
       </w:r>
       <w:r>
+        <w:rPr>
+          <w:lang w:val="en-GB"/>
+        </w:rPr>
         <w:t xml:space="preserve">. </w:t>
       </w:r>
       <w:bookmarkStart w:id="10" w:name="_Toc231919076"/>
       <w:r>
+        <w:rPr>
+          <w:lang w:val="en-GB"/>
+        </w:rPr>
         <w:t>Rating composition by construction age band. The systematic improvement from older to newer cohorts reflects four decades of progressive Building Regulations Part L revisions.</w:t>
       </w:r>
       <w:bookmarkEnd w:id="10"/>
@@ -3916,11 +2837,7 @@
         <w:jc w:val="both"/>
       </w:pPr>
       <w:r>
-        <w:t xml:space="preserve">For the categorical relationships with the rating we use Cramer's V, a chi-square-derived statistic bounded in [0, 1] that controls for table size. The Oxford-relevant ordering is informative: WALLS_DESCRIPTION attains V = 0.407, CONSTRUCTION_AGE_BAND </w:t>
-      </w:r>
-      <w:r>
-        <w:lastRenderedPageBreak/>
-        <w:t>attains V = 0.366, MAIN_FUEL attains V = 0.318, and BUILT_FORM attains V = 0.091. Walls dominate, supporting H2. The boxplot of SAP score by wall construction (Figure 6) makes the magnitude visible: the median gap between solid-brick uninsulated walls and insulated cavity walls is on the order of ten SAP points, larger than the within-group interquartile range, so wall construction explains more variance than any other single physical feature.</w:t>
+        <w:t>For the categorical relationships with the rating, the analysis uses Cramer’s V, a chi-square-derived statistic bounded in [0, 1] that controls for table size. The ordering for Oxford is informative: WALLS_DESCRIPTION reaches V = 0.407, CONSTRUCTION_AGE_BAND reaches V = 0.366, MAIN_FUEL reaches V = 0.318, and BUILT_FORM reaches V = 0.091. Walls dominate, which supports H2. The boxplot of SAP score by wall construction (Figure 6) makes the magnitude visible: the median gap between solid-brick uninsulated walls and insulated cavity walls is on the order of ten SAP points, which is larger than the within-group interquartile range. Wall construction therefore explains more variance than any other single physical feature.</w:t>
       </w:r>
     </w:p>
     <w:p>
@@ -3977,33 +2894,58 @@
         <w:pStyle w:val="Caption"/>
         <w:spacing w:after="200"/>
         <w:jc w:val="center"/>
-      </w:pPr>
-      <w:r>
+        <w:rPr>
+          <w:lang w:val="en-GB"/>
+        </w:rPr>
+      </w:pPr>
+      <w:r>
+        <w:rPr>
+          <w:lang w:val="en-GB"/>
+        </w:rPr>
         <w:t xml:space="preserve">Figure </w:t>
       </w:r>
       <w:r>
+        <w:rPr>
+          <w:lang w:val="en-GB"/>
+        </w:rPr>
         <w:fldChar w:fldCharType="begin"/>
       </w:r>
       <w:r>
+        <w:rPr>
+          <w:lang w:val="en-GB"/>
+        </w:rPr>
         <w:instrText>SEQ Figure</w:instrText>
       </w:r>
       <w:r>
+        <w:rPr>
+          <w:lang w:val="en-GB"/>
+        </w:rPr>
         <w:fldChar w:fldCharType="separate"/>
       </w:r>
       <w:r>
         <w:rPr>
           <w:noProof/>
+          <w:lang w:val="en-GB"/>
         </w:rPr>
         <w:t>6</w:t>
       </w:r>
       <w:r>
+        <w:rPr>
+          <w:lang w:val="en-GB"/>
+        </w:rPr>
         <w:fldChar w:fldCharType="end"/>
       </w:r>
       <w:r>
+        <w:rPr>
+          <w:lang w:val="en-GB"/>
+        </w:rPr>
         <w:t xml:space="preserve">. </w:t>
       </w:r>
       <w:bookmarkStart w:id="11" w:name="_Toc231919077"/>
       <w:r>
+        <w:rPr>
+          <w:lang w:val="en-GB"/>
+        </w:rPr>
         <w:t>SAP score distribution by wall construction. Each box is a different wall description; ordering by median highlights the magnitude of the insulation effect.</w:t>
       </w:r>
       <w:bookmarkEnd w:id="11"/>
@@ -4014,7 +2956,7 @@
         <w:jc w:val="both"/>
       </w:pPr>
       <w:r>
-        <w:t>Glazing has the expected sign but a smaller effect (the Spearman rho between MULTI_GLAZE_PROPORTION and SAP is 0.209), supporting H3. The Spearman matrix among numeric features (Figure 7) flags no pair above an absolute value of 0.85, so all features are retained for tree-based modelling.</w:t>
+        <w:t>Glazing shows the expected sign but a smaller effect, with a Spearman rho between MULTI_GLAZE_PROPORTION and SAP of 0.209, which supports H3. The Spearman matrix among the numeric features (Figure 7) flags no pair above an absolute value of 0.85, so all features are retained for tree-based modelling.</w:t>
       </w:r>
     </w:p>
     <w:p>
@@ -4072,33 +3014,58 @@
         <w:pStyle w:val="Caption"/>
         <w:spacing w:after="200"/>
         <w:jc w:val="center"/>
-      </w:pPr>
-      <w:r>
+        <w:rPr>
+          <w:lang w:val="en-GB"/>
+        </w:rPr>
+      </w:pPr>
+      <w:r>
+        <w:rPr>
+          <w:lang w:val="en-GB"/>
+        </w:rPr>
         <w:t xml:space="preserve">Figure </w:t>
       </w:r>
       <w:r>
+        <w:rPr>
+          <w:lang w:val="en-GB"/>
+        </w:rPr>
         <w:fldChar w:fldCharType="begin"/>
       </w:r>
       <w:r>
+        <w:rPr>
+          <w:lang w:val="en-GB"/>
+        </w:rPr>
         <w:instrText>SEQ Figure</w:instrText>
       </w:r>
       <w:r>
+        <w:rPr>
+          <w:lang w:val="en-GB"/>
+        </w:rPr>
         <w:fldChar w:fldCharType="separate"/>
       </w:r>
       <w:r>
         <w:rPr>
           <w:noProof/>
+          <w:lang w:val="en-GB"/>
         </w:rPr>
         <w:t>7</w:t>
       </w:r>
       <w:r>
+        <w:rPr>
+          <w:lang w:val="en-GB"/>
+        </w:rPr>
         <w:fldChar w:fldCharType="end"/>
       </w:r>
       <w:r>
+        <w:rPr>
+          <w:lang w:val="en-GB"/>
+        </w:rPr>
         <w:t xml:space="preserve">. </w:t>
       </w:r>
       <w:bookmarkStart w:id="12" w:name="_Toc231919078"/>
       <w:r>
+        <w:rPr>
+          <w:lang w:val="en-GB"/>
+        </w:rPr>
         <w:t>Spearman correlation matrix on numeric features.</w:t>
       </w:r>
       <w:bookmarkEnd w:id="12"/>
@@ -4106,9 +3073,15 @@
     <w:p>
       <w:pPr>
         <w:pStyle w:val="Heading2"/>
+        <w:rPr>
+          <w:lang w:val="en-GB"/>
+        </w:rPr>
       </w:pPr>
       <w:bookmarkStart w:id="13" w:name="_Toc231919067"/>
       <w:r>
+        <w:rPr>
+          <w:lang w:val="en-GB"/>
+        </w:rPr>
         <w:t>3.4 Predictive Analytics</w:t>
       </w:r>
       <w:bookmarkEnd w:id="13"/>
@@ -4123,13 +3096,183 @@
           <w:b/>
           <w:bCs/>
         </w:rPr>
-        <w:t xml:space="preserve">Pipeline. </w:t>
-      </w:r>
-      <w:r>
-        <w:t>Categorical missing values are encoded as an explicit level; numerics pass through unimputed and unscaled, since HistGradientBoosting handles NaN natively and is scale-invariant, with binary &lt;COL&gt;_IS_MISSING indicators above 5% missingness. Low-cardinality categoricals are one-hot encoded (min_frequency = 20) and high-cardinality strings ordinal-encoded, inside an sklearn ColumnTransformer fit only on the training fold. Every SAP-derived column (POTENTIAL_*, ENVIRONMENTAL_IMPACT_*, ENERGY_CONSUMPTION_*, CO2</w:t>
-      </w:r>
-      <w:r>
-        <w:t>_EMISSIONS_*, costs, per-element star ratings) is removed before training, since including any re-derives the target. Splitting is group-aware: any UPRN with a post-2022 certificate is held out entirely, stricter than a random split (Sun et al., 2022; Kapoor and Narayanan, 2023). The training frame keeps every pre-2022 certificate per dwelling (54,834 rows) while the published deliverable is deduplicated (49,442), which adds data without leakage.</w:t>
+        <w:t>Pipeline</w:t>
+      </w:r>
+      <w:r>
+        <w:rPr>
+          <w:b/>
+          <w:bCs/>
+        </w:rPr>
+        <w:t>:</w:t>
+      </w:r>
+      <w:r>
+        <w:rPr>
+          <w:b/>
+          <w:bCs/>
+        </w:rPr>
+        <w:t xml:space="preserve"> </w:t>
+      </w:r>
+      <w:r>
+        <w:t>Categorical missing values are encoded as an explicit level. Numerics pass through unimputed and unscaled, since HistGradientBoosting handles NaN natively and is scale-invariant, and any field above 5% missingness also receives a binary &lt;COL&gt;_IS_MISSING indicator. Low-cardinality categoricals are one-hot encoded (min_frequency = 20) and high-cardinality strings are ordinal-encoded, all inside an sklearn ColumnTransformer that is fit only on the training fold. Every SAP-derived column (POTENTIAL_*, ENVIRONMENTAL_IMPACT_*, ENERGY_CONSUMPTION_*, CO2_EMISSIONS_*, costs, and per-element star ratings) is removed before training, because including any one of them would re-derive the target. Splitting is group-aware: any UPRN with a post-2022 certificate is held out in full, which is stricter than a random split (Sun et al., 2022; Kapoor and Narayanan, 2023). The training frame keeps every pre-2022 certificate for each dwelling (54,834 rows), while the published deliverable is deduplicated (49,442). This adds usable data without introducing leakage.</w:t>
+      </w:r>
+    </w:p>
+    <w:p>
+      <w:pPr>
+        <w:spacing w:before="80" w:after="20"/>
+      </w:pPr>
+      <w:r>
+        <w:rPr>
+          <w:i/>
+          <w:sz w:val="19"/>
+        </w:rPr>
+        <w:t>Listing 2. SAP-engine outputs excluded from the feature matrix (src/data.py).</w:t>
+      </w:r>
+    </w:p>
+    <w:p>
+      <w:pPr>
+        <w:keepLines/>
+        <w:pBdr>
+          <w:top w:val="single" w:sz="4" w:space="4" w:color="C9C9C9"/>
+          <w:left w:val="single" w:sz="4" w:space="4" w:color="C9C9C9"/>
+          <w:bottom w:val="single" w:sz="4" w:space="4" w:color="C9C9C9"/>
+          <w:right w:val="single" w:sz="4" w:space="4" w:color="C9C9C9"/>
+        </w:pBdr>
+        <w:shd w:val="clear" w:color="auto" w:fill="F4F4F4"/>
+        <w:spacing w:before="120" w:after="120"/>
+        <w:ind w:left="120" w:right="120"/>
+      </w:pPr>
+      <w:r>
+        <w:rPr>
+          <w:rFonts w:ascii="Consolas" w:hAnsi="Consolas"/>
+          <w:color w:val="1A1A1A"/>
+          <w:sz w:val="17"/>
+        </w:rPr>
+        <w:t># src/data.py - every SAP-engine output is excluded from the feature matrix</w:t>
+      </w:r>
+      <w:r>
+        <w:rPr>
+          <w:rFonts w:ascii="Consolas" w:hAnsi="Consolas"/>
+          <w:color w:val="1A1A1A"/>
+          <w:sz w:val="17"/>
+        </w:rPr>
+        <w:br/>
+        <w:t>#               (any one of them would re-derive the target)</w:t>
+      </w:r>
+      <w:r>
+        <w:rPr>
+          <w:rFonts w:ascii="Consolas" w:hAnsi="Consolas"/>
+          <w:color w:val="1A1A1A"/>
+          <w:sz w:val="17"/>
+        </w:rPr>
+        <w:br/>
+        <w:t>LEAKAGE_COLS     = ("CURRENT_ENERGY_EFFICIENCY", "POTENTIAL_ENERGY_RATING",</w:t>
+      </w:r>
+      <w:r>
+        <w:rPr>
+          <w:rFonts w:ascii="Consolas" w:hAnsi="Consolas"/>
+          <w:color w:val="1A1A1A"/>
+          <w:sz w:val="17"/>
+        </w:rPr>
+        <w:br/>
+        <w:t xml:space="preserve">                    "CO2_EMISSIONS_CURRENT", "HEATING_COST_CURRENT", ...)   # 18 SAP outputs</w:t>
+      </w:r>
+      <w:r>
+        <w:rPr>
+          <w:rFonts w:ascii="Consolas" w:hAnsi="Consolas"/>
+          <w:color w:val="1A1A1A"/>
+          <w:sz w:val="17"/>
+        </w:rPr>
+        <w:br/>
+        <w:t>ELEMENT_EFF_COLS = ("WALLS_ENERGY_EFF", "ROOF_ENERGY_EFF", ...)            # 18 element ratings</w:t>
+      </w:r>
+      <w:r>
+        <w:rPr>
+          <w:rFonts w:ascii="Consolas" w:hAnsi="Consolas"/>
+          <w:color w:val="1A1A1A"/>
+          <w:sz w:val="17"/>
+        </w:rPr>
+        <w:br/>
+        <w:t>X, y_class, y_reg = to_model_matrix(clean)   # drops LEAKAGE_COLS + ELEMENT_EFF_COLS + PII</w:t>
+      </w:r>
+    </w:p>
+    <w:p>
+      <w:pPr>
+        <w:spacing w:before="80" w:after="20"/>
+      </w:pPr>
+      <w:r>
+        <w:rPr>
+          <w:i/>
+          <w:sz w:val="19"/>
+        </w:rPr>
+        <w:lastRenderedPageBreak/>
+        <w:t>Listing 3. Group-aware temporal split that prevents dwelling-level leakage (src/data.py).</w:t>
+      </w:r>
+    </w:p>
+    <w:p>
+      <w:pPr>
+        <w:keepLines/>
+        <w:pBdr>
+          <w:top w:val="single" w:sz="4" w:space="4" w:color="C9C9C9"/>
+          <w:left w:val="single" w:sz="4" w:space="4" w:color="C9C9C9"/>
+          <w:bottom w:val="single" w:sz="4" w:space="4" w:color="C9C9C9"/>
+          <w:right w:val="single" w:sz="4" w:space="4" w:color="C9C9C9"/>
+        </w:pBdr>
+        <w:shd w:val="clear" w:color="auto" w:fill="F4F4F4"/>
+        <w:spacing w:before="120" w:after="120"/>
+        <w:ind w:left="120" w:right="120"/>
+      </w:pPr>
+      <w:r>
+        <w:rPr>
+          <w:rFonts w:ascii="Consolas" w:hAnsi="Consolas"/>
+          <w:color w:val="1A1A1A"/>
+          <w:sz w:val="17"/>
+        </w:rPr>
+        <w:t># src/data.py - group-aware temporal split: a dwelling never spans train and test</w:t>
+      </w:r>
+      <w:r>
+        <w:rPr>
+          <w:rFonts w:ascii="Consolas" w:hAnsi="Consolas"/>
+          <w:color w:val="1A1A1A"/>
+          <w:sz w:val="17"/>
+        </w:rPr>
+        <w:br/>
+        <w:t>latest    = keyed.groupby("UPRN")["_date_norm"].transform("max")</w:t>
+      </w:r>
+      <w:r>
+        <w:rPr>
+          <w:rFonts w:ascii="Consolas" w:hAnsi="Consolas"/>
+          <w:color w:val="1A1A1A"/>
+          <w:sz w:val="17"/>
+        </w:rPr>
+        <w:br/>
+        <w:t>train_idx = keyed.index[latest &lt;= cutoff_ts]          # all certs of pre-cutoff UPRNs</w:t>
+      </w:r>
+      <w:r>
+        <w:rPr>
+          <w:rFonts w:ascii="Consolas" w:hAnsi="Consolas"/>
+          <w:color w:val="1A1A1A"/>
+          <w:sz w:val="17"/>
+        </w:rPr>
+        <w:br/>
+        <w:t>post      = keyed[latest &gt; cutoff_ts]                 # UPRNs with any post-cutoff cert</w:t>
+      </w:r>
+      <w:r>
+        <w:rPr>
+          <w:rFonts w:ascii="Consolas" w:hAnsi="Consolas"/>
+          <w:color w:val="1A1A1A"/>
+          <w:sz w:val="17"/>
+        </w:rPr>
+        <w:br/>
+        <w:t>test_idx  = (post.sort_values("_date_norm")</w:t>
+      </w:r>
+      <w:r>
+        <w:rPr>
+          <w:rFonts w:ascii="Consolas" w:hAnsi="Consolas"/>
+          <w:color w:val="1A1A1A"/>
+          <w:sz w:val="17"/>
+        </w:rPr>
+        <w:br/>
+        <w:t xml:space="preserve">                 .drop_duplicates("UPRN", keep="last").index)   # only their latest cert</w:t>
       </w:r>
     </w:p>
     <w:p>
@@ -4142,20 +3285,155 @@
           <w:b/>
           <w:bCs/>
         </w:rPr>
-        <w:t xml:space="preserve">Models. </w:t>
-      </w:r>
-      <w:r>
-        <w:t>Baselines fix the floors: the stratified dummy gives QWK near 0, age-only logistic regression reaches 0.33, and full-feature logistic regression reaches 0.43. Three tree families are compared on the same 5-fold GroupKFold (HistGradientBoosting, LightGBM with expected-value decoding, and Random Forest), alongside a TensorFlow CORN ordinal neural network (Cao et al., 2020; hold-out QWK 0.659), which confirms the tree family's edge on tabular data (Grinsztajn et al., 2022). All features are pure physical fabri</w:t>
-      </w:r>
-      <w:r>
-        <w:t xml:space="preserve">c, so the 0.700 accuracy reflects a leak-free problem. The champion is the regression-to-band approach: a </w:t>
-      </w:r>
-      <w:r>
-        <w:lastRenderedPageBreak/>
-        <w:t xml:space="preserve">HistGradientBoostingRegressor on the continuous SAP score mapped to a band through the official DLUHC thresholds. Because EPC bands are a deterministic discretisation of an observable score, regression then threshold is consistent (Pedregosa et al., 2017) and more principled than a discrete ordinal classifier (Cao et al., 2020). The champion is wrapped in SapStratifiedRegressor: a unified regressor for </w:t>
-      </w:r>
-      <w:r>
-        <w:t>RdSAP rows plus a SAP-only specialist for REPORT_TYPE 101.</w:t>
+        <w:t>Models</w:t>
+      </w:r>
+      <w:r>
+        <w:rPr>
+          <w:b/>
+          <w:bCs/>
+        </w:rPr>
+        <w:t>:</w:t>
+      </w:r>
+      <w:r>
+        <w:rPr>
+          <w:b/>
+          <w:bCs/>
+        </w:rPr>
+        <w:t xml:space="preserve"> </w:t>
+      </w:r>
+      <w:r>
+        <w:t>Baselines establish the performance floors: the stratified dummy gives a QWK near 0, age-only logistic regression reaches 0.33, and full-feature logistic regression reaches 0.43. Three tree families are then compared on the same 5-fold GroupKFold (HistGradientBoosting, LightGBM with expected-value decoding, and Random Forest), alongside a TensorFlow CORN ordinal neural network (Cao et al., 2020), which reaches a hold-out QWK of 0.659 and confirms the tree family’s edge on tabular data (Grinsztajn et al., 2022). Because all features are pure physical fabric, the resulting 0.700 accuracy reflects a genuinely leak-free problem. The champion is the regression-to-band approach: a HistGradientBoostingRegressor that predicts the continuous SAP score and then maps that score to a band through the official DLUHC thresholds. Because EPC bands are a deterministic discretisation of an observable score, predicting the score and then thresholding it is statistically consistent (Pedregosa et al., 2017) and more principled than fitting a discrete ordinal classifier directly (Cao et al., 2020). The champion is wrapped in SapStratifiedRegressor, which combines a unified regressor for RdSAP rows with a SAP-only specialist for REPORT_TYPE 101.</w:t>
+      </w:r>
+    </w:p>
+    <w:p>
+      <w:pPr>
+        <w:spacing w:before="80" w:after="20"/>
+      </w:pPr>
+      <w:r>
+        <w:rPr>
+          <w:i/>
+          <w:sz w:val="19"/>
+        </w:rPr>
+        <w:t>Listing 4. The regression-to-band champion and its hybrid routing (src/models.py).</w:t>
+      </w:r>
+    </w:p>
+    <w:p>
+      <w:pPr>
+        <w:keepLines/>
+        <w:pBdr>
+          <w:top w:val="single" w:sz="4" w:space="4" w:color="C9C9C9"/>
+          <w:left w:val="single" w:sz="4" w:space="4" w:color="C9C9C9"/>
+          <w:bottom w:val="single" w:sz="4" w:space="4" w:color="C9C9C9"/>
+          <w:right w:val="single" w:sz="4" w:space="4" w:color="C9C9C9"/>
+        </w:pBdr>
+        <w:shd w:val="clear" w:color="auto" w:fill="F4F4F4"/>
+        <w:spacing w:before="120" w:after="120"/>
+        <w:ind w:left="120" w:right="120"/>
+      </w:pPr>
+      <w:r>
+        <w:rPr>
+          <w:rFonts w:ascii="Consolas" w:hAnsi="Consolas"/>
+          <w:color w:val="1A1A1A"/>
+          <w:sz w:val="17"/>
+        </w:rPr>
+        <w:t># src/models.py - regression-to-band champion with SAP-cohort routing</w:t>
+      </w:r>
+      <w:r>
+        <w:rPr>
+          <w:rFonts w:ascii="Consolas" w:hAnsi="Consolas"/>
+          <w:color w:val="1A1A1A"/>
+          <w:sz w:val="17"/>
+        </w:rPr>
+        <w:br/>
+        <w:t>SAP_BAND_THRESHOLDS = ((92,"A"),(81,"B"),(69,"C"),(55,"D"),(39,"E"),(21,"F"),(0,"G"))</w:t>
+      </w:r>
+      <w:r>
+        <w:rPr>
+          <w:rFonts w:ascii="Consolas" w:hAnsi="Consolas"/>
+          <w:color w:val="1A1A1A"/>
+          <w:sz w:val="17"/>
+        </w:rPr>
+        <w:br/>
+      </w:r>
+      <w:r>
+        <w:rPr>
+          <w:rFonts w:ascii="Consolas" w:hAnsi="Consolas"/>
+          <w:color w:val="1A1A1A"/>
+          <w:sz w:val="17"/>
+        </w:rPr>
+        <w:br/>
+        <w:t>class SapStratifiedRegressor:</w:t>
+      </w:r>
+      <w:r>
+        <w:rPr>
+          <w:rFonts w:ascii="Consolas" w:hAnsi="Consolas"/>
+          <w:color w:val="1A1A1A"/>
+          <w:sz w:val="17"/>
+        </w:rPr>
+        <w:br/>
+        <w:t xml:space="preserve">    def predict_score(self, X, report_type):</w:t>
+      </w:r>
+      <w:r>
+        <w:rPr>
+          <w:rFonts w:ascii="Consolas" w:hAnsi="Consolas"/>
+          <w:color w:val="1A1A1A"/>
+          <w:sz w:val="17"/>
+        </w:rPr>
+        <w:br/>
+        <w:t xml:space="preserve">        score = self.unified.predict(X)                 # RdSAP path (dominant cohort)</w:t>
+      </w:r>
+      <w:r>
+        <w:rPr>
+          <w:rFonts w:ascii="Consolas" w:hAnsi="Consolas"/>
+          <w:color w:val="1A1A1A"/>
+          <w:sz w:val="17"/>
+        </w:rPr>
+        <w:br/>
+        <w:t xml:space="preserve">        sap = (report_type == 101).values               # SAP-only cohort</w:t>
+      </w:r>
+      <w:r>
+        <w:rPr>
+          <w:rFonts w:ascii="Consolas" w:hAnsi="Consolas"/>
+          <w:color w:val="1A1A1A"/>
+          <w:sz w:val="17"/>
+        </w:rPr>
+        <w:br/>
+        <w:t xml:space="preserve">        score[sap] = self.sap_only.predict(X.loc[sap])  # specialist head</w:t>
+      </w:r>
+      <w:r>
+        <w:rPr>
+          <w:rFonts w:ascii="Consolas" w:hAnsi="Consolas"/>
+          <w:color w:val="1A1A1A"/>
+          <w:sz w:val="17"/>
+        </w:rPr>
+        <w:br/>
+        <w:t xml:space="preserve">        return np.clip(score, 1.0, 100.0)               # SAP is bounded [1, 100]</w:t>
+      </w:r>
+      <w:r>
+        <w:rPr>
+          <w:rFonts w:ascii="Consolas" w:hAnsi="Consolas"/>
+          <w:color w:val="1A1A1A"/>
+          <w:sz w:val="17"/>
+        </w:rPr>
+        <w:br/>
+        <w:t xml:space="preserve">    def predict_band(self, X, re</w:t>
+      </w:r>
+      <w:r>
+        <w:rPr>
+          <w:rFonts w:ascii="Consolas" w:hAnsi="Consolas"/>
+          <w:color w:val="1A1A1A"/>
+          <w:sz w:val="17"/>
+        </w:rPr>
+        <w:t>port_type):</w:t>
+      </w:r>
+      <w:r>
+        <w:rPr>
+          <w:rFonts w:ascii="Consolas" w:hAnsi="Consolas"/>
+          <w:color w:val="1A1A1A"/>
+          <w:sz w:val="17"/>
+        </w:rPr>
+        <w:br/>
+        <w:t xml:space="preserve">        return sap_score_to_band(self.predict_score(X, report_type))</w:t>
       </w:r>
     </w:p>
     <w:p>
@@ -4168,13 +3446,24 @@
           <w:b/>
           <w:bCs/>
         </w:rPr>
-        <w:t xml:space="preserve">Tuning and selection. </w:t>
-      </w:r>
-      <w:r>
-        <w:t>Optuna TPE (Akiba et al., 2019) explored the LightGBM space, while the regression head uses ablation-validated defaults. Selection privileged temporal-holdout QWK: LightGBM with expected-value decoding wins CV (0.8672) but loses the hold-out, whereas the regression-to-band champion wins it (0.7696 hybrid-routed against 0.7548) at a marginally lower CV (0.8640) and a four-times-faster fit. The gap between 0.86 on CV and 0.77 on the hold-out is temporal distribution shift rather than overfitting (multi-seed s</w:t>
-      </w:r>
-      <w:r>
-        <w:t>pread plus or minus 0.0019, leakage-free GroupKFold). The decision is recorded in reports/champion_artefact.json with an sha256-pinned pickle.</w:t>
+        <w:t>Tuning and selection</w:t>
+      </w:r>
+      <w:r>
+        <w:rPr>
+          <w:b/>
+          <w:bCs/>
+        </w:rPr>
+        <w:t>:</w:t>
+      </w:r>
+      <w:r>
+        <w:rPr>
+          <w:b/>
+          <w:bCs/>
+        </w:rPr>
+        <w:t xml:space="preserve"> </w:t>
+      </w:r>
+      <w:r>
+        <w:t>Optuna TPE (Akiba et al., 2019) explored the LightGBM search space, while the regression head uses ablation-validated defaults. Model selection gave priority to temporal-holdout QWK. LightGBM with expected-value decoding wins on CV (0.8672) but loses on the hold-out, whereas the regression-to-band champion wins the hold-out (0.7696 when hybrid-routed, against 0.7548) at a marginally lower CV score (0.8640) and with a fit that is four times faster. The gap between 0.86 on CV and 0.77 on the hold-out reflects temporal distribution shift rather than overfitting, as confirmed by a multi-seed spread of plus or minus 0.0019 under leakage-free GroupKFold. The final decision is recorded in reports/champion_artefact.json, alongside an sha256-pinned pickle.</w:t>
       </w:r>
     </w:p>
     <w:p>
@@ -4187,13 +3476,28 @@
           <w:b/>
           <w:bCs/>
         </w:rPr>
-        <w:t xml:space="preserve">Headline hold-out results. </w:t>
-      </w:r>
-      <w:r>
-        <w:t>The Quadratic Weighted Kappa is 0.7696, 95% CI 0.7600 to 0.7780 (1,000 bootstraps); accuracy is 0.700, balanced accuracy 0.584, and macro-F1 0.550. The multi-seed QWK is 0.7714 plus or minus 0.0019, and the runner-up (LightGBM, 0.7548) falls below the champion's CI lower bound. MAE in band units (0.316) and linear-weighted kappa (0.652) accompany QWK (Warrens, 2012). The regression head achieves R2 = 0.679, RMSE = 5.78, and a score MAE of 4.05, within the roughly five-point inter-assessor noise floor (Few e</w:t>
-      </w:r>
-      <w:r>
-        <w:t>t al., 2023; Hardy and Glew, 2019). It places 97.7% of predictions within 15 SAP points (92.5% within 10), in line with the ONS Data Science Campus (2021) indicative 93%. Errors are asymmetric, with a 2.96:1 ratio of under-prediction to over-prediction; 70.0% are correct and 0.07% are off by three or more bands. Performance is uneven: per-band F1 is 0.78 on C but 0.45, 0.35 and 0.27 on the sparse E, F and A bands, the extreme bands policy targets, which Section 4 mitigates through the confidence proxy.</w:t>
+        <w:t>Headline hold-out results</w:t>
+      </w:r>
+      <w:r>
+        <w:rPr>
+          <w:b/>
+          <w:bCs/>
+        </w:rPr>
+        <w:t>:</w:t>
+      </w:r>
+      <w:r>
+        <w:rPr>
+          <w:b/>
+          <w:bCs/>
+        </w:rPr>
+        <w:t xml:space="preserve"> </w:t>
+      </w:r>
+      <w:r>
+        <w:t xml:space="preserve">The Quadratic Weighted Kappa is 0.7696, with a 95% CI of 0.7600 to 0.7780 from 1,000 bootstraps; accuracy is 0.700, balanced accuracy is 0.584, and macro-F1 is 0.550. The multi-seed QWK is 0.7714 plus or minus 0.0019, and the runner-up (LightGBM at 0.7548) falls below the lower bound of the champion’s confidence interval. MAE in band units (0.316) and linear-weighted kappa (0.652) are reported alongside QWK (Warrens, 2012). </w:t>
+      </w:r>
+      <w:r>
+        <w:lastRenderedPageBreak/>
+        <w:t>The regression head achieves R2 = 0.679, RMSE = 5.78, and a score MAE of 4.05, which sits within the roughly five-point inter-assessor noise floor (Few et al., 2023; Hardy and Glew, 2019). It places 97.7% of predictions within 15 SAP points and 92.5% within 10, in line with the indicative 93% reported by the ONS Data Science Campus (2021). The errors are asymmetric, with a 2.96:1 ratio of under-prediction to over-prediction; 70.0% of predictions are exactly correct and only 0.07% are off by three or more bands. Performance is uneven across bands: per-band F1 is 0.78 on C but falls to 0.45, 0.35 and 0.27 on the sparse E, F and A bands. These extreme bands are precisely the ones policy cares about, and Section 4 mitigates the weakness through the confidence proxy.</w:t>
       </w:r>
     </w:p>
     <w:p>
@@ -4205,7 +3509,6 @@
         <w:rPr>
           <w:noProof/>
         </w:rPr>
-        <w:lastRenderedPageBreak/>
         <w:drawing>
           <wp:inline distT="0" distB="0" distL="0" distR="0" wp14:anchorId="4C9B3692" wp14:editId="798954C1">
             <wp:extent cx="5029200" cy="4467225"/>
@@ -4251,33 +3554,58 @@
         <w:pStyle w:val="Caption"/>
         <w:spacing w:after="200"/>
         <w:jc w:val="center"/>
-      </w:pPr>
-      <w:r>
+        <w:rPr>
+          <w:lang w:val="en-GB"/>
+        </w:rPr>
+      </w:pPr>
+      <w:r>
+        <w:rPr>
+          <w:lang w:val="en-GB"/>
+        </w:rPr>
         <w:t xml:space="preserve">Figure </w:t>
       </w:r>
       <w:r>
+        <w:rPr>
+          <w:lang w:val="en-GB"/>
+        </w:rPr>
         <w:fldChar w:fldCharType="begin"/>
       </w:r>
       <w:r>
+        <w:rPr>
+          <w:lang w:val="en-GB"/>
+        </w:rPr>
         <w:instrText>SEQ Figure</w:instrText>
       </w:r>
       <w:r>
+        <w:rPr>
+          <w:lang w:val="en-GB"/>
+        </w:rPr>
         <w:fldChar w:fldCharType="separate"/>
       </w:r>
       <w:r>
         <w:rPr>
           <w:noProof/>
+          <w:lang w:val="en-GB"/>
         </w:rPr>
         <w:t>8</w:t>
       </w:r>
       <w:r>
+        <w:rPr>
+          <w:lang w:val="en-GB"/>
+        </w:rPr>
         <w:fldChar w:fldCharType="end"/>
       </w:r>
       <w:r>
+        <w:rPr>
+          <w:lang w:val="en-GB"/>
+        </w:rPr>
         <w:t xml:space="preserve">. </w:t>
       </w:r>
       <w:bookmarkStart w:id="14" w:name="_Toc231919079"/>
       <w:r>
+        <w:rPr>
+          <w:lang w:val="en-GB"/>
+        </w:rPr>
         <w:t>Confusion matrix on the temporal hold-out test set. Off-diagonal mass is concentrated on the one-band neighbours of the true label, consistent with an ordinal model.</w:t>
       </w:r>
       <w:bookmarkEnd w:id="14"/>
@@ -4288,10 +3616,7 @@
         <w:jc w:val="both"/>
       </w:pPr>
       <w:r>
-        <w:t>Feature importance is reported with two complementary methods. Permutation importance (Figure 9), scored on hybrid-routed band QWK, is model-agnostic and free of the cardinality bias that distorts impurity-based importance (Strobl et al., 2007). SHAP (Figure 10; Lundberg and Lee, 2017) provides per-instance attributions on the unified regressor in SAP-score units. Both rank windows, construction age and main fuel among the dominant drivers, with main heating and wall construction close behind; the agreement</w:t>
-      </w:r>
-      <w:r>
-        <w:t xml:space="preserve"> between the model-agnostic and model-specific explainers indicates the rankings reflect genuine signal.</w:t>
+        <w:t>Feature importance is reported using two complementary methods. Permutation importance (Figure 9), scored on the hybrid-routed band QWK, is model-agnostic and avoids the cardinality bias that distorts impurity-based importance (Strobl et al., 2007). SHAP (Figure 10; Lundberg and Lee, 2017) provides per-instance attributions on the unified regressor, expressed in SAP-score units. Both methods rank windows, construction age and main fuel among the dominant drivers, with main heating and wall construction close behind. The agreement between a model-agnostic and a model-specific explainer indicates that these rankings reflect genuine signal.</w:t>
       </w:r>
     </w:p>
     <w:p>
@@ -4349,33 +3674,58 @@
         <w:pStyle w:val="Caption"/>
         <w:spacing w:after="200"/>
         <w:jc w:val="center"/>
-      </w:pPr>
-      <w:r>
+        <w:rPr>
+          <w:lang w:val="en-GB"/>
+        </w:rPr>
+      </w:pPr>
+      <w:r>
+        <w:rPr>
+          <w:lang w:val="en-GB"/>
+        </w:rPr>
         <w:t xml:space="preserve">Figure </w:t>
       </w:r>
       <w:r>
+        <w:rPr>
+          <w:lang w:val="en-GB"/>
+        </w:rPr>
         <w:fldChar w:fldCharType="begin"/>
       </w:r>
       <w:r>
+        <w:rPr>
+          <w:lang w:val="en-GB"/>
+        </w:rPr>
         <w:instrText>SEQ Figure</w:instrText>
       </w:r>
       <w:r>
+        <w:rPr>
+          <w:lang w:val="en-GB"/>
+        </w:rPr>
         <w:fldChar w:fldCharType="separate"/>
       </w:r>
       <w:r>
         <w:rPr>
           <w:noProof/>
+          <w:lang w:val="en-GB"/>
         </w:rPr>
         <w:t>9</w:t>
       </w:r>
       <w:r>
+        <w:rPr>
+          <w:lang w:val="en-GB"/>
+        </w:rPr>
         <w:fldChar w:fldCharType="end"/>
       </w:r>
       <w:r>
+        <w:rPr>
+          <w:lang w:val="en-GB"/>
+        </w:rPr>
         <w:t xml:space="preserve">. </w:t>
       </w:r>
       <w:bookmarkStart w:id="15" w:name="_Toc231919080"/>
       <w:r>
+        <w:rPr>
+          <w:lang w:val="en-GB"/>
+        </w:rPr>
         <w:t>Top features by permutation importance on the hold-out set.</w:t>
       </w:r>
       <w:bookmarkEnd w:id="15"/>
@@ -4434,33 +3784,58 @@
         <w:pStyle w:val="Caption"/>
         <w:spacing w:after="200"/>
         <w:jc w:val="center"/>
-      </w:pPr>
-      <w:r>
+        <w:rPr>
+          <w:lang w:val="en-GB"/>
+        </w:rPr>
+      </w:pPr>
+      <w:r>
+        <w:rPr>
+          <w:lang w:val="en-GB"/>
+        </w:rPr>
         <w:t xml:space="preserve">Figure </w:t>
       </w:r>
       <w:r>
+        <w:rPr>
+          <w:lang w:val="en-GB"/>
+        </w:rPr>
         <w:fldChar w:fldCharType="begin"/>
       </w:r>
       <w:r>
+        <w:rPr>
+          <w:lang w:val="en-GB"/>
+        </w:rPr>
         <w:instrText>SEQ Figure</w:instrText>
       </w:r>
       <w:r>
+        <w:rPr>
+          <w:lang w:val="en-GB"/>
+        </w:rPr>
         <w:fldChar w:fldCharType="separate"/>
       </w:r>
       <w:r>
         <w:rPr>
           <w:noProof/>
+          <w:lang w:val="en-GB"/>
         </w:rPr>
         <w:t>10</w:t>
       </w:r>
       <w:r>
+        <w:rPr>
+          <w:lang w:val="en-GB"/>
+        </w:rPr>
         <w:fldChar w:fldCharType="end"/>
       </w:r>
       <w:r>
+        <w:rPr>
+          <w:lang w:val="en-GB"/>
+        </w:rPr>
         <w:t xml:space="preserve">. </w:t>
       </w:r>
       <w:bookmarkStart w:id="16" w:name="_Toc231919081"/>
       <w:r>
+        <w:rPr>
+          <w:lang w:val="en-GB"/>
+        </w:rPr>
         <w:t>SHAP summary plot. Each point is one test-set dwelling; horizontal position is the SHAP value (signed contribution to the predicted score) and colour is the feature value (red is high).</w:t>
       </w:r>
       <w:bookmarkEnd w:id="16"/>
@@ -4475,10 +3850,24 @@
           <w:b/>
           <w:bCs/>
         </w:rPr>
-        <w:t xml:space="preserve">Calibration. </w:t>
-      </w:r>
-      <w:r>
-        <w:t>For a regression head the calibration analogue is the score-reliability curve (Figure 11): per-decile mean predicted against observed SAP score. A slope of 0.79 and an intercept of +16 indicate mild compression toward the mean. Band predictions are robust to such uniform shifts because the DLUHC thresholds are wide, but downstream uses requiring unbiased point scores can post-process with isotonic regression.</w:t>
+        <w:t>Calibration</w:t>
+      </w:r>
+      <w:r>
+        <w:rPr>
+          <w:b/>
+          <w:bCs/>
+        </w:rPr>
+        <w:t>:</w:t>
+      </w:r>
+      <w:r>
+        <w:rPr>
+          <w:b/>
+          <w:bCs/>
+        </w:rPr>
+        <w:t xml:space="preserve"> </w:t>
+      </w:r>
+      <w:r>
+        <w:t>For a regression head, the calibration analogue is the score-reliability curve (Figure 11), which plots the per-decile mean predicted score against the observed SAP score. A slope of 0.79 and an intercept of +16 indicate mild compression toward the mean. Band predictions stay robust to uniform shifts of this kind, because the DLUHC thresholds are wide. Downstream uses that require unbiased point scores can correct the compression by post-processing with isotonic regression.</w:t>
       </w:r>
     </w:p>
     <w:p>
@@ -4536,33 +3925,58 @@
         <w:pStyle w:val="Caption"/>
         <w:spacing w:after="200"/>
         <w:jc w:val="center"/>
-      </w:pPr>
-      <w:r>
+        <w:rPr>
+          <w:lang w:val="en-GB"/>
+        </w:rPr>
+      </w:pPr>
+      <w:r>
+        <w:rPr>
+          <w:lang w:val="en-GB"/>
+        </w:rPr>
         <w:t xml:space="preserve">Figure </w:t>
       </w:r>
       <w:r>
+        <w:rPr>
+          <w:lang w:val="en-GB"/>
+        </w:rPr>
         <w:fldChar w:fldCharType="begin"/>
       </w:r>
       <w:r>
+        <w:rPr>
+          <w:lang w:val="en-GB"/>
+        </w:rPr>
         <w:instrText>SEQ Figure</w:instrText>
       </w:r>
       <w:r>
+        <w:rPr>
+          <w:lang w:val="en-GB"/>
+        </w:rPr>
         <w:fldChar w:fldCharType="separate"/>
       </w:r>
       <w:r>
         <w:rPr>
           <w:noProof/>
+          <w:lang w:val="en-GB"/>
         </w:rPr>
         <w:t>11</w:t>
       </w:r>
       <w:r>
+        <w:rPr>
+          <w:lang w:val="en-GB"/>
+        </w:rPr>
         <w:fldChar w:fldCharType="end"/>
       </w:r>
       <w:r>
+        <w:rPr>
+          <w:lang w:val="en-GB"/>
+        </w:rPr>
         <w:t xml:space="preserve">. </w:t>
       </w:r>
       <w:bookmarkStart w:id="17" w:name="_Toc231919082"/>
       <w:r>
+        <w:rPr>
+          <w:lang w:val="en-GB"/>
+        </w:rPr>
         <w:t>SAP-score reliability curve: per-decile mean predicted score against per-decile mean observed score on the temporal hold-out. The slope of 0.79 and intercept of +16 indicate mild compression toward the mean.</w:t>
       </w:r>
       <w:bookmarkEnd w:id="17"/>
@@ -4577,18 +3991,58 @@
           <w:b/>
           <w:bCs/>
         </w:rPr>
-        <w:t xml:space="preserve">Fairness and confidence. </w:t>
-      </w:r>
-      <w:r>
-        <w:t>Per-REPORT_TYPE breakdowns (reports/champion_robustness.json) show an RdSAP MAE in band units of 0.31 against SAP at 0.34; the hybrid closes +0.061 QWK of the gap, but the SAP cohort retains an irreducibly small absolute count of minority bands. A confidence proxy (distance from the band boundary) is validated by quartiling the hold-out: QWK rises monotonically from 0.65 in the bottom quartile to 0.85 in the top, a +0.19 gap that confirms the proxy separates reliable from unreliable predictions.</w:t>
+        <w:t>Fairness</w:t>
+      </w:r>
+      <w:r>
+        <w:rPr>
+          <w:b/>
+          <w:bCs/>
+        </w:rPr>
+        <w:t xml:space="preserve"> </w:t>
+      </w:r>
+      <w:r>
+        <w:rPr>
+          <w:b/>
+          <w:bCs/>
+        </w:rPr>
+        <w:t>and confidence</w:t>
+      </w:r>
+      <w:r>
+        <w:rPr>
+          <w:b/>
+          <w:bCs/>
+        </w:rPr>
+        <w:t>:</w:t>
+      </w:r>
+      <w:r>
+        <w:rPr>
+          <w:b/>
+          <w:bCs/>
+        </w:rPr>
+        <w:t xml:space="preserve"> </w:t>
+      </w:r>
+      <w:r>
+        <w:t xml:space="preserve">Per-REPORT_TYPE breakdowns (reports/champion_robustness.json) show an RdSAP MAE in band units of 0.31, against 0.34 for SAP. The hybrid design closes +0.061 QWK of this gap, although the SAP cohort still retains an irreducibly small absolute count of minority bands. A confidence proxy, defined as the distance from the band boundary, is validated by quartiling the hold-out: QWK rises monotonically from 0.65 in the bottom quartile to 0.85 in the top. </w:t>
+      </w:r>
+      <w:r>
+        <w:t>These +0.19 gaps</w:t>
+      </w:r>
+      <w:r>
+        <w:t xml:space="preserve"> confirms that the proxy separates reliable predictions from unreliable ones.</w:t>
       </w:r>
     </w:p>
     <w:p>
       <w:pPr>
         <w:pStyle w:val="Heading2"/>
+        <w:rPr>
+          <w:lang w:val="en-GB"/>
+        </w:rPr>
       </w:pPr>
       <w:bookmarkStart w:id="18" w:name="_Toc231919068"/>
       <w:r>
+        <w:rPr>
+          <w:lang w:val="en-GB"/>
+        </w:rPr>
         <w:t>3.5 Unsupervised Segmentation and Retrofit Recommender</w:t>
       </w:r>
       <w:bookmarkEnd w:id="18"/>
@@ -4599,14 +4053,11 @@
         <w:jc w:val="both"/>
       </w:pPr>
       <w:r>
-        <w:t>Two unsupervised methods extend the analysis. K-Prototypes (Huang, 1998) segments the mixed numeric and categorical stock on the same leak-free features; silhouette and Davies-Bouldin both select k = 3 (a silhouette of 0.24 indicates soft, interpretable archetypes rather than crisp clusters; Figure 12). Three segments emerge: pre-1914 solid-brick houses (mean SAP 56, band D, the retrofit priority), a mid-century cavity-wall majority (48%, band D), and newer cavity flats (band C). A hybrid recommender (Figur</w:t>
-      </w:r>
-      <w:r>
-        <w:t xml:space="preserve">e 13) mines recommendations.csv: Apriori rules (Agrawal and Srikant, 1994) show single-glazing, draught-proofing and wall insulation co-occurring far above chance (lift 8.9), and a content-based cosine k-NN predicts </w:t>
+        <w:t xml:space="preserve">Two unsupervised methods extend the analysis. K-Prototypes (Huang, 1998) segments the mixed numeric and categorical stock on the same leak-free features. Both the silhouette and Davies-Bouldin criteria select k = 3, and a silhouette of 0.24 points to soft, interpretable archetypes rather than crisp clusters (Figure 12). Three segments emerge: pre-1914 solid-brick houses (mean SAP 56, band D), which form the retrofit priority; a mid-century cavity-wall majority (48% of the stock, band D); and newer cavity flats (band C). A hybrid recommender (Figure 13) then mines recommendations.csv. Apriori rules (Agrawal and Srikant, 1994) show single-glazing, draught-proofing and wall insulation co-occurring far above chance (lift 8.9), </w:t>
       </w:r>
       <w:r>
         <w:lastRenderedPageBreak/>
-        <w:t>measures from fabric-similar neighbours at a hit-rate of 0.97, beating a popularity baseline by +0.08 precision@5. The cheapest universal measure is low-energy lighting (25 pounds).</w:t>
+        <w:t>and a content-based cosine k-NN predicts measures from fabric-similar neighbours at a hit-rate of 0.97, beating a popularity baseline by +0.08 on precision@5. The cheapest universal measure is low-energy lighting, at 25 pounds.</w:t>
       </w:r>
     </w:p>
     <w:p>
@@ -4663,33 +4114,58 @@
         <w:pStyle w:val="Caption"/>
         <w:spacing w:after="200"/>
         <w:jc w:val="center"/>
-      </w:pPr>
-      <w:r>
+        <w:rPr>
+          <w:lang w:val="en-GB"/>
+        </w:rPr>
+      </w:pPr>
+      <w:r>
+        <w:rPr>
+          <w:lang w:val="en-GB"/>
+        </w:rPr>
         <w:t xml:space="preserve">Figure </w:t>
       </w:r>
       <w:r>
+        <w:rPr>
+          <w:lang w:val="en-GB"/>
+        </w:rPr>
         <w:fldChar w:fldCharType="begin"/>
       </w:r>
       <w:r>
+        <w:rPr>
+          <w:lang w:val="en-GB"/>
+        </w:rPr>
         <w:instrText>SEQ Figure</w:instrText>
       </w:r>
       <w:r>
+        <w:rPr>
+          <w:lang w:val="en-GB"/>
+        </w:rPr>
         <w:fldChar w:fldCharType="separate"/>
       </w:r>
       <w:r>
         <w:rPr>
           <w:noProof/>
+          <w:lang w:val="en-GB"/>
         </w:rPr>
         <w:t>12</w:t>
       </w:r>
       <w:r>
+        <w:rPr>
+          <w:lang w:val="en-GB"/>
+        </w:rPr>
         <w:fldChar w:fldCharType="end"/>
       </w:r>
       <w:r>
+        <w:rPr>
+          <w:lang w:val="en-GB"/>
+        </w:rPr>
         <w:t xml:space="preserve">. </w:t>
       </w:r>
       <w:bookmarkStart w:id="19" w:name="_Toc231919083"/>
       <w:r>
+        <w:rPr>
+          <w:lang w:val="en-GB"/>
+        </w:rPr>
         <w:t>K-Prototypes segmentation (k = 3): standardised fabric profile (left) and post-hoc mean SAP per segment (right).</w:t>
       </w:r>
       <w:bookmarkEnd w:id="19"/>
@@ -4748,33 +4224,58 @@
         <w:pStyle w:val="Caption"/>
         <w:spacing w:after="200"/>
         <w:jc w:val="center"/>
-      </w:pPr>
-      <w:r>
+        <w:rPr>
+          <w:lang w:val="en-GB"/>
+        </w:rPr>
+      </w:pPr>
+      <w:r>
+        <w:rPr>
+          <w:lang w:val="en-GB"/>
+        </w:rPr>
         <w:t xml:space="preserve">Figure </w:t>
       </w:r>
       <w:r>
+        <w:rPr>
+          <w:lang w:val="en-GB"/>
+        </w:rPr>
         <w:fldChar w:fldCharType="begin"/>
       </w:r>
       <w:r>
+        <w:rPr>
+          <w:lang w:val="en-GB"/>
+        </w:rPr>
         <w:instrText>SEQ Figure</w:instrText>
       </w:r>
       <w:r>
+        <w:rPr>
+          <w:lang w:val="en-GB"/>
+        </w:rPr>
         <w:fldChar w:fldCharType="separate"/>
       </w:r>
       <w:r>
         <w:rPr>
           <w:noProof/>
+          <w:lang w:val="en-GB"/>
         </w:rPr>
         <w:t>13</w:t>
       </w:r>
       <w:r>
+        <w:rPr>
+          <w:lang w:val="en-GB"/>
+        </w:rPr>
         <w:fldChar w:fldCharType="end"/>
       </w:r>
       <w:r>
+        <w:rPr>
+          <w:lang w:val="en-GB"/>
+        </w:rPr>
         <w:t xml:space="preserve">. </w:t>
       </w:r>
       <w:bookmarkStart w:id="20" w:name="_Toc231919084"/>
       <w:r>
+        <w:rPr>
+          <w:lang w:val="en-GB"/>
+        </w:rPr>
         <w:t>Retrofit recommender: most-recommended measures with indicative cost (left) and top Apriori association rules by lift (right).</w:t>
       </w:r>
       <w:bookmarkEnd w:id="20"/>
@@ -4782,9 +4283,15 @@
     <w:p>
       <w:pPr>
         <w:pStyle w:val="Heading1"/>
+        <w:rPr>
+          <w:lang w:val="en-GB"/>
+        </w:rPr>
       </w:pPr>
       <w:bookmarkStart w:id="21" w:name="_Toc231919069"/>
       <w:r>
+        <w:rPr>
+          <w:lang w:val="en-GB"/>
+        </w:rPr>
         <w:t>4. Recommendations and Conclusion</w:t>
       </w:r>
       <w:bookmarkEnd w:id="21"/>
@@ -4795,7 +4302,7 @@
         <w:jc w:val="both"/>
       </w:pPr>
       <w:r>
-        <w:t>The findings translate into prioritised actions for Oxford City Council, registered providers and green-mortgage underwriters, sequenced and quantified against the 76,400-row predictions_oxford.csv corpus.</w:t>
+        <w:t>The findings translate into prioritised actions for Oxford City Council, registered providers and green-mortgage underwriters. Each action below is sequenced and quantified against the 76,400-row predictions_oxford.csv corpus.</w:t>
       </w:r>
     </w:p>
     <w:p>
@@ -4808,10 +4315,24 @@
           <w:b/>
           <w:bCs/>
         </w:rPr>
-        <w:t xml:space="preserve">Immediate (audit). </w:t>
-      </w:r>
-      <w:r>
-        <w:t>Use the per-UPRN confidence proxy to triage. The bottom-confidence quartile of hold-out dwellings (QWK 0.65) should be flagged for re-assessment before any subsidy decision, while the top quartile (QWK 0.85) is reliable enough for automated routing. Combined with the close-to-3:1 conservative bias noted in Section 3.4, audits favour properties more likely to have been under-rated.</w:t>
+        <w:t>Immediate (audit)</w:t>
+      </w:r>
+      <w:r>
+        <w:rPr>
+          <w:b/>
+          <w:bCs/>
+        </w:rPr>
+        <w:t>:</w:t>
+      </w:r>
+      <w:r>
+        <w:rPr>
+          <w:b/>
+          <w:bCs/>
+        </w:rPr>
+        <w:t xml:space="preserve"> </w:t>
+      </w:r>
+      <w:r>
+        <w:t>Use the per-UPRN confidence proxy to triage dwellings. The bottom-confidence quartile of hold-out dwellings (QWK 0.65) should be flagged for re-assessment before any subsidy decision is taken, while the top quartile (QWK 0.85) is reliable enough for automated routing. Given the close-to-3:1 conservative bias noted in Section 3.4, audits should favour properties that are more likely to have been under-rated.</w:t>
       </w:r>
     </w:p>
     <w:p>
@@ -4824,14 +4345,28 @@
           <w:b/>
           <w:bCs/>
         </w:rPr>
-        <w:t xml:space="preserve">Short-term (ECO4 and MEES routing). </w:t>
-      </w:r>
-      <w:r>
-        <w:t xml:space="preserve">Prioritise solid-wall insulation in the 17,136 pre-1929 dwellings (20,414 carry FLAG_SOLID_BRICK_BARE corpus-wide): wall construction is the largest categorical lever (Cramer's V 0.407) and the most consequential physical retrofit, at 4,000 to 14,000 pounds per dwelling through the Energy Company Obligation (ECO4, to March 2026) and the Great British Insulation Scheme. Second, fund loft top-ups for the 8,448 </w:t>
+        <w:t>Short-term (ECO4 and MEES routing)</w:t>
+      </w:r>
+      <w:r>
+        <w:rPr>
+          <w:b/>
+          <w:bCs/>
+        </w:rPr>
+        <w:t>:</w:t>
+      </w:r>
+      <w:r>
+        <w:rPr>
+          <w:b/>
+          <w:bCs/>
+        </w:rPr>
+        <w:t xml:space="preserve"> </w:t>
+      </w:r>
+      <w:r>
+        <w:t xml:space="preserve">Prioritise solid-wall insulation in the 17,136 pre-1929 dwellings, of which 20,414 carry FLAG_SOLID_BRICK_BARE corpus-wide. Wall construction is the largest categorical lever (Cramer’s V 0.407) and the most consequential physical retrofit, at 4,000 to 14,000 pounds per dwelling, funded through the Energy Company </w:t>
       </w:r>
       <w:r>
         <w:lastRenderedPageBreak/>
-        <w:t>FLAG_NO_LOFT_INSULATION dwellings (under 600 pounds, SHAP-positive across nearly every band).</w:t>
+        <w:t>Obligation (ECO4, running to March 2026) and the Great British Insulation Scheme. Second, fund loft top-ups for the 8,448 FLAG_NO_LOFT_INSULATION dwellings, which cost under 600 pounds each and are SHAP-positive across nearly every band.</w:t>
       </w:r>
     </w:p>
     <w:p>
@@ -4844,13 +4379,24 @@
           <w:b/>
           <w:bCs/>
         </w:rPr>
-        <w:t xml:space="preserve">Medium-term (private-rented compliance). </w:t>
-      </w:r>
-      <w:r>
-        <w:t>The Minimum Energy Efficiency Standards (in force since 2018) require band E for private rentals; the team can triage rentals predicted F or G from predictions_oxford.csv, but only the top confidence quartile (hold-out QWK 0.85), since band-F F1 is just 0.35, so low-confidence cases need re-assessment first. Concurrently, replace single glazing in the 1,935 single-glazed dwellings from 1900 to 1949. Because SAP is cost-based, at Ofgem (2024) tariffs a gas-to-heat-pump swap may not improve the rating until t</w:t>
-      </w:r>
-      <w:r>
-        <w:t>he electricity-to-gas price ratio narrows.</w:t>
+        <w:t>Medium-term (private-rented compliance)</w:t>
+      </w:r>
+      <w:r>
+        <w:rPr>
+          <w:b/>
+          <w:bCs/>
+        </w:rPr>
+        <w:t>:</w:t>
+      </w:r>
+      <w:r>
+        <w:rPr>
+          <w:b/>
+          <w:bCs/>
+        </w:rPr>
+        <w:t xml:space="preserve"> </w:t>
+      </w:r>
+      <w:r>
+        <w:t>The Minimum Energy Efficiency Standards, in force since 2018, require band E for private rentals. The team can triage rentals predicted as F or G from predictions_oxford.csv, but should act automatically only on the top confidence quartile (hold-out QWK 0.85), because band-F F1 is just 0.35 and low-confidence cases need re-assessment first. In parallel, replace single glazing in the 1,935 single-glazed dwellings dating from 1900 to 1949. Because SAP is cost-based, a gas-to-heat-pump swap may not improve the rating at Ofgem (2024) tariffs until the electricity-to-gas price ratio narrows.</w:t>
       </w:r>
     </w:p>
     <w:p>
@@ -4863,18 +4409,38 @@
           <w:b/>
           <w:bCs/>
         </w:rPr>
-        <w:t xml:space="preserve">Long-term (geographic targeting). </w:t>
-      </w:r>
-      <w:r>
-        <w:t>Postcode districts differ. OX4 holds the largest absolute count of pre-1900 stock (about 2,390 dwellings, 7.4% of the district), while OX2 (2,268, 13.9%) and OX1 (950, 13.5%) have the highest density. A district-weighted subsidy schedule that prioritises OX2 and OX1 by density and OX4 by volume delivers more SAP-points-per-pound than a flat-rate offer.</w:t>
+        <w:t>Long-term (geographic targeting)</w:t>
+      </w:r>
+      <w:r>
+        <w:rPr>
+          <w:b/>
+          <w:bCs/>
+        </w:rPr>
+        <w:t>:</w:t>
+      </w:r>
+      <w:r>
+        <w:rPr>
+          <w:b/>
+          <w:bCs/>
+        </w:rPr>
+        <w:t xml:space="preserve"> </w:t>
+      </w:r>
+      <w:r>
+        <w:t>Postcode districts differ in both volume and density. OX4 holds the largest absolute count of pre-1900 stock, at about 2,390 dwellings or 7.4% of the district, while OX2 (2,268 dwellings, 13.9%) and OX1 (950 dwellings, 13.5%) have the highest density. A district-weighted subsidy schedule that prioritises OX2 and OX1 by density, and OX4 by volume, delivers more SAP-points-per-pound than a flat-rate offer would.</w:t>
       </w:r>
     </w:p>
     <w:p>
       <w:pPr>
         <w:pStyle w:val="Heading1"/>
+        <w:rPr>
+          <w:lang w:val="en-GB"/>
+        </w:rPr>
       </w:pPr>
       <w:bookmarkStart w:id="22" w:name="_Toc231919070"/>
       <w:r>
+        <w:rPr>
+          <w:lang w:val="en-GB"/>
+        </w:rPr>
         <w:t>5. Limitations and Ethics</w:t>
       </w:r>
       <w:bookmarkEnd w:id="22"/>
@@ -4885,10 +4451,7 @@
         <w:jc w:val="both"/>
       </w:pPr>
       <w:r>
-        <w:t>Several limitations bound the interpretation. EPCs are RdSAP-modelled rather than measured; inter-assessor variance is around five SAP points (Few et al., 2023) and Hardy and Glew (2019) document systemic database errors, so our score MAE of 4.05 sits near the irreducible label-noise floor. The corpus over-represents transacting properties, so the findings will not transfer elsewhere unmodified. The reliability curve shows mild compression (slope 0.79), correctable through isotonic regression, and the spars</w:t>
-      </w:r>
-      <w:r>
-        <w:t>e A, F and G bands carry wide CIs. Personal data were excluded per GDPR Article 5; the model is unsuitable for individual valuation, mortgage underwriting, or automated decisions with legal effect under GDPR Article 22.</w:t>
+        <w:t>Several limitations bound the interpretation of these results. EPCs are RdSAP-modelled rather than directly measured, inter-assessor variance is around five SAP points (Few et al., 2023), and Hardy and Glew (2019) document systemic database errors, so the score MAE of 4.05 sits close to the irreducible label-noise floor. The corpus over-represents transacting properties, which means the findings will not transfer to other areas without modification. The reliability curve shows mild compression (slope 0.79), which is correctable through isotonic regression, and the sparse A, F and G bands carry wide confidence intervals. Personal data were excluded in line with GDPR Article 5. The model is unsuitable for individual valuation, mortgage underwriting, or automated decisions with legal effect under GDPR Article 22.</w:t>
       </w:r>
     </w:p>
     <w:p>
@@ -4897,17 +4460,7 @@
         <w:jc w:val="both"/>
       </w:pPr>
       <w:r>
-        <w:rPr>
-          <w:b/>
-          <w:bCs/>
-        </w:rPr>
-        <w:t xml:space="preserve">Self-audit. </w:t>
-      </w:r>
-      <w:r>
-        <w:t>The pipeline was stress-tested for residual leakage across three issues: random rather than temporal early-stopping, pre-split outlier and missingness statistics, and REPORT_TYPE as a covariate. Their effect is negligible: deciding the missingness set on the training fold yields a byte-identical model and the early-stopping change is inert. Inverse-UPRN weighting lifted one seed but widened the multi-seed spread, so it was rejected, and a depth-5 tree baseline (QWK 0.60 against 0.77) confirms the boosted co</w:t>
-      </w:r>
-      <w:r>
-        <w:t>mplexity is earned. The SAP-10 (2022) revisions are a structural break requiring periodic retraining.</w:t>
+        <w:t>The pipeline was stress-tested for residual leakage across three issues: the use of random rather than temporal early-stopping, the computation of outlier and missingness statistics before the split, and the inclusion of REPORT_TYPE as a covariate. Their effect is negligible. Deciding the missingness set on the training fold yields a byte-identical model, and the early-stopping change is inert. Inverse-UPRN weighting lifted one seed but widened the multi-seed spread, so it was rejected, and a depth-5 tree baseline (QWK 0.60 against 0.77) confirms that the boosted model’s extra complexity is earned. The SAP-10 (2022) revisions represent a structural break that will require periodic retraining.</w:t>
       </w:r>
     </w:p>
     <w:p>
@@ -4918,9 +4471,15 @@
     <w:p>
       <w:pPr>
         <w:pStyle w:val="Heading1"/>
+        <w:rPr>
+          <w:lang w:val="en-GB"/>
+        </w:rPr>
       </w:pPr>
       <w:bookmarkStart w:id="23" w:name="_Toc231919071"/>
       <w:r>
+        <w:rPr>
+          <w:lang w:val="en-GB"/>
+        </w:rPr>
         <w:lastRenderedPageBreak/>
         <w:t>References</w:t>
       </w:r>
@@ -5211,7 +4770,6 @@
     </w:r>
     <w:r>
       <w:rPr>
-        <w:noProof/>
         <w:sz w:val="20"/>
         <w:szCs w:val="20"/>
       </w:rPr>
@@ -5254,7 +4812,6 @@
     </w:r>
     <w:r>
       <w:rPr>
-        <w:noProof/>
         <w:sz w:val="20"/>
         <w:szCs w:val="20"/>
       </w:rPr>
@@ -5299,6 +4856,92 @@
 <file path=word/numbering.xml><?xml version="1.0" encoding="utf-8"?>
 <w:numbering xmlns:wpc="http://schemas.microsoft.com/office/word/2010/wordprocessingCanvas" xmlns:cx="http://schemas.microsoft.com/office/drawing/2014/chartex" xmlns:cx1="http://schemas.microsoft.com/office/drawing/2015/9/8/chartex" xmlns:cx2="http://schemas.microsoft.com/office/drawing/2015/10/21/chartex" xmlns:cx3="http://schemas.microsoft.com/office/drawing/2016/5/9/chartex" xmlns:cx4="http://schemas.microsoft.com/office/drawing/2016/5/10/chartex" xmlns:cx5="http://schemas.microsoft.com/office/drawing/2016/5/11/chartex" xmlns:cx6="http://schemas.microsoft.com/office/drawing/2016/5/12/chartex" xmlns:cx7="http://schemas.microsoft.com/office/drawing/2016/5/13/chartex" xmlns:cx8="http://schemas.microsoft.com/office/drawing/2016/5/14/chartex" xmlns:mc="http://schemas.openxmlformats.org/markup-compatibility/2006" xmlns:aink="http://schemas.microsoft.com/office/drawing/2016/ink" xmlns:am3d="http://schemas.microsoft.com/office/drawing/2017/model3d" xmlns:o="urn:schemas-microsoft-com:office:office" xmlns:oel="http://schemas.microsoft.com/office/2019/extlst" xmlns:r="http://schemas.openxmlformats.org/officeDocument/2006/relationships" xmlns:m="http://schemas.openxmlformats.org/officeDocument/2006/math" xmlns:v="urn:schemas-microsoft-com:vml" xmlns:wp14="http://schemas.microsoft.com/office/word/2010/wordprocessingDrawing" xmlns:wp="http://schemas.openxmlformats.org/drawingml/2006/wordprocessingDrawing" xmlns:w10="urn:schemas-microsoft-com:office:word" xmlns:w="http://schemas.openxmlformats.org/wordprocessingml/2006/main" xmlns:w14="http://schemas.microsoft.com/office/word/2010/wordml" xmlns:w15="http://schemas.microsoft.com/office/word/2012/wordml" xmlns:w16cex="http://schemas.microsoft.com/office/word/2018/wordml/cex" xmlns:w16cid="http://schemas.microsoft.com/office/word/2016/wordml/cid" xmlns:w16="http://schemas.microsoft.com/office/word/2018/wordml" xmlns:w16du="http://schemas.microsoft.com/office/word/2023/wordml/word16du" xmlns:w16sdtdh="http://schemas.microsoft.com/office/word/2020/wordml/sdtdatahash" xmlns:w16sdtfl="http://schemas.microsoft.com/office/word/2024/wordml/sdtformatlock" xmlns:w16se="http://schemas.microsoft.com/office/word/2015/wordml/symex" xmlns:wpg="http://schemas.microsoft.com/office/word/2010/wordprocessingGroup" xmlns:wpi="http://schemas.microsoft.com/office/word/2010/wordprocessingInk" xmlns:wne="http://schemas.microsoft.com/office/word/2006/wordml" xmlns:wps="http://schemas.microsoft.com/office/word/2010/wordprocessingShape" mc:Ignorable="w14 w15 w16se w16cid w16 w16cex w16sdtdh w16sdtfl w16du wp14">
   <w:abstractNum w:abstractNumId="0" w15:restartNumberingAfterBreak="0">
+    <w:nsid w:val="0AA928DF"/>
+    <w:multiLevelType w:val="hybridMultilevel"/>
+    <w:tmpl w:val="5FB417AC"/>
+    <w:lvl w:ilvl="0" w:tplc="0409001B">
+      <w:start w:val="1"/>
+      <w:numFmt w:val="lowerRoman"/>
+      <w:lvlText w:val="%1."/>
+      <w:lvlJc w:val="right"/>
+      <w:pPr>
+        <w:ind w:left="720" w:hanging="360"/>
+      </w:pPr>
+    </w:lvl>
+    <w:lvl w:ilvl="1" w:tplc="04090019" w:tentative="1">
+      <w:start w:val="1"/>
+      <w:numFmt w:val="lowerLetter"/>
+      <w:lvlText w:val="%2."/>
+      <w:lvlJc w:val="left"/>
+      <w:pPr>
+        <w:ind w:left="1440" w:hanging="360"/>
+      </w:pPr>
+    </w:lvl>
+    <w:lvl w:ilvl="2" w:tplc="0409001B" w:tentative="1">
+      <w:start w:val="1"/>
+      <w:numFmt w:val="lowerRoman"/>
+      <w:lvlText w:val="%3."/>
+      <w:lvlJc w:val="right"/>
+      <w:pPr>
+        <w:ind w:left="2160" w:hanging="180"/>
+      </w:pPr>
+    </w:lvl>
+    <w:lvl w:ilvl="3" w:tplc="0409000F" w:tentative="1">
+      <w:start w:val="1"/>
+      <w:numFmt w:val="decimal"/>
+      <w:lvlText w:val="%4."/>
+      <w:lvlJc w:val="left"/>
+      <w:pPr>
+        <w:ind w:left="2880" w:hanging="360"/>
+      </w:pPr>
+    </w:lvl>
+    <w:lvl w:ilvl="4" w:tplc="04090019" w:tentative="1">
+      <w:start w:val="1"/>
+      <w:numFmt w:val="lowerLetter"/>
+      <w:lvlText w:val="%5."/>
+      <w:lvlJc w:val="left"/>
+      <w:pPr>
+        <w:ind w:left="3600" w:hanging="360"/>
+      </w:pPr>
+    </w:lvl>
+    <w:lvl w:ilvl="5" w:tplc="0409001B" w:tentative="1">
+      <w:start w:val="1"/>
+      <w:numFmt w:val="lowerRoman"/>
+      <w:lvlText w:val="%6."/>
+      <w:lvlJc w:val="right"/>
+      <w:pPr>
+        <w:ind w:left="4320" w:hanging="180"/>
+      </w:pPr>
+    </w:lvl>
+    <w:lvl w:ilvl="6" w:tplc="0409000F" w:tentative="1">
+      <w:start w:val="1"/>
+      <w:numFmt w:val="decimal"/>
+      <w:lvlText w:val="%7."/>
+      <w:lvlJc w:val="left"/>
+      <w:pPr>
+        <w:ind w:left="5040" w:hanging="360"/>
+      </w:pPr>
+    </w:lvl>
+    <w:lvl w:ilvl="7" w:tplc="04090019" w:tentative="1">
+      <w:start w:val="1"/>
+      <w:numFmt w:val="lowerLetter"/>
+      <w:lvlText w:val="%8."/>
+      <w:lvlJc w:val="left"/>
+      <w:pPr>
+        <w:ind w:left="5760" w:hanging="360"/>
+      </w:pPr>
+    </w:lvl>
+    <w:lvl w:ilvl="8" w:tplc="0409001B" w:tentative="1">
+      <w:start w:val="1"/>
+      <w:numFmt w:val="lowerRoman"/>
+      <w:lvlText w:val="%9."/>
+      <w:lvlJc w:val="right"/>
+      <w:pPr>
+        <w:ind w:left="6480" w:hanging="180"/>
+      </w:pPr>
+    </w:lvl>
+  </w:abstractNum>
+  <w:abstractNum w:abstractNumId="1" w15:restartNumberingAfterBreak="0">
     <w:nsid w:val="3B725627"/>
     <w:multiLevelType w:val="hybridMultilevel"/>
     <w:tmpl w:val="F1FAB15A"/>
@@ -5384,11 +5027,106 @@
       </w:pPr>
     </w:lvl>
   </w:abstractNum>
+  <w:abstractNum w:abstractNumId="2" w15:restartNumberingAfterBreak="0">
+    <w:nsid w:val="71A81C65"/>
+    <w:multiLevelType w:val="hybridMultilevel"/>
+    <w:tmpl w:val="04E41264"/>
+    <w:lvl w:ilvl="0" w:tplc="F2BEE68C">
+      <w:start w:val="1"/>
+      <w:numFmt w:val="lowerRoman"/>
+      <w:lvlText w:val="(%1)"/>
+      <w:lvlJc w:val="left"/>
+      <w:pPr>
+        <w:ind w:left="1080" w:hanging="720"/>
+      </w:pPr>
+      <w:rPr>
+        <w:rFonts w:hint="default"/>
+      </w:rPr>
+    </w:lvl>
+    <w:lvl w:ilvl="1" w:tplc="04090019" w:tentative="1">
+      <w:start w:val="1"/>
+      <w:numFmt w:val="lowerLetter"/>
+      <w:lvlText w:val="%2."/>
+      <w:lvlJc w:val="left"/>
+      <w:pPr>
+        <w:ind w:left="1440" w:hanging="360"/>
+      </w:pPr>
+    </w:lvl>
+    <w:lvl w:ilvl="2" w:tplc="0409001B" w:tentative="1">
+      <w:start w:val="1"/>
+      <w:numFmt w:val="lowerRoman"/>
+      <w:lvlText w:val="%3."/>
+      <w:lvlJc w:val="right"/>
+      <w:pPr>
+        <w:ind w:left="2160" w:hanging="180"/>
+      </w:pPr>
+    </w:lvl>
+    <w:lvl w:ilvl="3" w:tplc="0409000F" w:tentative="1">
+      <w:start w:val="1"/>
+      <w:numFmt w:val="decimal"/>
+      <w:lvlText w:val="%4."/>
+      <w:lvlJc w:val="left"/>
+      <w:pPr>
+        <w:ind w:left="2880" w:hanging="360"/>
+      </w:pPr>
+    </w:lvl>
+    <w:lvl w:ilvl="4" w:tplc="04090019" w:tentative="1">
+      <w:start w:val="1"/>
+      <w:numFmt w:val="lowerLetter"/>
+      <w:lvlText w:val="%5."/>
+      <w:lvlJc w:val="left"/>
+      <w:pPr>
+        <w:ind w:left="3600" w:hanging="360"/>
+      </w:pPr>
+    </w:lvl>
+    <w:lvl w:ilvl="5" w:tplc="0409001B" w:tentative="1">
+      <w:start w:val="1"/>
+      <w:numFmt w:val="lowerRoman"/>
+      <w:lvlText w:val="%6."/>
+      <w:lvlJc w:val="right"/>
+      <w:pPr>
+        <w:ind w:left="4320" w:hanging="180"/>
+      </w:pPr>
+    </w:lvl>
+    <w:lvl w:ilvl="6" w:tplc="0409000F" w:tentative="1">
+      <w:start w:val="1"/>
+      <w:numFmt w:val="decimal"/>
+      <w:lvlText w:val="%7."/>
+      <w:lvlJc w:val="left"/>
+      <w:pPr>
+        <w:ind w:left="5040" w:hanging="360"/>
+      </w:pPr>
+    </w:lvl>
+    <w:lvl w:ilvl="7" w:tplc="04090019" w:tentative="1">
+      <w:start w:val="1"/>
+      <w:numFmt w:val="lowerLetter"/>
+      <w:lvlText w:val="%8."/>
+      <w:lvlJc w:val="left"/>
+      <w:pPr>
+        <w:ind w:left="5760" w:hanging="360"/>
+      </w:pPr>
+    </w:lvl>
+    <w:lvl w:ilvl="8" w:tplc="0409001B" w:tentative="1">
+      <w:start w:val="1"/>
+      <w:numFmt w:val="lowerRoman"/>
+      <w:lvlText w:val="%9."/>
+      <w:lvlJc w:val="right"/>
+      <w:pPr>
+        <w:ind w:left="6480" w:hanging="180"/>
+      </w:pPr>
+    </w:lvl>
+  </w:abstractNum>
   <w:num w:numId="1" w16cid:durableId="1703553697">
-    <w:abstractNumId w:val="0"/>
+    <w:abstractNumId w:val="1"/>
     <w:lvlOverride w:ilvl="0">
       <w:startOverride w:val="1"/>
     </w:lvlOverride>
+  </w:num>
+  <w:num w:numId="2" w16cid:durableId="531187423">
+    <w:abstractNumId w:val="0"/>
+  </w:num>
+  <w:num w:numId="3" w16cid:durableId="310330845">
+    <w:abstractNumId w:val="2"/>
   </w:num>
 </w:numbering>
 </file>
@@ -5787,6 +5525,9 @@
   <w:style w:type="paragraph" w:default="1" w:styleId="Normal">
     <w:name w:val="Normal"/>
     <w:qFormat/>
+    <w:rPr>
+      <w:lang w:val="en-GB"/>
+    </w:rPr>
   </w:style>
   <w:style w:type="paragraph" w:styleId="Heading1">
     <w:name w:val="heading 1"/>
@@ -6038,6 +5779,22 @@
     <w:uiPriority w:val="99"/>
     <w:unhideWhenUsed/>
     <w:rsid w:val="003F4B4D"/>
+  </w:style>
+  <w:style w:type="table" w:styleId="TableGrid">
+    <w:name w:val="Table Grid"/>
+    <w:basedOn w:val="TableNormal"/>
+    <w:uiPriority w:val="39"/>
+    <w:rsid w:val="00AB4D79"/>
+    <w:tblPr>
+      <w:tblBorders>
+        <w:top w:val="single" w:sz="4" w:space="0" w:color="auto"/>
+        <w:left w:val="single" w:sz="4" w:space="0" w:color="auto"/>
+        <w:bottom w:val="single" w:sz="4" w:space="0" w:color="auto"/>
+        <w:right w:val="single" w:sz="4" w:space="0" w:color="auto"/>
+        <w:insideH w:val="single" w:sz="4" w:space="0" w:color="auto"/>
+        <w:insideV w:val="single" w:sz="4" w:space="0" w:color="auto"/>
+      </w:tblBorders>
+    </w:tblPr>
   </w:style>
 </w:styles>
 </file>

</xml_diff>

<commit_message>
Add deduplication and recommender code listings to the report
Two further src/scripts listings (quality-aware UPRN deduplication in 3.1,
Apriori + content-based k-NN recommender in 3.5), with all listing captions
renumbered sequentially (1-6).
</commit_message>
<xml_diff>
--- a/reports/COM6003_Oxford_Report.docx
+++ b/reports/COM6003_Oxford_Report.docx
@@ -1342,6 +1342,85 @@
       <w:r>
         <w:lastRenderedPageBreak/>
         <w:t>Instead of dropping these moderately incomplete columns, each field above 5% missingness is given a binary &lt;COL&gt;_IS_MISSING indicator, so the tree can learn the structural meaning of the gap. Only columns that are at least 99.9% empty are dropped. The gradient-booster handles the remaining NaNs natively, while the linear and forest baselines median-impute, doing so within the training fold only.</w:t>
+      </w:r>
+    </w:p>
+    <w:p>
+      <w:pPr>
+        <w:spacing w:before="80" w:after="20"/>
+      </w:pPr>
+      <w:r>
+        <w:rPr>
+          <w:i/>
+          <w:sz w:val="19"/>
+        </w:rPr>
+        <w:t>Listing 2. Quality-aware deduplication to one certificate per dwelling (src/data.py).</w:t>
+      </w:r>
+    </w:p>
+    <w:p>
+      <w:pPr>
+        <w:keepLines/>
+        <w:pBdr>
+          <w:top w:val="single" w:sz="4" w:space="4" w:color="C9C9C9"/>
+          <w:left w:val="single" w:sz="4" w:space="4" w:color="C9C9C9"/>
+          <w:bottom w:val="single" w:sz="4" w:space="4" w:color="C9C9C9"/>
+          <w:right w:val="single" w:sz="4" w:space="4" w:color="C9C9C9"/>
+        </w:pBdr>
+        <w:shd w:val="clear" w:color="auto" w:fill="F4F4F4"/>
+        <w:spacing w:before="120" w:after="120"/>
+        <w:ind w:left="120" w:right="120"/>
+      </w:pPr>
+      <w:r>
+        <w:rPr>
+          <w:rFonts w:ascii="Consolas" w:hAnsi="Consolas"/>
+          <w:color w:val="1A1A1A"/>
+          <w:sz w:val="17"/>
+        </w:rPr>
+        <w:t># src/data.py - one EPC per dwelling (UPRN): newest, with completeness as tie-break</w:t>
+      </w:r>
+      <w:r>
+        <w:rPr>
+          <w:rFonts w:ascii="Consolas" w:hAnsi="Consolas"/>
+          <w:color w:val="1A1A1A"/>
+          <w:sz w:val="17"/>
+        </w:rPr>
+        <w:br/>
+        <w:t>year            = pd.to_datetime(keyed["INSPECTION_DATE"]).dt.year.fillna(2007)</w:t>
+      </w:r>
+      <w:r>
+        <w:rPr>
+          <w:rFonts w:ascii="Consolas" w:hAnsi="Consolas"/>
+          <w:color w:val="1A1A1A"/>
+          <w:sz w:val="17"/>
+        </w:rPr>
+        <w:br/>
+        <w:t>completeness    = keyed[CORE_FIELDS].notna().sum(axis=1)</w:t>
+      </w:r>
+      <w:r>
+        <w:rPr>
+          <w:rFonts w:ascii="Consolas" w:hAnsi="Consolas"/>
+          <w:color w:val="1A1A1A"/>
+          <w:sz w:val="17"/>
+        </w:rPr>
+        <w:br/>
+        <w:t>keyed["_score"] = (year - 2007) * 10 + completeness         # chronology dominates ties</w:t>
+      </w:r>
+      <w:r>
+        <w:rPr>
+          <w:rFonts w:ascii="Consolas" w:hAnsi="Consolas"/>
+          <w:color w:val="1A1A1A"/>
+          <w:sz w:val="17"/>
+        </w:rPr>
+        <w:br/>
+        <w:t>clean = (keyed.sort_values(["UPRN", "_score"])</w:t>
+      </w:r>
+      <w:r>
+        <w:rPr>
+          <w:rFonts w:ascii="Consolas" w:hAnsi="Consolas"/>
+          <w:color w:val="1A1A1A"/>
+          <w:sz w:val="17"/>
+        </w:rPr>
+        <w:br/>
+        <w:t xml:space="preserve">              .drop_duplicates("UPRN", keep="last"))          # best row per dwelling</w:t>
       </w:r>
     </w:p>
     <w:p>
@@ -3125,7 +3204,7 @@
           <w:i/>
           <w:sz w:val="19"/>
         </w:rPr>
-        <w:t>Listing 2. SAP-engine outputs excluded from the feature matrix (src/data.py).</w:t>
+        <w:t>Listing 3. SAP-engine outputs excluded from the feature matrix (src/data.py).</w:t>
       </w:r>
     </w:p>
     <w:p>
@@ -3205,7 +3284,7 @@
           <w:sz w:val="19"/>
         </w:rPr>
         <w:lastRenderedPageBreak/>
-        <w:t>Listing 3. Group-aware temporal split that prevents dwelling-level leakage (src/data.py).</w:t>
+        <w:t>Listing 4. Group-aware temporal split that prevents dwelling-level leakage (src/data.py).</w:t>
       </w:r>
     </w:p>
     <w:p>
@@ -3314,7 +3393,7 @@
           <w:i/>
           <w:sz w:val="19"/>
         </w:rPr>
-        <w:t>Listing 4. The regression-to-band champion and its hybrid routing (src/models.py).</w:t>
+        <w:t>Listing 5. The regression-to-band champion and its hybrid routing (src/models.py).</w:t>
       </w:r>
     </w:p>
     <w:p>
@@ -3416,15 +3495,7 @@
           <w:sz w:val="17"/>
         </w:rPr>
         <w:br/>
-        <w:t xml:space="preserve">    def predict_band(self, X, re</w:t>
-      </w:r>
-      <w:r>
-        <w:rPr>
-          <w:rFonts w:ascii="Consolas" w:hAnsi="Consolas"/>
-          <w:color w:val="1A1A1A"/>
-          <w:sz w:val="17"/>
-        </w:rPr>
-        <w:t>port_type):</w:t>
+        <w:t xml:space="preserve">    def predict_band(self, X, report_type):</w:t>
       </w:r>
       <w:r>
         <w:rPr>
@@ -4062,6 +4133,85 @@
     </w:p>
     <w:p>
       <w:pPr>
+        <w:spacing w:before="80" w:after="20"/>
+      </w:pPr>
+      <w:r>
+        <w:rPr>
+          <w:i/>
+          <w:sz w:val="19"/>
+        </w:rPr>
+        <w:t>Listing 6. Association-rule and content-based recommender (scripts/run_recommender.py).</w:t>
+      </w:r>
+    </w:p>
+    <w:p>
+      <w:pPr>
+        <w:keepLines/>
+        <w:pBdr>
+          <w:top w:val="single" w:sz="4" w:space="4" w:color="C9C9C9"/>
+          <w:left w:val="single" w:sz="4" w:space="4" w:color="C9C9C9"/>
+          <w:bottom w:val="single" w:sz="4" w:space="4" w:color="C9C9C9"/>
+          <w:right w:val="single" w:sz="4" w:space="4" w:color="C9C9C9"/>
+        </w:pBdr>
+        <w:shd w:val="clear" w:color="auto" w:fill="F4F4F4"/>
+        <w:spacing w:before="120" w:after="120"/>
+        <w:ind w:left="120" w:right="120"/>
+      </w:pPr>
+      <w:r>
+        <w:rPr>
+          <w:rFonts w:ascii="Consolas" w:hAnsi="Consolas"/>
+          <w:color w:val="1A1A1A"/>
+          <w:sz w:val="17"/>
+        </w:rPr>
+        <w:t># scripts/run_recommender.py - association rules + content-based k-NN over recommendations.csv</w:t>
+      </w:r>
+      <w:r>
+        <w:rPr>
+          <w:rFonts w:ascii="Consolas" w:hAnsi="Consolas"/>
+          <w:color w:val="1A1A1A"/>
+          <w:sz w:val="17"/>
+        </w:rPr>
+        <w:br/>
+        <w:t>freq  = apriori(onehot, min_support=0.03, use_colnames=True, max_len=3)</w:t>
+      </w:r>
+      <w:r>
+        <w:rPr>
+          <w:rFonts w:ascii="Consolas" w:hAnsi="Consolas"/>
+          <w:color w:val="1A1A1A"/>
+          <w:sz w:val="17"/>
+        </w:rPr>
+        <w:br/>
+        <w:t>rules = association_rules(freq, metric="lift", min_threshold=1.05) \</w:t>
+      </w:r>
+      <w:r>
+        <w:rPr>
+          <w:rFonts w:ascii="Consolas" w:hAnsi="Consolas"/>
+          <w:color w:val="1A1A1A"/>
+          <w:sz w:val="17"/>
+        </w:rPr>
+        <w:br/>
+        <w:t xml:space="preserve">            .sort_values("lift", ascending=False)    # e.g. glazing + draught-proofing, lift 8.9</w:t>
+      </w:r>
+      <w:r>
+        <w:rPr>
+          <w:rFonts w:ascii="Consolas" w:hAnsi="Consolas"/>
+          <w:color w:val="1A1A1A"/>
+          <w:sz w:val="17"/>
+        </w:rPr>
+        <w:br/>
+        <w:t>nn    = NearestNeighbors(n_neighbors=15, metric="cosine").fit(X_train)   # leak-free fabric</w:t>
+      </w:r>
+      <w:r>
+        <w:rPr>
+          <w:rFonts w:ascii="Consolas" w:hAnsi="Consolas"/>
+          <w:color w:val="1A1A1A"/>
+          <w:sz w:val="17"/>
+        </w:rPr>
+        <w:br/>
+        <w:t>_, nbr = nn.kneighbors(X_test)                       # measures from fabric-similar dwellings</w:t>
+      </w:r>
+    </w:p>
+    <w:p>
+      <w:pPr>
         <w:spacing w:before="120" w:after="60"/>
         <w:jc w:val="center"/>
       </w:pPr>
@@ -4332,7 +4482,11 @@
         <w:t xml:space="preserve"> </w:t>
       </w:r>
       <w:r>
-        <w:t>Use the per-UPRN confidence proxy to triage dwellings. The bottom-confidence quartile of hold-out dwellings (QWK 0.65) should be flagged for re-assessment before any subsidy decision is taken, while the top quartile (QWK 0.85) is reliable enough for automated routing. Given the close-to-3:1 conservative bias noted in Section 3.4, audits should favour properties that are more likely to have been under-rated.</w:t>
+        <w:t xml:space="preserve">Use the per-UPRN confidence proxy to triage dwellings. The bottom-confidence quartile of hold-out dwellings (QWK 0.65) should be flagged for re-assessment before any subsidy decision is taken, while the top quartile (QWK 0.85) is reliable enough for </w:t>
+      </w:r>
+      <w:r>
+        <w:lastRenderedPageBreak/>
+        <w:t>automated routing. Given the close-to-3:1 conservative bias noted in Section 3.4, audits should favour properties that are more likely to have been under-rated.</w:t>
       </w:r>
     </w:p>
     <w:p>
@@ -4362,11 +4516,7 @@
         <w:t xml:space="preserve"> </w:t>
       </w:r>
       <w:r>
-        <w:t xml:space="preserve">Prioritise solid-wall insulation in the 17,136 pre-1929 dwellings, of which 20,414 carry FLAG_SOLID_BRICK_BARE corpus-wide. Wall construction is the largest categorical lever (Cramer’s V 0.407) and the most consequential physical retrofit, at 4,000 to 14,000 pounds per dwelling, funded through the Energy Company </w:t>
-      </w:r>
-      <w:r>
-        <w:lastRenderedPageBreak/>
-        <w:t>Obligation (ECO4, running to March 2026) and the Great British Insulation Scheme. Second, fund loft top-ups for the 8,448 FLAG_NO_LOFT_INSULATION dwellings, which cost under 600 pounds each and are SHAP-positive across nearly every band.</w:t>
+        <w:t>Prioritise solid-wall insulation in the 17,136 pre-1929 dwellings, of which 20,414 carry FLAG_SOLID_BRICK_BARE corpus-wide. Wall construction is the largest categorical lever (Cramer’s V 0.407) and the most consequential physical retrofit, at 4,000 to 14,000 pounds per dwelling, funded through the Energy Company Obligation (ECO4, running to March 2026) and the Great British Insulation Scheme. Second, fund loft top-ups for the 8,448 FLAG_NO_LOFT_INSULATION dwellings, which cost under 600 pounds each and are SHAP-positive across nearly every band.</w:t>
       </w:r>
     </w:p>
     <w:p>

</xml_diff>